<commit_message>
LogSmith - v1.9.0 - test\async_tests\ . . . full stability achieved
</commit_message>
<xml_diff>
--- a/tests/testing_strategy.docx
+++ b/tests/testing_strategy.docx
@@ -1765,6 +1765,12 @@
         <w:bidi w:val="0"/>
         <w:spacing w:after="0" w:line="240" w:lineRule="auto"/>
       </w:pPr>
+    </w:p>
+    <w:p>
+      <w:pPr>
+        <w:bidi w:val="0"/>
+        <w:spacing w:after="0" w:line="240" w:lineRule="auto"/>
+      </w:pPr>
       <w:r>
         <w:t xml:space="preserve">The next move is to start filling in </w:t>
       </w:r>
@@ -1784,16 +1790,27 @@
         <w:bidi w:val="0"/>
         <w:spacing w:after="0" w:line="240" w:lineRule="auto"/>
         <w:rPr>
-          <w:b/>
-          <w:bCs/>
-        </w:rPr>
-      </w:pPr>
-      <w:r>
-        <w:rPr>
           <w:rFonts w:ascii="Segoe UI Emoji" w:hAnsi="Segoe UI Emoji" w:cs="Segoe UI Emoji"/>
           <w:b/>
           <w:bCs/>
         </w:rPr>
+      </w:pPr>
+    </w:p>
+    <w:p>
+      <w:pPr>
+        <w:bidi w:val="0"/>
+        <w:spacing w:after="0" w:line="240" w:lineRule="auto"/>
+        <w:rPr>
+          <w:b/>
+          <w:bCs/>
+        </w:rPr>
+      </w:pPr>
+      <w:r>
+        <w:rPr>
+          <w:rFonts w:ascii="Segoe UI Emoji" w:hAnsi="Segoe UI Emoji" w:cs="Segoe UI Emoji"/>
+          <w:b/>
+          <w:bCs/>
+        </w:rPr>
         <w:t>🎯</w:t>
       </w:r>
       <w:r>
@@ -1809,16 +1826,27 @@
         <w:bidi w:val="0"/>
         <w:spacing w:after="0" w:line="240" w:lineRule="auto"/>
         <w:rPr>
-          <w:b/>
-          <w:bCs/>
-        </w:rPr>
-      </w:pPr>
-      <w:r>
-        <w:rPr>
           <w:rFonts w:ascii="Segoe UI Symbol" w:hAnsi="Segoe UI Symbol" w:cs="Segoe UI Symbol"/>
           <w:b/>
           <w:bCs/>
         </w:rPr>
+      </w:pPr>
+    </w:p>
+    <w:p>
+      <w:pPr>
+        <w:bidi w:val="0"/>
+        <w:spacing w:after="0" w:line="240" w:lineRule="auto"/>
+        <w:rPr>
+          <w:b/>
+          <w:bCs/>
+        </w:rPr>
+      </w:pPr>
+      <w:r>
+        <w:rPr>
+          <w:rFonts w:ascii="Segoe UI Symbol" w:hAnsi="Segoe UI Symbol" w:cs="Segoe UI Symbol"/>
+          <w:b/>
+          <w:bCs/>
+        </w:rPr>
         <w:t>✔</w:t>
       </w:r>
       <w:r>
@@ -1843,16 +1871,27 @@
         <w:bidi w:val="0"/>
         <w:spacing w:after="0" w:line="240" w:lineRule="auto"/>
         <w:rPr>
-          <w:b/>
-          <w:bCs/>
-        </w:rPr>
-      </w:pPr>
-      <w:r>
-        <w:rPr>
           <w:rFonts w:ascii="Segoe UI Symbol" w:hAnsi="Segoe UI Symbol" w:cs="Segoe UI Symbol"/>
           <w:b/>
           <w:bCs/>
         </w:rPr>
+      </w:pPr>
+    </w:p>
+    <w:p>
+      <w:pPr>
+        <w:bidi w:val="0"/>
+        <w:spacing w:after="0" w:line="240" w:lineRule="auto"/>
+        <w:rPr>
+          <w:b/>
+          <w:bCs/>
+        </w:rPr>
+      </w:pPr>
+      <w:r>
+        <w:rPr>
+          <w:rFonts w:ascii="Segoe UI Symbol" w:hAnsi="Segoe UI Symbol" w:cs="Segoe UI Symbol"/>
+          <w:b/>
+          <w:bCs/>
+        </w:rPr>
         <w:t>✔</w:t>
       </w:r>
       <w:r>
@@ -1868,16 +1907,27 @@
         <w:bidi w:val="0"/>
         <w:spacing w:after="0" w:line="240" w:lineRule="auto"/>
         <w:rPr>
-          <w:b/>
-          <w:bCs/>
-        </w:rPr>
-      </w:pPr>
-      <w:r>
-        <w:rPr>
           <w:rFonts w:ascii="Segoe UI Symbol" w:hAnsi="Segoe UI Symbol" w:cs="Segoe UI Symbol"/>
           <w:b/>
           <w:bCs/>
         </w:rPr>
+      </w:pPr>
+    </w:p>
+    <w:p>
+      <w:pPr>
+        <w:bidi w:val="0"/>
+        <w:spacing w:after="0" w:line="240" w:lineRule="auto"/>
+        <w:rPr>
+          <w:b/>
+          <w:bCs/>
+        </w:rPr>
+      </w:pPr>
+      <w:r>
+        <w:rPr>
+          <w:rFonts w:ascii="Segoe UI Symbol" w:hAnsi="Segoe UI Symbol" w:cs="Segoe UI Symbol"/>
+          <w:b/>
+          <w:bCs/>
+        </w:rPr>
         <w:t>✔</w:t>
       </w:r>
       <w:r>
@@ -1893,8 +1943,749 @@
         <w:bidi w:val="0"/>
         <w:spacing w:after="0" w:line="240" w:lineRule="auto"/>
       </w:pPr>
+    </w:p>
+    <w:p>
+      <w:pPr>
+        <w:bidi w:val="0"/>
+        <w:spacing w:after="0" w:line="240" w:lineRule="auto"/>
+      </w:pPr>
       <w:r>
         <w:t>Just tell me how you want to proceed.</w:t>
+      </w:r>
+    </w:p>
+    <w:p>
+      <w:pPr>
+        <w:bidi w:val="0"/>
+      </w:pPr>
+      <w:r>
+        <w:br w:type="page"/>
+      </w:r>
+    </w:p>
+    <w:p>
+      <w:pPr>
+        <w:bidi w:val="0"/>
+        <w:spacing w:after="0" w:line="240" w:lineRule="auto"/>
+      </w:pPr>
+    </w:p>
+    <w:p>
+      <w:pPr>
+        <w:bidi w:val="0"/>
+        <w:spacing w:after="0" w:line="240" w:lineRule="auto"/>
+        <w:rPr>
+          <w:b/>
+          <w:bCs/>
+        </w:rPr>
+      </w:pPr>
+      <w:r>
+        <w:rPr>
+          <w:rFonts w:ascii="Segoe UI Emoji" w:hAnsi="Segoe UI Emoji" w:cs="Segoe UI Emoji"/>
+          <w:b/>
+          <w:bCs/>
+        </w:rPr>
+        <w:t>🌟</w:t>
+      </w:r>
+      <w:r>
+        <w:rPr>
+          <w:b/>
+          <w:bCs/>
+        </w:rPr>
+        <w:t xml:space="preserve"> Fifth: What you </w:t>
+      </w:r>
+      <w:r>
+        <w:rPr>
+          <w:b/>
+          <w:bCs/>
+          <w:i/>
+          <w:iCs/>
+        </w:rPr>
+        <w:t>should</w:t>
+      </w:r>
+      <w:r>
+        <w:rPr>
+          <w:b/>
+          <w:bCs/>
+        </w:rPr>
+        <w:t xml:space="preserve"> improve (and what you can safely ignore)</w:t>
+      </w:r>
+    </w:p>
+    <w:p>
+      <w:pPr>
+        <w:bidi w:val="0"/>
+        <w:spacing w:after="0" w:line="240" w:lineRule="auto"/>
+      </w:pPr>
+      <w:r>
+        <w:t>Let me give you a prioritized list.</w:t>
+      </w:r>
+    </w:p>
+    <w:p>
+      <w:pPr>
+        <w:bidi w:val="0"/>
+        <w:spacing w:after="0" w:line="240" w:lineRule="auto"/>
+        <w:rPr>
+          <w:b/>
+          <w:bCs/>
+        </w:rPr>
+      </w:pPr>
+      <w:r>
+        <w:rPr>
+          <w:rFonts w:ascii="Segoe UI Emoji" w:hAnsi="Segoe UI Emoji" w:cs="Segoe UI Emoji"/>
+          <w:b/>
+          <w:bCs/>
+        </w:rPr>
+        <w:t>🟩</w:t>
+      </w:r>
+      <w:r>
+        <w:rPr>
+          <w:b/>
+          <w:bCs/>
+        </w:rPr>
+        <w:t xml:space="preserve"> Priority 1 — Async worker core paths (worth testing)</w:t>
+      </w:r>
+    </w:p>
+    <w:p>
+      <w:pPr>
+        <w:bidi w:val="0"/>
+        <w:spacing w:after="0" w:line="240" w:lineRule="auto"/>
+      </w:pPr>
+      <w:r>
+        <w:t>These are the most important uncovered areas:</w:t>
+      </w:r>
+    </w:p>
+    <w:p>
+      <w:pPr>
+        <w:numPr>
+          <w:ilvl w:val="0"/>
+          <w:numId w:val="23"/>
+        </w:numPr>
+        <w:bidi w:val="0"/>
+        <w:spacing w:after="0" w:line="240" w:lineRule="auto"/>
+      </w:pPr>
+      <w:r>
+        <w:t>queue draining</w:t>
+      </w:r>
+    </w:p>
+    <w:p>
+      <w:pPr>
+        <w:numPr>
+          <w:ilvl w:val="0"/>
+          <w:numId w:val="23"/>
+        </w:numPr>
+        <w:bidi w:val="0"/>
+        <w:spacing w:after="0" w:line="240" w:lineRule="auto"/>
+      </w:pPr>
+      <w:r>
+        <w:t>rotation scheduling</w:t>
+      </w:r>
+    </w:p>
+    <w:p>
+      <w:pPr>
+        <w:numPr>
+          <w:ilvl w:val="0"/>
+          <w:numId w:val="23"/>
+        </w:numPr>
+        <w:bidi w:val="0"/>
+        <w:spacing w:after="0" w:line="240" w:lineRule="auto"/>
+      </w:pPr>
+      <w:r>
+        <w:t>worker shutdown</w:t>
+      </w:r>
+    </w:p>
+    <w:p>
+      <w:pPr>
+        <w:numPr>
+          <w:ilvl w:val="0"/>
+          <w:numId w:val="23"/>
+        </w:numPr>
+        <w:bidi w:val="0"/>
+        <w:spacing w:after="0" w:line="240" w:lineRule="auto"/>
+      </w:pPr>
+      <w:r>
+        <w:t>flush semantics</w:t>
+      </w:r>
+    </w:p>
+    <w:p>
+      <w:pPr>
+        <w:numPr>
+          <w:ilvl w:val="0"/>
+          <w:numId w:val="23"/>
+        </w:numPr>
+        <w:bidi w:val="0"/>
+        <w:spacing w:after="0" w:line="240" w:lineRule="auto"/>
+      </w:pPr>
+      <w:r>
+        <w:t>thread</w:t>
+      </w:r>
+      <w:r>
+        <w:noBreakHyphen/>
+        <w:t>safe scheduling</w:t>
+      </w:r>
+    </w:p>
+    <w:p>
+      <w:pPr>
+        <w:numPr>
+          <w:ilvl w:val="0"/>
+          <w:numId w:val="23"/>
+        </w:numPr>
+        <w:bidi w:val="0"/>
+        <w:spacing w:after="0" w:line="240" w:lineRule="auto"/>
+      </w:pPr>
+      <w:r>
+        <w:t>error propagation</w:t>
+      </w:r>
+    </w:p>
+    <w:p>
+      <w:pPr>
+        <w:bidi w:val="0"/>
+        <w:spacing w:after="0" w:line="240" w:lineRule="auto"/>
+      </w:pPr>
+      <w:r>
+        <w:t>These are worth adding tests for because they affect correctness.</w:t>
+      </w:r>
+    </w:p>
+    <w:p>
+      <w:pPr>
+        <w:bidi w:val="0"/>
+        <w:spacing w:after="0" w:line="240" w:lineRule="auto"/>
+        <w:rPr>
+          <w:b/>
+          <w:bCs/>
+        </w:rPr>
+      </w:pPr>
+      <w:r>
+        <w:rPr>
+          <w:rFonts w:ascii="Segoe UI Emoji" w:hAnsi="Segoe UI Emoji" w:cs="Segoe UI Emoji"/>
+          <w:b/>
+          <w:bCs/>
+        </w:rPr>
+        <w:t>🟨</w:t>
+      </w:r>
+      <w:r>
+        <w:rPr>
+          <w:b/>
+          <w:bCs/>
+        </w:rPr>
+        <w:t xml:space="preserve"> Priority 2 — Rotation fallback paths (optional)</w:t>
+      </w:r>
+    </w:p>
+    <w:p>
+      <w:pPr>
+        <w:bidi w:val="0"/>
+        <w:spacing w:after="0" w:line="240" w:lineRule="auto"/>
+      </w:pPr>
+      <w:r>
+        <w:t>These include:</w:t>
+      </w:r>
+    </w:p>
+    <w:p>
+      <w:pPr>
+        <w:numPr>
+          <w:ilvl w:val="0"/>
+          <w:numId w:val="24"/>
+        </w:numPr>
+        <w:bidi w:val="0"/>
+        <w:spacing w:after="0" w:line="240" w:lineRule="auto"/>
+      </w:pPr>
+      <w:r>
+        <w:t>rotation failure recovery</w:t>
+      </w:r>
+    </w:p>
+    <w:p>
+      <w:pPr>
+        <w:numPr>
+          <w:ilvl w:val="0"/>
+          <w:numId w:val="24"/>
+        </w:numPr>
+        <w:bidi w:val="0"/>
+        <w:spacing w:after="0" w:line="240" w:lineRule="auto"/>
+      </w:pPr>
+      <w:r>
+        <w:t>partial rotation cleanup</w:t>
+      </w:r>
+    </w:p>
+    <w:p>
+      <w:pPr>
+        <w:numPr>
+          <w:ilvl w:val="0"/>
+          <w:numId w:val="24"/>
+        </w:numPr>
+        <w:bidi w:val="0"/>
+        <w:spacing w:after="0" w:line="240" w:lineRule="auto"/>
+      </w:pPr>
+      <w:proofErr w:type="spellStart"/>
+      <w:r>
+        <w:t>lockfile</w:t>
+      </w:r>
+      <w:proofErr w:type="spellEnd"/>
+      <w:r>
+        <w:t xml:space="preserve"> cleanup</w:t>
+      </w:r>
+    </w:p>
+    <w:p>
+      <w:pPr>
+        <w:numPr>
+          <w:ilvl w:val="0"/>
+          <w:numId w:val="24"/>
+        </w:numPr>
+        <w:bidi w:val="0"/>
+        <w:spacing w:after="0" w:line="240" w:lineRule="auto"/>
+      </w:pPr>
+      <w:proofErr w:type="spellStart"/>
+      <w:r>
+        <w:t>backupCount</w:t>
+      </w:r>
+      <w:proofErr w:type="spellEnd"/>
+      <w:r>
+        <w:t xml:space="preserve"> overflow</w:t>
+      </w:r>
+    </w:p>
+    <w:p>
+      <w:pPr>
+        <w:bidi w:val="0"/>
+        <w:spacing w:after="0" w:line="240" w:lineRule="auto"/>
+      </w:pPr>
+      <w:r>
+        <w:t>These are useful but not critical unless you want bulletproof rotation.</w:t>
+      </w:r>
+    </w:p>
+    <w:p>
+      <w:pPr>
+        <w:bidi w:val="0"/>
+        <w:spacing w:after="0" w:line="240" w:lineRule="auto"/>
+        <w:rPr>
+          <w:b/>
+          <w:bCs/>
+        </w:rPr>
+      </w:pPr>
+      <w:r>
+        <w:rPr>
+          <w:rFonts w:ascii="Segoe UI Emoji" w:hAnsi="Segoe UI Emoji" w:cs="Segoe UI Emoji"/>
+          <w:b/>
+          <w:bCs/>
+        </w:rPr>
+        <w:t>🟦</w:t>
+      </w:r>
+      <w:r>
+        <w:rPr>
+          <w:b/>
+          <w:bCs/>
+        </w:rPr>
+        <w:t xml:space="preserve"> Priority 3 — Error handling branches (optional)</w:t>
+      </w:r>
+    </w:p>
+    <w:p>
+      <w:pPr>
+        <w:bidi w:val="0"/>
+        <w:spacing w:after="0" w:line="240" w:lineRule="auto"/>
+      </w:pPr>
+      <w:r>
+        <w:t>These include:</w:t>
+      </w:r>
+    </w:p>
+    <w:p>
+      <w:pPr>
+        <w:numPr>
+          <w:ilvl w:val="0"/>
+          <w:numId w:val="25"/>
+        </w:numPr>
+        <w:bidi w:val="0"/>
+        <w:spacing w:after="0" w:line="240" w:lineRule="auto"/>
+      </w:pPr>
+      <w:r>
+        <w:t>catching unexpected exceptions</w:t>
+      </w:r>
+    </w:p>
+    <w:p>
+      <w:pPr>
+        <w:numPr>
+          <w:ilvl w:val="0"/>
+          <w:numId w:val="25"/>
+        </w:numPr>
+        <w:bidi w:val="0"/>
+        <w:spacing w:after="0" w:line="240" w:lineRule="auto"/>
+      </w:pPr>
+      <w:r>
+        <w:t>fallback to safe logging</w:t>
+      </w:r>
+    </w:p>
+    <w:p>
+      <w:pPr>
+        <w:numPr>
+          <w:ilvl w:val="0"/>
+          <w:numId w:val="25"/>
+        </w:numPr>
+        <w:bidi w:val="0"/>
+        <w:spacing w:after="0" w:line="240" w:lineRule="auto"/>
+      </w:pPr>
+      <w:r>
+        <w:t>internal error reporting</w:t>
+      </w:r>
+    </w:p>
+    <w:p>
+      <w:pPr>
+        <w:bidi w:val="0"/>
+        <w:spacing w:after="0" w:line="240" w:lineRule="auto"/>
+      </w:pPr>
+      <w:r>
+        <w:t>These are rarely triggered in real life.</w:t>
+      </w:r>
+    </w:p>
+    <w:p>
+      <w:pPr>
+        <w:bidi w:val="0"/>
+        <w:spacing w:after="0" w:line="240" w:lineRule="auto"/>
+        <w:rPr>
+          <w:b/>
+          <w:bCs/>
+        </w:rPr>
+      </w:pPr>
+      <w:r>
+        <w:rPr>
+          <w:rFonts w:ascii="Segoe UI Emoji" w:hAnsi="Segoe UI Emoji" w:cs="Segoe UI Emoji"/>
+          <w:b/>
+          <w:bCs/>
+        </w:rPr>
+        <w:t>🟥</w:t>
+      </w:r>
+      <w:r>
+        <w:rPr>
+          <w:b/>
+          <w:bCs/>
+        </w:rPr>
+        <w:t xml:space="preserve"> Priority 4 — Defensive code and dead branches (ignore)</w:t>
+      </w:r>
+    </w:p>
+    <w:p>
+      <w:pPr>
+        <w:bidi w:val="0"/>
+        <w:spacing w:after="0" w:line="240" w:lineRule="auto"/>
+      </w:pPr>
+      <w:r>
+        <w:t>These include:</w:t>
+      </w:r>
+    </w:p>
+    <w:p>
+      <w:pPr>
+        <w:numPr>
+          <w:ilvl w:val="0"/>
+          <w:numId w:val="26"/>
+        </w:numPr>
+        <w:bidi w:val="0"/>
+        <w:spacing w:after="0" w:line="240" w:lineRule="auto"/>
+      </w:pPr>
+      <w:r>
+        <w:t>“</w:t>
+      </w:r>
+      <w:proofErr w:type="gramStart"/>
+      <w:r>
+        <w:t>should</w:t>
+      </w:r>
+      <w:proofErr w:type="gramEnd"/>
+      <w:r>
+        <w:t xml:space="preserve"> never happen” guards</w:t>
+      </w:r>
+    </w:p>
+    <w:p>
+      <w:pPr>
+        <w:numPr>
+          <w:ilvl w:val="0"/>
+          <w:numId w:val="26"/>
+        </w:numPr>
+        <w:bidi w:val="0"/>
+        <w:spacing w:after="0" w:line="240" w:lineRule="auto"/>
+      </w:pPr>
+      <w:r>
+        <w:t>platform</w:t>
+      </w:r>
+      <w:r>
+        <w:noBreakHyphen/>
+        <w:t>specific branches</w:t>
+      </w:r>
+    </w:p>
+    <w:p>
+      <w:pPr>
+        <w:numPr>
+          <w:ilvl w:val="0"/>
+          <w:numId w:val="26"/>
+        </w:numPr>
+        <w:bidi w:val="0"/>
+        <w:spacing w:after="0" w:line="240" w:lineRule="auto"/>
+      </w:pPr>
+      <w:r>
+        <w:t>legacy compatibility code</w:t>
+      </w:r>
+    </w:p>
+    <w:p>
+      <w:pPr>
+        <w:bidi w:val="0"/>
+        <w:spacing w:after="0" w:line="240" w:lineRule="auto"/>
+      </w:pPr>
+      <w:r>
+        <w:t>These are not worth testing.</w:t>
+      </w:r>
+    </w:p>
+    <w:p>
+      <w:pPr>
+        <w:bidi w:val="0"/>
+        <w:spacing w:after="0" w:line="240" w:lineRule="auto"/>
+        <w:rPr>
+          <w:b/>
+          <w:bCs/>
+        </w:rPr>
+      </w:pPr>
+      <w:r>
+        <w:rPr>
+          <w:rFonts w:ascii="Segoe UI Emoji" w:hAnsi="Segoe UI Emoji" w:cs="Segoe UI Emoji"/>
+          <w:b/>
+          <w:bCs/>
+        </w:rPr>
+        <w:t>🌟</w:t>
+      </w:r>
+      <w:r>
+        <w:rPr>
+          <w:b/>
+          <w:bCs/>
+        </w:rPr>
+        <w:t xml:space="preserve"> Sixth: If you want to raise coverage meaningfully</w:t>
+      </w:r>
+    </w:p>
+    <w:p>
+      <w:pPr>
+        <w:bidi w:val="0"/>
+        <w:spacing w:after="0" w:line="240" w:lineRule="auto"/>
+      </w:pPr>
+      <w:r>
+        <w:t>I can help you write:</w:t>
+      </w:r>
+    </w:p>
+    <w:p>
+      <w:pPr>
+        <w:numPr>
+          <w:ilvl w:val="0"/>
+          <w:numId w:val="27"/>
+        </w:numPr>
+        <w:bidi w:val="0"/>
+        <w:spacing w:after="0" w:line="240" w:lineRule="auto"/>
+      </w:pPr>
+      <w:r>
+        <w:rPr>
+          <w:b/>
+          <w:bCs/>
+        </w:rPr>
+        <w:t>targeted async worker tests</w:t>
+      </w:r>
+    </w:p>
+    <w:p>
+      <w:pPr>
+        <w:numPr>
+          <w:ilvl w:val="0"/>
+          <w:numId w:val="27"/>
+        </w:numPr>
+        <w:bidi w:val="0"/>
+        <w:spacing w:after="0" w:line="240" w:lineRule="auto"/>
+      </w:pPr>
+      <w:r>
+        <w:rPr>
+          <w:b/>
+          <w:bCs/>
+        </w:rPr>
+        <w:t>rotation edge</w:t>
+      </w:r>
+      <w:r>
+        <w:rPr>
+          <w:b/>
+          <w:bCs/>
+        </w:rPr>
+        <w:noBreakHyphen/>
+        <w:t>case tests</w:t>
+      </w:r>
+    </w:p>
+    <w:p>
+      <w:pPr>
+        <w:numPr>
+          <w:ilvl w:val="0"/>
+          <w:numId w:val="27"/>
+        </w:numPr>
+        <w:bidi w:val="0"/>
+        <w:spacing w:after="0" w:line="240" w:lineRule="auto"/>
+      </w:pPr>
+      <w:r>
+        <w:rPr>
+          <w:b/>
+          <w:bCs/>
+        </w:rPr>
+        <w:t>shutdown race tests</w:t>
+      </w:r>
+    </w:p>
+    <w:p>
+      <w:pPr>
+        <w:numPr>
+          <w:ilvl w:val="0"/>
+          <w:numId w:val="27"/>
+        </w:numPr>
+        <w:bidi w:val="0"/>
+        <w:spacing w:after="0" w:line="240" w:lineRule="auto"/>
+      </w:pPr>
+      <w:r>
+        <w:rPr>
+          <w:b/>
+          <w:bCs/>
+        </w:rPr>
+        <w:t>error</w:t>
+      </w:r>
+      <w:r>
+        <w:rPr>
+          <w:b/>
+          <w:bCs/>
+        </w:rPr>
+        <w:noBreakHyphen/>
+        <w:t>path tests</w:t>
+      </w:r>
+    </w:p>
+    <w:p>
+      <w:pPr>
+        <w:numPr>
+          <w:ilvl w:val="0"/>
+          <w:numId w:val="27"/>
+        </w:numPr>
+        <w:bidi w:val="0"/>
+        <w:spacing w:after="0" w:line="240" w:lineRule="auto"/>
+      </w:pPr>
+      <w:proofErr w:type="spellStart"/>
+      <w:r>
+        <w:rPr>
+          <w:b/>
+          <w:bCs/>
+        </w:rPr>
+        <w:t>SmartLogger</w:t>
+      </w:r>
+      <w:proofErr w:type="spellEnd"/>
+      <w:r>
+        <w:rPr>
+          <w:b/>
+          <w:bCs/>
+        </w:rPr>
+        <w:t xml:space="preserve"> process</w:t>
+      </w:r>
+      <w:r>
+        <w:rPr>
+          <w:b/>
+          <w:bCs/>
+        </w:rPr>
+        <w:noBreakHyphen/>
+        <w:t>level tests</w:t>
+      </w:r>
+    </w:p>
+    <w:p>
+      <w:pPr>
+        <w:bidi w:val="0"/>
+        <w:spacing w:after="0" w:line="240" w:lineRule="auto"/>
+      </w:pPr>
+      <w:r>
+        <w:t xml:space="preserve">These will raise coverage from </w:t>
+      </w:r>
+      <w:r>
+        <w:rPr>
+          <w:b/>
+          <w:bCs/>
+        </w:rPr>
+        <w:t>60% → 75%+</w:t>
+      </w:r>
+      <w:r>
+        <w:t xml:space="preserve"> without writing insane tests.</w:t>
+      </w:r>
+    </w:p>
+    <w:p>
+      <w:pPr>
+        <w:bidi w:val="0"/>
+        <w:spacing w:after="0" w:line="240" w:lineRule="auto"/>
+      </w:pPr>
+      <w:r>
+        <w:t>Just tell me:</w:t>
+      </w:r>
+    </w:p>
+    <w:p>
+      <w:pPr>
+        <w:bidi w:val="0"/>
+        <w:spacing w:after="0" w:line="240" w:lineRule="auto"/>
+      </w:pPr>
+      <w:r>
+        <w:rPr>
+          <w:rFonts w:ascii="Segoe UI Emoji" w:hAnsi="Segoe UI Emoji" w:cs="Segoe UI Emoji"/>
+        </w:rPr>
+        <w:t>👉</w:t>
+      </w:r>
+      <w:r>
+        <w:t xml:space="preserve"> </w:t>
+      </w:r>
+      <w:r>
+        <w:rPr>
+          <w:b/>
+          <w:bCs/>
+        </w:rPr>
+        <w:t>“Help me improve coverage for async_smartlogger.py.”</w:t>
+      </w:r>
+      <w:r>
+        <w:t xml:space="preserve"> or </w:t>
+      </w:r>
+      <w:r>
+        <w:rPr>
+          <w:rFonts w:ascii="Segoe UI Emoji" w:hAnsi="Segoe UI Emoji" w:cs="Segoe UI Emoji"/>
+        </w:rPr>
+        <w:t>👉</w:t>
+      </w:r>
+      <w:r>
+        <w:t xml:space="preserve"> </w:t>
+      </w:r>
+      <w:r>
+        <w:rPr>
+          <w:b/>
+          <w:bCs/>
+        </w:rPr>
+        <w:t>“Help me improve rotation coverage.”</w:t>
+      </w:r>
+      <w:r>
+        <w:t xml:space="preserve"> or </w:t>
+      </w:r>
+      <w:r>
+        <w:rPr>
+          <w:rFonts w:ascii="Segoe UI Emoji" w:hAnsi="Segoe UI Emoji" w:cs="Segoe UI Emoji"/>
+        </w:rPr>
+        <w:t>👉</w:t>
+      </w:r>
+      <w:r>
+        <w:t xml:space="preserve"> </w:t>
+      </w:r>
+      <w:r>
+        <w:rPr>
+          <w:b/>
+          <w:bCs/>
+        </w:rPr>
+        <w:t xml:space="preserve">“Help me improve </w:t>
+      </w:r>
+      <w:proofErr w:type="spellStart"/>
+      <w:r>
+        <w:rPr>
+          <w:b/>
+          <w:bCs/>
+        </w:rPr>
+        <w:t>SmartLogger</w:t>
+      </w:r>
+      <w:proofErr w:type="spellEnd"/>
+      <w:r>
+        <w:rPr>
+          <w:b/>
+          <w:bCs/>
+        </w:rPr>
+        <w:t xml:space="preserve"> coverage.”</w:t>
+      </w:r>
+    </w:p>
+    <w:p>
+      <w:pPr>
+        <w:bidi w:val="0"/>
+        <w:spacing w:after="0" w:line="240" w:lineRule="auto"/>
+      </w:pPr>
+      <w:r>
+        <w:t>I can guide you through each file, each missing branch, and each meaningful test.</w:t>
       </w:r>
     </w:p>
     <w:p>
@@ -1918,6 +2709,155 @@
 <file path=word/numbering.xml><?xml version="1.0" encoding="utf-8"?>
 <w:numbering xmlns:wpc="http://schemas.microsoft.com/office/word/2010/wordprocessingCanvas" xmlns:cx="http://schemas.microsoft.com/office/drawing/2014/chartex" xmlns:cx1="http://schemas.microsoft.com/office/drawing/2015/9/8/chartex" xmlns:cx2="http://schemas.microsoft.com/office/drawing/2015/10/21/chartex" xmlns:cx3="http://schemas.microsoft.com/office/drawing/2016/5/9/chartex" xmlns:cx4="http://schemas.microsoft.com/office/drawing/2016/5/10/chartex" xmlns:cx5="http://schemas.microsoft.com/office/drawing/2016/5/11/chartex" xmlns:cx6="http://schemas.microsoft.com/office/drawing/2016/5/12/chartex" xmlns:cx7="http://schemas.microsoft.com/office/drawing/2016/5/13/chartex" xmlns:cx8="http://schemas.microsoft.com/office/drawing/2016/5/14/chartex" xmlns:mc="http://schemas.openxmlformats.org/markup-compatibility/2006" xmlns:aink="http://schemas.microsoft.com/office/drawing/2016/ink" xmlns:am3d="http://schemas.microsoft.com/office/drawing/2017/model3d" xmlns:o="urn:schemas-microsoft-com:office:office" xmlns:oel="http://schemas.microsoft.com/office/2019/extlst" xmlns:r="http://schemas.openxmlformats.org/officeDocument/2006/relationships" xmlns:m="http://schemas.openxmlformats.org/officeDocument/2006/math" xmlns:v="urn:schemas-microsoft-com:vml" xmlns:wp14="http://schemas.microsoft.com/office/word/2010/wordprocessingDrawing" xmlns:wp="http://schemas.openxmlformats.org/drawingml/2006/wordprocessingDrawing" xmlns:w10="urn:schemas-microsoft-com:office:word" xmlns:w="http://schemas.openxmlformats.org/wordprocessingml/2006/main" xmlns:w14="http://schemas.microsoft.com/office/word/2010/wordml" xmlns:w15="http://schemas.microsoft.com/office/word/2012/wordml" xmlns:w16cex="http://schemas.microsoft.com/office/word/2018/wordml/cex" xmlns:w16cid="http://schemas.microsoft.com/office/word/2016/wordml/cid" xmlns:w16="http://schemas.microsoft.com/office/word/2018/wordml" xmlns:w16du="http://schemas.microsoft.com/office/word/2023/wordml/word16du" xmlns:w16sdtdh="http://schemas.microsoft.com/office/word/2020/wordml/sdtdatahash" xmlns:w16sdtfl="http://schemas.microsoft.com/office/word/2024/wordml/sdtformatlock" xmlns:w16se="http://schemas.microsoft.com/office/word/2015/wordml/symex" xmlns:wpg="http://schemas.microsoft.com/office/word/2010/wordprocessingGroup" xmlns:wpi="http://schemas.microsoft.com/office/word/2010/wordprocessingInk" xmlns:wne="http://schemas.microsoft.com/office/word/2006/wordml" xmlns:wps="http://schemas.microsoft.com/office/word/2010/wordprocessingShape" mc:Ignorable="w14 w15 w16se w16cid w16 w16cex w16sdtdh w16sdtfl w16du wp14">
   <w:abstractNum w:abstractNumId="0" w15:restartNumberingAfterBreak="0">
+    <w:nsid w:val="003227CA"/>
+    <w:multiLevelType w:val="multilevel"/>
+    <w:tmpl w:val="5D76E486"/>
+    <w:lvl w:ilvl="0">
+      <w:start w:val="1"/>
+      <w:numFmt w:val="bullet"/>
+      <w:lvlText w:val=""/>
+      <w:lvlJc w:val="left"/>
+      <w:pPr>
+        <w:tabs>
+          <w:tab w:val="num" w:pos="720"/>
+        </w:tabs>
+        <w:ind w:left="720" w:hanging="360"/>
+      </w:pPr>
+      <w:rPr>
+        <w:rFonts w:ascii="Symbol" w:hAnsi="Symbol" w:hint="default"/>
+        <w:sz w:val="20"/>
+      </w:rPr>
+    </w:lvl>
+    <w:lvl w:ilvl="1" w:tentative="1">
+      <w:start w:val="1"/>
+      <w:numFmt w:val="bullet"/>
+      <w:lvlText w:val="o"/>
+      <w:lvlJc w:val="left"/>
+      <w:pPr>
+        <w:tabs>
+          <w:tab w:val="num" w:pos="1440"/>
+        </w:tabs>
+        <w:ind w:left="1440" w:hanging="360"/>
+      </w:pPr>
+      <w:rPr>
+        <w:rFonts w:ascii="Courier New" w:hAnsi="Courier New" w:hint="default"/>
+        <w:sz w:val="20"/>
+      </w:rPr>
+    </w:lvl>
+    <w:lvl w:ilvl="2" w:tentative="1">
+      <w:start w:val="1"/>
+      <w:numFmt w:val="bullet"/>
+      <w:lvlText w:val=""/>
+      <w:lvlJc w:val="left"/>
+      <w:pPr>
+        <w:tabs>
+          <w:tab w:val="num" w:pos="2160"/>
+        </w:tabs>
+        <w:ind w:left="2160" w:hanging="360"/>
+      </w:pPr>
+      <w:rPr>
+        <w:rFonts w:ascii="Wingdings" w:hAnsi="Wingdings" w:hint="default"/>
+        <w:sz w:val="20"/>
+      </w:rPr>
+    </w:lvl>
+    <w:lvl w:ilvl="3" w:tentative="1">
+      <w:start w:val="1"/>
+      <w:numFmt w:val="bullet"/>
+      <w:lvlText w:val=""/>
+      <w:lvlJc w:val="left"/>
+      <w:pPr>
+        <w:tabs>
+          <w:tab w:val="num" w:pos="2880"/>
+        </w:tabs>
+        <w:ind w:left="2880" w:hanging="360"/>
+      </w:pPr>
+      <w:rPr>
+        <w:rFonts w:ascii="Wingdings" w:hAnsi="Wingdings" w:hint="default"/>
+        <w:sz w:val="20"/>
+      </w:rPr>
+    </w:lvl>
+    <w:lvl w:ilvl="4" w:tentative="1">
+      <w:start w:val="1"/>
+      <w:numFmt w:val="bullet"/>
+      <w:lvlText w:val=""/>
+      <w:lvlJc w:val="left"/>
+      <w:pPr>
+        <w:tabs>
+          <w:tab w:val="num" w:pos="3600"/>
+        </w:tabs>
+        <w:ind w:left="3600" w:hanging="360"/>
+      </w:pPr>
+      <w:rPr>
+        <w:rFonts w:ascii="Wingdings" w:hAnsi="Wingdings" w:hint="default"/>
+        <w:sz w:val="20"/>
+      </w:rPr>
+    </w:lvl>
+    <w:lvl w:ilvl="5" w:tentative="1">
+      <w:start w:val="1"/>
+      <w:numFmt w:val="bullet"/>
+      <w:lvlText w:val=""/>
+      <w:lvlJc w:val="left"/>
+      <w:pPr>
+        <w:tabs>
+          <w:tab w:val="num" w:pos="4320"/>
+        </w:tabs>
+        <w:ind w:left="4320" w:hanging="360"/>
+      </w:pPr>
+      <w:rPr>
+        <w:rFonts w:ascii="Wingdings" w:hAnsi="Wingdings" w:hint="default"/>
+        <w:sz w:val="20"/>
+      </w:rPr>
+    </w:lvl>
+    <w:lvl w:ilvl="6" w:tentative="1">
+      <w:start w:val="1"/>
+      <w:numFmt w:val="bullet"/>
+      <w:lvlText w:val=""/>
+      <w:lvlJc w:val="left"/>
+      <w:pPr>
+        <w:tabs>
+          <w:tab w:val="num" w:pos="5040"/>
+        </w:tabs>
+        <w:ind w:left="5040" w:hanging="360"/>
+      </w:pPr>
+      <w:rPr>
+        <w:rFonts w:ascii="Wingdings" w:hAnsi="Wingdings" w:hint="default"/>
+        <w:sz w:val="20"/>
+      </w:rPr>
+    </w:lvl>
+    <w:lvl w:ilvl="7" w:tentative="1">
+      <w:start w:val="1"/>
+      <w:numFmt w:val="bullet"/>
+      <w:lvlText w:val=""/>
+      <w:lvlJc w:val="left"/>
+      <w:pPr>
+        <w:tabs>
+          <w:tab w:val="num" w:pos="5760"/>
+        </w:tabs>
+        <w:ind w:left="5760" w:hanging="360"/>
+      </w:pPr>
+      <w:rPr>
+        <w:rFonts w:ascii="Wingdings" w:hAnsi="Wingdings" w:hint="default"/>
+        <w:sz w:val="20"/>
+      </w:rPr>
+    </w:lvl>
+    <w:lvl w:ilvl="8" w:tentative="1">
+      <w:start w:val="1"/>
+      <w:numFmt w:val="bullet"/>
+      <w:lvlText w:val=""/>
+      <w:lvlJc w:val="left"/>
+      <w:pPr>
+        <w:tabs>
+          <w:tab w:val="num" w:pos="6480"/>
+        </w:tabs>
+        <w:ind w:left="6480" w:hanging="360"/>
+      </w:pPr>
+      <w:rPr>
+        <w:rFonts w:ascii="Wingdings" w:hAnsi="Wingdings" w:hint="default"/>
+        <w:sz w:val="20"/>
+      </w:rPr>
+    </w:lvl>
+  </w:abstractNum>
+  <w:abstractNum w:abstractNumId="1" w15:restartNumberingAfterBreak="0">
     <w:nsid w:val="1F565EC4"/>
     <w:multiLevelType w:val="multilevel"/>
     <w:tmpl w:val="86749ED2"/>
@@ -2066,7 +3006,7 @@
       </w:rPr>
     </w:lvl>
   </w:abstractNum>
-  <w:abstractNum w:abstractNumId="1" w15:restartNumberingAfterBreak="0">
+  <w:abstractNum w:abstractNumId="2" w15:restartNumberingAfterBreak="0">
     <w:nsid w:val="20631D27"/>
     <w:multiLevelType w:val="multilevel"/>
     <w:tmpl w:val="4722307A"/>
@@ -2215,7 +3155,7 @@
       </w:rPr>
     </w:lvl>
   </w:abstractNum>
-  <w:abstractNum w:abstractNumId="2" w15:restartNumberingAfterBreak="0">
+  <w:abstractNum w:abstractNumId="3" w15:restartNumberingAfterBreak="0">
     <w:nsid w:val="21306E54"/>
     <w:multiLevelType w:val="multilevel"/>
     <w:tmpl w:val="96EA1C46"/>
@@ -2364,7 +3304,7 @@
       </w:rPr>
     </w:lvl>
   </w:abstractNum>
-  <w:abstractNum w:abstractNumId="3" w15:restartNumberingAfterBreak="0">
+  <w:abstractNum w:abstractNumId="4" w15:restartNumberingAfterBreak="0">
     <w:nsid w:val="21641FF0"/>
     <w:multiLevelType w:val="multilevel"/>
     <w:tmpl w:val="002C04EE"/>
@@ -2513,7 +3453,7 @@
       </w:rPr>
     </w:lvl>
   </w:abstractNum>
-  <w:abstractNum w:abstractNumId="4" w15:restartNumberingAfterBreak="0">
+  <w:abstractNum w:abstractNumId="5" w15:restartNumberingAfterBreak="0">
     <w:nsid w:val="26166456"/>
     <w:multiLevelType w:val="multilevel"/>
     <w:tmpl w:val="1272104C"/>
@@ -2662,7 +3602,7 @@
       </w:rPr>
     </w:lvl>
   </w:abstractNum>
-  <w:abstractNum w:abstractNumId="5" w15:restartNumberingAfterBreak="0">
+  <w:abstractNum w:abstractNumId="6" w15:restartNumberingAfterBreak="0">
     <w:nsid w:val="26C21FB4"/>
     <w:multiLevelType w:val="multilevel"/>
     <w:tmpl w:val="C9705616"/>
@@ -2811,7 +3751,7 @@
       </w:rPr>
     </w:lvl>
   </w:abstractNum>
-  <w:abstractNum w:abstractNumId="6" w15:restartNumberingAfterBreak="0">
+  <w:abstractNum w:abstractNumId="7" w15:restartNumberingAfterBreak="0">
     <w:nsid w:val="2AB04E40"/>
     <w:multiLevelType w:val="multilevel"/>
     <w:tmpl w:val="65CA7AFA"/>
@@ -2960,7 +3900,7 @@
       </w:rPr>
     </w:lvl>
   </w:abstractNum>
-  <w:abstractNum w:abstractNumId="7" w15:restartNumberingAfterBreak="0">
+  <w:abstractNum w:abstractNumId="8" w15:restartNumberingAfterBreak="0">
     <w:nsid w:val="30306D0A"/>
     <w:multiLevelType w:val="multilevel"/>
     <w:tmpl w:val="B17C8F08"/>
@@ -3109,7 +4049,7 @@
       </w:rPr>
     </w:lvl>
   </w:abstractNum>
-  <w:abstractNum w:abstractNumId="8" w15:restartNumberingAfterBreak="0">
+  <w:abstractNum w:abstractNumId="9" w15:restartNumberingAfterBreak="0">
     <w:nsid w:val="3237375A"/>
     <w:multiLevelType w:val="multilevel"/>
     <w:tmpl w:val="7624CB0E"/>
@@ -3258,7 +4198,7 @@
       </w:rPr>
     </w:lvl>
   </w:abstractNum>
-  <w:abstractNum w:abstractNumId="9" w15:restartNumberingAfterBreak="0">
+  <w:abstractNum w:abstractNumId="10" w15:restartNumberingAfterBreak="0">
     <w:nsid w:val="357F7E92"/>
     <w:multiLevelType w:val="multilevel"/>
     <w:tmpl w:val="E22C51A6"/>
@@ -3407,7 +4347,305 @@
       </w:rPr>
     </w:lvl>
   </w:abstractNum>
-  <w:abstractNum w:abstractNumId="10" w15:restartNumberingAfterBreak="0">
+  <w:abstractNum w:abstractNumId="11" w15:restartNumberingAfterBreak="0">
+    <w:nsid w:val="368A7933"/>
+    <w:multiLevelType w:val="multilevel"/>
+    <w:tmpl w:val="CE728E5C"/>
+    <w:lvl w:ilvl="0">
+      <w:start w:val="1"/>
+      <w:numFmt w:val="bullet"/>
+      <w:lvlText w:val=""/>
+      <w:lvlJc w:val="left"/>
+      <w:pPr>
+        <w:tabs>
+          <w:tab w:val="num" w:pos="720"/>
+        </w:tabs>
+        <w:ind w:left="720" w:hanging="360"/>
+      </w:pPr>
+      <w:rPr>
+        <w:rFonts w:ascii="Symbol" w:hAnsi="Symbol" w:hint="default"/>
+        <w:sz w:val="20"/>
+      </w:rPr>
+    </w:lvl>
+    <w:lvl w:ilvl="1" w:tentative="1">
+      <w:start w:val="1"/>
+      <w:numFmt w:val="bullet"/>
+      <w:lvlText w:val="o"/>
+      <w:lvlJc w:val="left"/>
+      <w:pPr>
+        <w:tabs>
+          <w:tab w:val="num" w:pos="1440"/>
+        </w:tabs>
+        <w:ind w:left="1440" w:hanging="360"/>
+      </w:pPr>
+      <w:rPr>
+        <w:rFonts w:ascii="Courier New" w:hAnsi="Courier New" w:hint="default"/>
+        <w:sz w:val="20"/>
+      </w:rPr>
+    </w:lvl>
+    <w:lvl w:ilvl="2" w:tentative="1">
+      <w:start w:val="1"/>
+      <w:numFmt w:val="bullet"/>
+      <w:lvlText w:val=""/>
+      <w:lvlJc w:val="left"/>
+      <w:pPr>
+        <w:tabs>
+          <w:tab w:val="num" w:pos="2160"/>
+        </w:tabs>
+        <w:ind w:left="2160" w:hanging="360"/>
+      </w:pPr>
+      <w:rPr>
+        <w:rFonts w:ascii="Wingdings" w:hAnsi="Wingdings" w:hint="default"/>
+        <w:sz w:val="20"/>
+      </w:rPr>
+    </w:lvl>
+    <w:lvl w:ilvl="3" w:tentative="1">
+      <w:start w:val="1"/>
+      <w:numFmt w:val="bullet"/>
+      <w:lvlText w:val=""/>
+      <w:lvlJc w:val="left"/>
+      <w:pPr>
+        <w:tabs>
+          <w:tab w:val="num" w:pos="2880"/>
+        </w:tabs>
+        <w:ind w:left="2880" w:hanging="360"/>
+      </w:pPr>
+      <w:rPr>
+        <w:rFonts w:ascii="Wingdings" w:hAnsi="Wingdings" w:hint="default"/>
+        <w:sz w:val="20"/>
+      </w:rPr>
+    </w:lvl>
+    <w:lvl w:ilvl="4" w:tentative="1">
+      <w:start w:val="1"/>
+      <w:numFmt w:val="bullet"/>
+      <w:lvlText w:val=""/>
+      <w:lvlJc w:val="left"/>
+      <w:pPr>
+        <w:tabs>
+          <w:tab w:val="num" w:pos="3600"/>
+        </w:tabs>
+        <w:ind w:left="3600" w:hanging="360"/>
+      </w:pPr>
+      <w:rPr>
+        <w:rFonts w:ascii="Wingdings" w:hAnsi="Wingdings" w:hint="default"/>
+        <w:sz w:val="20"/>
+      </w:rPr>
+    </w:lvl>
+    <w:lvl w:ilvl="5" w:tentative="1">
+      <w:start w:val="1"/>
+      <w:numFmt w:val="bullet"/>
+      <w:lvlText w:val=""/>
+      <w:lvlJc w:val="left"/>
+      <w:pPr>
+        <w:tabs>
+          <w:tab w:val="num" w:pos="4320"/>
+        </w:tabs>
+        <w:ind w:left="4320" w:hanging="360"/>
+      </w:pPr>
+      <w:rPr>
+        <w:rFonts w:ascii="Wingdings" w:hAnsi="Wingdings" w:hint="default"/>
+        <w:sz w:val="20"/>
+      </w:rPr>
+    </w:lvl>
+    <w:lvl w:ilvl="6" w:tentative="1">
+      <w:start w:val="1"/>
+      <w:numFmt w:val="bullet"/>
+      <w:lvlText w:val=""/>
+      <w:lvlJc w:val="left"/>
+      <w:pPr>
+        <w:tabs>
+          <w:tab w:val="num" w:pos="5040"/>
+        </w:tabs>
+        <w:ind w:left="5040" w:hanging="360"/>
+      </w:pPr>
+      <w:rPr>
+        <w:rFonts w:ascii="Wingdings" w:hAnsi="Wingdings" w:hint="default"/>
+        <w:sz w:val="20"/>
+      </w:rPr>
+    </w:lvl>
+    <w:lvl w:ilvl="7" w:tentative="1">
+      <w:start w:val="1"/>
+      <w:numFmt w:val="bullet"/>
+      <w:lvlText w:val=""/>
+      <w:lvlJc w:val="left"/>
+      <w:pPr>
+        <w:tabs>
+          <w:tab w:val="num" w:pos="5760"/>
+        </w:tabs>
+        <w:ind w:left="5760" w:hanging="360"/>
+      </w:pPr>
+      <w:rPr>
+        <w:rFonts w:ascii="Wingdings" w:hAnsi="Wingdings" w:hint="default"/>
+        <w:sz w:val="20"/>
+      </w:rPr>
+    </w:lvl>
+    <w:lvl w:ilvl="8" w:tentative="1">
+      <w:start w:val="1"/>
+      <w:numFmt w:val="bullet"/>
+      <w:lvlText w:val=""/>
+      <w:lvlJc w:val="left"/>
+      <w:pPr>
+        <w:tabs>
+          <w:tab w:val="num" w:pos="6480"/>
+        </w:tabs>
+        <w:ind w:left="6480" w:hanging="360"/>
+      </w:pPr>
+      <w:rPr>
+        <w:rFonts w:ascii="Wingdings" w:hAnsi="Wingdings" w:hint="default"/>
+        <w:sz w:val="20"/>
+      </w:rPr>
+    </w:lvl>
+  </w:abstractNum>
+  <w:abstractNum w:abstractNumId="12" w15:restartNumberingAfterBreak="0">
+    <w:nsid w:val="374C2F42"/>
+    <w:multiLevelType w:val="multilevel"/>
+    <w:tmpl w:val="6E46FAF4"/>
+    <w:lvl w:ilvl="0">
+      <w:start w:val="1"/>
+      <w:numFmt w:val="bullet"/>
+      <w:lvlText w:val=""/>
+      <w:lvlJc w:val="left"/>
+      <w:pPr>
+        <w:tabs>
+          <w:tab w:val="num" w:pos="720"/>
+        </w:tabs>
+        <w:ind w:left="720" w:hanging="360"/>
+      </w:pPr>
+      <w:rPr>
+        <w:rFonts w:ascii="Symbol" w:hAnsi="Symbol" w:hint="default"/>
+        <w:sz w:val="20"/>
+      </w:rPr>
+    </w:lvl>
+    <w:lvl w:ilvl="1" w:tentative="1">
+      <w:start w:val="1"/>
+      <w:numFmt w:val="bullet"/>
+      <w:lvlText w:val="o"/>
+      <w:lvlJc w:val="left"/>
+      <w:pPr>
+        <w:tabs>
+          <w:tab w:val="num" w:pos="1440"/>
+        </w:tabs>
+        <w:ind w:left="1440" w:hanging="360"/>
+      </w:pPr>
+      <w:rPr>
+        <w:rFonts w:ascii="Courier New" w:hAnsi="Courier New" w:hint="default"/>
+        <w:sz w:val="20"/>
+      </w:rPr>
+    </w:lvl>
+    <w:lvl w:ilvl="2" w:tentative="1">
+      <w:start w:val="1"/>
+      <w:numFmt w:val="bullet"/>
+      <w:lvlText w:val=""/>
+      <w:lvlJc w:val="left"/>
+      <w:pPr>
+        <w:tabs>
+          <w:tab w:val="num" w:pos="2160"/>
+        </w:tabs>
+        <w:ind w:left="2160" w:hanging="360"/>
+      </w:pPr>
+      <w:rPr>
+        <w:rFonts w:ascii="Wingdings" w:hAnsi="Wingdings" w:hint="default"/>
+        <w:sz w:val="20"/>
+      </w:rPr>
+    </w:lvl>
+    <w:lvl w:ilvl="3" w:tentative="1">
+      <w:start w:val="1"/>
+      <w:numFmt w:val="bullet"/>
+      <w:lvlText w:val=""/>
+      <w:lvlJc w:val="left"/>
+      <w:pPr>
+        <w:tabs>
+          <w:tab w:val="num" w:pos="2880"/>
+        </w:tabs>
+        <w:ind w:left="2880" w:hanging="360"/>
+      </w:pPr>
+      <w:rPr>
+        <w:rFonts w:ascii="Wingdings" w:hAnsi="Wingdings" w:hint="default"/>
+        <w:sz w:val="20"/>
+      </w:rPr>
+    </w:lvl>
+    <w:lvl w:ilvl="4" w:tentative="1">
+      <w:start w:val="1"/>
+      <w:numFmt w:val="bullet"/>
+      <w:lvlText w:val=""/>
+      <w:lvlJc w:val="left"/>
+      <w:pPr>
+        <w:tabs>
+          <w:tab w:val="num" w:pos="3600"/>
+        </w:tabs>
+        <w:ind w:left="3600" w:hanging="360"/>
+      </w:pPr>
+      <w:rPr>
+        <w:rFonts w:ascii="Wingdings" w:hAnsi="Wingdings" w:hint="default"/>
+        <w:sz w:val="20"/>
+      </w:rPr>
+    </w:lvl>
+    <w:lvl w:ilvl="5" w:tentative="1">
+      <w:start w:val="1"/>
+      <w:numFmt w:val="bullet"/>
+      <w:lvlText w:val=""/>
+      <w:lvlJc w:val="left"/>
+      <w:pPr>
+        <w:tabs>
+          <w:tab w:val="num" w:pos="4320"/>
+        </w:tabs>
+        <w:ind w:left="4320" w:hanging="360"/>
+      </w:pPr>
+      <w:rPr>
+        <w:rFonts w:ascii="Wingdings" w:hAnsi="Wingdings" w:hint="default"/>
+        <w:sz w:val="20"/>
+      </w:rPr>
+    </w:lvl>
+    <w:lvl w:ilvl="6" w:tentative="1">
+      <w:start w:val="1"/>
+      <w:numFmt w:val="bullet"/>
+      <w:lvlText w:val=""/>
+      <w:lvlJc w:val="left"/>
+      <w:pPr>
+        <w:tabs>
+          <w:tab w:val="num" w:pos="5040"/>
+        </w:tabs>
+        <w:ind w:left="5040" w:hanging="360"/>
+      </w:pPr>
+      <w:rPr>
+        <w:rFonts w:ascii="Wingdings" w:hAnsi="Wingdings" w:hint="default"/>
+        <w:sz w:val="20"/>
+      </w:rPr>
+    </w:lvl>
+    <w:lvl w:ilvl="7" w:tentative="1">
+      <w:start w:val="1"/>
+      <w:numFmt w:val="bullet"/>
+      <w:lvlText w:val=""/>
+      <w:lvlJc w:val="left"/>
+      <w:pPr>
+        <w:tabs>
+          <w:tab w:val="num" w:pos="5760"/>
+        </w:tabs>
+        <w:ind w:left="5760" w:hanging="360"/>
+      </w:pPr>
+      <w:rPr>
+        <w:rFonts w:ascii="Wingdings" w:hAnsi="Wingdings" w:hint="default"/>
+        <w:sz w:val="20"/>
+      </w:rPr>
+    </w:lvl>
+    <w:lvl w:ilvl="8" w:tentative="1">
+      <w:start w:val="1"/>
+      <w:numFmt w:val="bullet"/>
+      <w:lvlText w:val=""/>
+      <w:lvlJc w:val="left"/>
+      <w:pPr>
+        <w:tabs>
+          <w:tab w:val="num" w:pos="6480"/>
+        </w:tabs>
+        <w:ind w:left="6480" w:hanging="360"/>
+      </w:pPr>
+      <w:rPr>
+        <w:rFonts w:ascii="Wingdings" w:hAnsi="Wingdings" w:hint="default"/>
+        <w:sz w:val="20"/>
+      </w:rPr>
+    </w:lvl>
+  </w:abstractNum>
+  <w:abstractNum w:abstractNumId="13" w15:restartNumberingAfterBreak="0">
     <w:nsid w:val="40EC4D46"/>
     <w:multiLevelType w:val="multilevel"/>
     <w:tmpl w:val="6BC83472"/>
@@ -3556,7 +4794,7 @@
       </w:rPr>
     </w:lvl>
   </w:abstractNum>
-  <w:abstractNum w:abstractNumId="11" w15:restartNumberingAfterBreak="0">
+  <w:abstractNum w:abstractNumId="14" w15:restartNumberingAfterBreak="0">
     <w:nsid w:val="421C5BCB"/>
     <w:multiLevelType w:val="multilevel"/>
     <w:tmpl w:val="A8B25A8E"/>
@@ -3705,7 +4943,7 @@
       </w:rPr>
     </w:lvl>
   </w:abstractNum>
-  <w:abstractNum w:abstractNumId="12" w15:restartNumberingAfterBreak="0">
+  <w:abstractNum w:abstractNumId="15" w15:restartNumberingAfterBreak="0">
     <w:nsid w:val="45201269"/>
     <w:multiLevelType w:val="multilevel"/>
     <w:tmpl w:val="D5AC9E30"/>
@@ -3854,7 +5092,7 @@
       </w:rPr>
     </w:lvl>
   </w:abstractNum>
-  <w:abstractNum w:abstractNumId="13" w15:restartNumberingAfterBreak="0">
+  <w:abstractNum w:abstractNumId="16" w15:restartNumberingAfterBreak="0">
     <w:nsid w:val="4875692E"/>
     <w:multiLevelType w:val="multilevel"/>
     <w:tmpl w:val="9E2C6E66"/>
@@ -4003,7 +5241,7 @@
       </w:rPr>
     </w:lvl>
   </w:abstractNum>
-  <w:abstractNum w:abstractNumId="14" w15:restartNumberingAfterBreak="0">
+  <w:abstractNum w:abstractNumId="17" w15:restartNumberingAfterBreak="0">
     <w:nsid w:val="4B787C15"/>
     <w:multiLevelType w:val="multilevel"/>
     <w:tmpl w:val="E9866DA2"/>
@@ -4152,7 +5390,156 @@
       </w:rPr>
     </w:lvl>
   </w:abstractNum>
-  <w:abstractNum w:abstractNumId="15" w15:restartNumberingAfterBreak="0">
+  <w:abstractNum w:abstractNumId="18" w15:restartNumberingAfterBreak="0">
+    <w:nsid w:val="4D8708EE"/>
+    <w:multiLevelType w:val="multilevel"/>
+    <w:tmpl w:val="74E87062"/>
+    <w:lvl w:ilvl="0">
+      <w:start w:val="1"/>
+      <w:numFmt w:val="bullet"/>
+      <w:lvlText w:val=""/>
+      <w:lvlJc w:val="left"/>
+      <w:pPr>
+        <w:tabs>
+          <w:tab w:val="num" w:pos="720"/>
+        </w:tabs>
+        <w:ind w:left="720" w:hanging="360"/>
+      </w:pPr>
+      <w:rPr>
+        <w:rFonts w:ascii="Symbol" w:hAnsi="Symbol" w:hint="default"/>
+        <w:sz w:val="20"/>
+      </w:rPr>
+    </w:lvl>
+    <w:lvl w:ilvl="1" w:tentative="1">
+      <w:start w:val="1"/>
+      <w:numFmt w:val="bullet"/>
+      <w:lvlText w:val="o"/>
+      <w:lvlJc w:val="left"/>
+      <w:pPr>
+        <w:tabs>
+          <w:tab w:val="num" w:pos="1440"/>
+        </w:tabs>
+        <w:ind w:left="1440" w:hanging="360"/>
+      </w:pPr>
+      <w:rPr>
+        <w:rFonts w:ascii="Courier New" w:hAnsi="Courier New" w:hint="default"/>
+        <w:sz w:val="20"/>
+      </w:rPr>
+    </w:lvl>
+    <w:lvl w:ilvl="2" w:tentative="1">
+      <w:start w:val="1"/>
+      <w:numFmt w:val="bullet"/>
+      <w:lvlText w:val=""/>
+      <w:lvlJc w:val="left"/>
+      <w:pPr>
+        <w:tabs>
+          <w:tab w:val="num" w:pos="2160"/>
+        </w:tabs>
+        <w:ind w:left="2160" w:hanging="360"/>
+      </w:pPr>
+      <w:rPr>
+        <w:rFonts w:ascii="Wingdings" w:hAnsi="Wingdings" w:hint="default"/>
+        <w:sz w:val="20"/>
+      </w:rPr>
+    </w:lvl>
+    <w:lvl w:ilvl="3" w:tentative="1">
+      <w:start w:val="1"/>
+      <w:numFmt w:val="bullet"/>
+      <w:lvlText w:val=""/>
+      <w:lvlJc w:val="left"/>
+      <w:pPr>
+        <w:tabs>
+          <w:tab w:val="num" w:pos="2880"/>
+        </w:tabs>
+        <w:ind w:left="2880" w:hanging="360"/>
+      </w:pPr>
+      <w:rPr>
+        <w:rFonts w:ascii="Wingdings" w:hAnsi="Wingdings" w:hint="default"/>
+        <w:sz w:val="20"/>
+      </w:rPr>
+    </w:lvl>
+    <w:lvl w:ilvl="4" w:tentative="1">
+      <w:start w:val="1"/>
+      <w:numFmt w:val="bullet"/>
+      <w:lvlText w:val=""/>
+      <w:lvlJc w:val="left"/>
+      <w:pPr>
+        <w:tabs>
+          <w:tab w:val="num" w:pos="3600"/>
+        </w:tabs>
+        <w:ind w:left="3600" w:hanging="360"/>
+      </w:pPr>
+      <w:rPr>
+        <w:rFonts w:ascii="Wingdings" w:hAnsi="Wingdings" w:hint="default"/>
+        <w:sz w:val="20"/>
+      </w:rPr>
+    </w:lvl>
+    <w:lvl w:ilvl="5" w:tentative="1">
+      <w:start w:val="1"/>
+      <w:numFmt w:val="bullet"/>
+      <w:lvlText w:val=""/>
+      <w:lvlJc w:val="left"/>
+      <w:pPr>
+        <w:tabs>
+          <w:tab w:val="num" w:pos="4320"/>
+        </w:tabs>
+        <w:ind w:left="4320" w:hanging="360"/>
+      </w:pPr>
+      <w:rPr>
+        <w:rFonts w:ascii="Wingdings" w:hAnsi="Wingdings" w:hint="default"/>
+        <w:sz w:val="20"/>
+      </w:rPr>
+    </w:lvl>
+    <w:lvl w:ilvl="6" w:tentative="1">
+      <w:start w:val="1"/>
+      <w:numFmt w:val="bullet"/>
+      <w:lvlText w:val=""/>
+      <w:lvlJc w:val="left"/>
+      <w:pPr>
+        <w:tabs>
+          <w:tab w:val="num" w:pos="5040"/>
+        </w:tabs>
+        <w:ind w:left="5040" w:hanging="360"/>
+      </w:pPr>
+      <w:rPr>
+        <w:rFonts w:ascii="Wingdings" w:hAnsi="Wingdings" w:hint="default"/>
+        <w:sz w:val="20"/>
+      </w:rPr>
+    </w:lvl>
+    <w:lvl w:ilvl="7" w:tentative="1">
+      <w:start w:val="1"/>
+      <w:numFmt w:val="bullet"/>
+      <w:lvlText w:val=""/>
+      <w:lvlJc w:val="left"/>
+      <w:pPr>
+        <w:tabs>
+          <w:tab w:val="num" w:pos="5760"/>
+        </w:tabs>
+        <w:ind w:left="5760" w:hanging="360"/>
+      </w:pPr>
+      <w:rPr>
+        <w:rFonts w:ascii="Wingdings" w:hAnsi="Wingdings" w:hint="default"/>
+        <w:sz w:val="20"/>
+      </w:rPr>
+    </w:lvl>
+    <w:lvl w:ilvl="8" w:tentative="1">
+      <w:start w:val="1"/>
+      <w:numFmt w:val="bullet"/>
+      <w:lvlText w:val=""/>
+      <w:lvlJc w:val="left"/>
+      <w:pPr>
+        <w:tabs>
+          <w:tab w:val="num" w:pos="6480"/>
+        </w:tabs>
+        <w:ind w:left="6480" w:hanging="360"/>
+      </w:pPr>
+      <w:rPr>
+        <w:rFonts w:ascii="Wingdings" w:hAnsi="Wingdings" w:hint="default"/>
+        <w:sz w:val="20"/>
+      </w:rPr>
+    </w:lvl>
+  </w:abstractNum>
+  <w:abstractNum w:abstractNumId="19" w15:restartNumberingAfterBreak="0">
     <w:nsid w:val="4E02631C"/>
     <w:multiLevelType w:val="multilevel"/>
     <w:tmpl w:val="EF7E5AAE"/>
@@ -4301,7 +5688,7 @@
       </w:rPr>
     </w:lvl>
   </w:abstractNum>
-  <w:abstractNum w:abstractNumId="16" w15:restartNumberingAfterBreak="0">
+  <w:abstractNum w:abstractNumId="20" w15:restartNumberingAfterBreak="0">
     <w:nsid w:val="4FDA2355"/>
     <w:multiLevelType w:val="multilevel"/>
     <w:tmpl w:val="5AE2EBE8"/>
@@ -4450,7 +5837,7 @@
       </w:rPr>
     </w:lvl>
   </w:abstractNum>
-  <w:abstractNum w:abstractNumId="17" w15:restartNumberingAfterBreak="0">
+  <w:abstractNum w:abstractNumId="21" w15:restartNumberingAfterBreak="0">
     <w:nsid w:val="6012618C"/>
     <w:multiLevelType w:val="multilevel"/>
     <w:tmpl w:val="FFD4FDF4"/>
@@ -4599,7 +5986,7 @@
       </w:rPr>
     </w:lvl>
   </w:abstractNum>
-  <w:abstractNum w:abstractNumId="18" w15:restartNumberingAfterBreak="0">
+  <w:abstractNum w:abstractNumId="22" w15:restartNumberingAfterBreak="0">
     <w:nsid w:val="6A213618"/>
     <w:multiLevelType w:val="multilevel"/>
     <w:tmpl w:val="F8047E02"/>
@@ -4748,7 +6135,7 @@
       </w:rPr>
     </w:lvl>
   </w:abstractNum>
-  <w:abstractNum w:abstractNumId="19" w15:restartNumberingAfterBreak="0">
+  <w:abstractNum w:abstractNumId="23" w15:restartNumberingAfterBreak="0">
     <w:nsid w:val="739C7802"/>
     <w:multiLevelType w:val="multilevel"/>
     <w:tmpl w:val="6BC03AE2"/>
@@ -4897,7 +6284,7 @@
       </w:rPr>
     </w:lvl>
   </w:abstractNum>
-  <w:abstractNum w:abstractNumId="20" w15:restartNumberingAfterBreak="0">
+  <w:abstractNum w:abstractNumId="24" w15:restartNumberingAfterBreak="0">
     <w:nsid w:val="7B0C5BD3"/>
     <w:multiLevelType w:val="multilevel"/>
     <w:tmpl w:val="DF88241A"/>
@@ -5046,7 +6433,156 @@
       </w:rPr>
     </w:lvl>
   </w:abstractNum>
-  <w:abstractNum w:abstractNumId="21" w15:restartNumberingAfterBreak="0">
+  <w:abstractNum w:abstractNumId="25" w15:restartNumberingAfterBreak="0">
+    <w:nsid w:val="7DCE2ABF"/>
+    <w:multiLevelType w:val="multilevel"/>
+    <w:tmpl w:val="2B8C0E5C"/>
+    <w:lvl w:ilvl="0">
+      <w:start w:val="1"/>
+      <w:numFmt w:val="bullet"/>
+      <w:lvlText w:val=""/>
+      <w:lvlJc w:val="left"/>
+      <w:pPr>
+        <w:tabs>
+          <w:tab w:val="num" w:pos="720"/>
+        </w:tabs>
+        <w:ind w:left="720" w:hanging="360"/>
+      </w:pPr>
+      <w:rPr>
+        <w:rFonts w:ascii="Symbol" w:hAnsi="Symbol" w:hint="default"/>
+        <w:sz w:val="20"/>
+      </w:rPr>
+    </w:lvl>
+    <w:lvl w:ilvl="1" w:tentative="1">
+      <w:start w:val="1"/>
+      <w:numFmt w:val="bullet"/>
+      <w:lvlText w:val="o"/>
+      <w:lvlJc w:val="left"/>
+      <w:pPr>
+        <w:tabs>
+          <w:tab w:val="num" w:pos="1440"/>
+        </w:tabs>
+        <w:ind w:left="1440" w:hanging="360"/>
+      </w:pPr>
+      <w:rPr>
+        <w:rFonts w:ascii="Courier New" w:hAnsi="Courier New" w:hint="default"/>
+        <w:sz w:val="20"/>
+      </w:rPr>
+    </w:lvl>
+    <w:lvl w:ilvl="2" w:tentative="1">
+      <w:start w:val="1"/>
+      <w:numFmt w:val="bullet"/>
+      <w:lvlText w:val=""/>
+      <w:lvlJc w:val="left"/>
+      <w:pPr>
+        <w:tabs>
+          <w:tab w:val="num" w:pos="2160"/>
+        </w:tabs>
+        <w:ind w:left="2160" w:hanging="360"/>
+      </w:pPr>
+      <w:rPr>
+        <w:rFonts w:ascii="Wingdings" w:hAnsi="Wingdings" w:hint="default"/>
+        <w:sz w:val="20"/>
+      </w:rPr>
+    </w:lvl>
+    <w:lvl w:ilvl="3" w:tentative="1">
+      <w:start w:val="1"/>
+      <w:numFmt w:val="bullet"/>
+      <w:lvlText w:val=""/>
+      <w:lvlJc w:val="left"/>
+      <w:pPr>
+        <w:tabs>
+          <w:tab w:val="num" w:pos="2880"/>
+        </w:tabs>
+        <w:ind w:left="2880" w:hanging="360"/>
+      </w:pPr>
+      <w:rPr>
+        <w:rFonts w:ascii="Wingdings" w:hAnsi="Wingdings" w:hint="default"/>
+        <w:sz w:val="20"/>
+      </w:rPr>
+    </w:lvl>
+    <w:lvl w:ilvl="4" w:tentative="1">
+      <w:start w:val="1"/>
+      <w:numFmt w:val="bullet"/>
+      <w:lvlText w:val=""/>
+      <w:lvlJc w:val="left"/>
+      <w:pPr>
+        <w:tabs>
+          <w:tab w:val="num" w:pos="3600"/>
+        </w:tabs>
+        <w:ind w:left="3600" w:hanging="360"/>
+      </w:pPr>
+      <w:rPr>
+        <w:rFonts w:ascii="Wingdings" w:hAnsi="Wingdings" w:hint="default"/>
+        <w:sz w:val="20"/>
+      </w:rPr>
+    </w:lvl>
+    <w:lvl w:ilvl="5" w:tentative="1">
+      <w:start w:val="1"/>
+      <w:numFmt w:val="bullet"/>
+      <w:lvlText w:val=""/>
+      <w:lvlJc w:val="left"/>
+      <w:pPr>
+        <w:tabs>
+          <w:tab w:val="num" w:pos="4320"/>
+        </w:tabs>
+        <w:ind w:left="4320" w:hanging="360"/>
+      </w:pPr>
+      <w:rPr>
+        <w:rFonts w:ascii="Wingdings" w:hAnsi="Wingdings" w:hint="default"/>
+        <w:sz w:val="20"/>
+      </w:rPr>
+    </w:lvl>
+    <w:lvl w:ilvl="6" w:tentative="1">
+      <w:start w:val="1"/>
+      <w:numFmt w:val="bullet"/>
+      <w:lvlText w:val=""/>
+      <w:lvlJc w:val="left"/>
+      <w:pPr>
+        <w:tabs>
+          <w:tab w:val="num" w:pos="5040"/>
+        </w:tabs>
+        <w:ind w:left="5040" w:hanging="360"/>
+      </w:pPr>
+      <w:rPr>
+        <w:rFonts w:ascii="Wingdings" w:hAnsi="Wingdings" w:hint="default"/>
+        <w:sz w:val="20"/>
+      </w:rPr>
+    </w:lvl>
+    <w:lvl w:ilvl="7" w:tentative="1">
+      <w:start w:val="1"/>
+      <w:numFmt w:val="bullet"/>
+      <w:lvlText w:val=""/>
+      <w:lvlJc w:val="left"/>
+      <w:pPr>
+        <w:tabs>
+          <w:tab w:val="num" w:pos="5760"/>
+        </w:tabs>
+        <w:ind w:left="5760" w:hanging="360"/>
+      </w:pPr>
+      <w:rPr>
+        <w:rFonts w:ascii="Wingdings" w:hAnsi="Wingdings" w:hint="default"/>
+        <w:sz w:val="20"/>
+      </w:rPr>
+    </w:lvl>
+    <w:lvl w:ilvl="8" w:tentative="1">
+      <w:start w:val="1"/>
+      <w:numFmt w:val="bullet"/>
+      <w:lvlText w:val=""/>
+      <w:lvlJc w:val="left"/>
+      <w:pPr>
+        <w:tabs>
+          <w:tab w:val="num" w:pos="6480"/>
+        </w:tabs>
+        <w:ind w:left="6480" w:hanging="360"/>
+      </w:pPr>
+      <w:rPr>
+        <w:rFonts w:ascii="Wingdings" w:hAnsi="Wingdings" w:hint="default"/>
+        <w:sz w:val="20"/>
+      </w:rPr>
+    </w:lvl>
+  </w:abstractNum>
+  <w:abstractNum w:abstractNumId="26" w15:restartNumberingAfterBreak="0">
     <w:nsid w:val="7E332F1E"/>
     <w:multiLevelType w:val="multilevel"/>
     <w:tmpl w:val="78B2A5CA"/>
@@ -5196,70 +6732,85 @@
     </w:lvl>
   </w:abstractNum>
   <w:num w:numId="1" w16cid:durableId="1522089459">
+    <w:abstractNumId w:val="22"/>
+  </w:num>
+  <w:num w:numId="2" w16cid:durableId="157892521">
+    <w:abstractNumId w:val="15"/>
+  </w:num>
+  <w:num w:numId="3" w16cid:durableId="734739344">
+    <w:abstractNumId w:val="23"/>
+  </w:num>
+  <w:num w:numId="4" w16cid:durableId="825899193">
+    <w:abstractNumId w:val="19"/>
+  </w:num>
+  <w:num w:numId="5" w16cid:durableId="301623460">
+    <w:abstractNumId w:val="21"/>
+  </w:num>
+  <w:num w:numId="6" w16cid:durableId="888882968">
+    <w:abstractNumId w:val="9"/>
+  </w:num>
+  <w:num w:numId="7" w16cid:durableId="254411730">
+    <w:abstractNumId w:val="6"/>
+  </w:num>
+  <w:num w:numId="8" w16cid:durableId="1114400758">
+    <w:abstractNumId w:val="14"/>
+  </w:num>
+  <w:num w:numId="9" w16cid:durableId="762071803">
+    <w:abstractNumId w:val="24"/>
+  </w:num>
+  <w:num w:numId="10" w16cid:durableId="1406488075">
+    <w:abstractNumId w:val="26"/>
+  </w:num>
+  <w:num w:numId="11" w16cid:durableId="1563953082">
+    <w:abstractNumId w:val="20"/>
+  </w:num>
+  <w:num w:numId="12" w16cid:durableId="1231573415">
+    <w:abstractNumId w:val="4"/>
+  </w:num>
+  <w:num w:numId="13" w16cid:durableId="553128695">
+    <w:abstractNumId w:val="13"/>
+  </w:num>
+  <w:num w:numId="14" w16cid:durableId="888225729">
+    <w:abstractNumId w:val="17"/>
+  </w:num>
+  <w:num w:numId="15" w16cid:durableId="106195725">
+    <w:abstractNumId w:val="2"/>
+  </w:num>
+  <w:num w:numId="16" w16cid:durableId="1027947404">
+    <w:abstractNumId w:val="5"/>
+  </w:num>
+  <w:num w:numId="17" w16cid:durableId="453790561">
+    <w:abstractNumId w:val="7"/>
+  </w:num>
+  <w:num w:numId="18" w16cid:durableId="916980713">
+    <w:abstractNumId w:val="1"/>
+  </w:num>
+  <w:num w:numId="19" w16cid:durableId="263463952">
+    <w:abstractNumId w:val="3"/>
+  </w:num>
+  <w:num w:numId="20" w16cid:durableId="1445266576">
+    <w:abstractNumId w:val="8"/>
+  </w:num>
+  <w:num w:numId="21" w16cid:durableId="1476218469">
+    <w:abstractNumId w:val="16"/>
+  </w:num>
+  <w:num w:numId="22" w16cid:durableId="1529291174">
+    <w:abstractNumId w:val="10"/>
+  </w:num>
+  <w:num w:numId="23" w16cid:durableId="1767843206">
     <w:abstractNumId w:val="18"/>
   </w:num>
-  <w:num w:numId="2" w16cid:durableId="157892521">
-    <w:abstractNumId w:val="12"/>
-  </w:num>
-  <w:num w:numId="3" w16cid:durableId="734739344">
-    <w:abstractNumId w:val="19"/>
-  </w:num>
-  <w:num w:numId="4" w16cid:durableId="825899193">
-    <w:abstractNumId w:val="15"/>
-  </w:num>
-  <w:num w:numId="5" w16cid:durableId="301623460">
-    <w:abstractNumId w:val="17"/>
-  </w:num>
-  <w:num w:numId="6" w16cid:durableId="888882968">
-    <w:abstractNumId w:val="8"/>
-  </w:num>
-  <w:num w:numId="7" w16cid:durableId="254411730">
-    <w:abstractNumId w:val="5"/>
-  </w:num>
-  <w:num w:numId="8" w16cid:durableId="1114400758">
+  <w:num w:numId="24" w16cid:durableId="1984919920">
     <w:abstractNumId w:val="11"/>
   </w:num>
-  <w:num w:numId="9" w16cid:durableId="762071803">
-    <w:abstractNumId w:val="20"/>
+  <w:num w:numId="25" w16cid:durableId="601110301">
+    <w:abstractNumId w:val="25"/>
   </w:num>
-  <w:num w:numId="10" w16cid:durableId="1406488075">
-    <w:abstractNumId w:val="21"/>
-  </w:num>
-  <w:num w:numId="11" w16cid:durableId="1563953082">
-    <w:abstractNumId w:val="16"/>
-  </w:num>
-  <w:num w:numId="12" w16cid:durableId="1231573415">
-    <w:abstractNumId w:val="3"/>
-  </w:num>
-  <w:num w:numId="13" w16cid:durableId="553128695">
-    <w:abstractNumId w:val="10"/>
-  </w:num>
-  <w:num w:numId="14" w16cid:durableId="888225729">
-    <w:abstractNumId w:val="14"/>
-  </w:num>
-  <w:num w:numId="15" w16cid:durableId="106195725">
-    <w:abstractNumId w:val="1"/>
-  </w:num>
-  <w:num w:numId="16" w16cid:durableId="1027947404">
-    <w:abstractNumId w:val="4"/>
-  </w:num>
-  <w:num w:numId="17" w16cid:durableId="453790561">
-    <w:abstractNumId w:val="6"/>
-  </w:num>
-  <w:num w:numId="18" w16cid:durableId="916980713">
+  <w:num w:numId="26" w16cid:durableId="1447501890">
     <w:abstractNumId w:val="0"/>
   </w:num>
-  <w:num w:numId="19" w16cid:durableId="263463952">
-    <w:abstractNumId w:val="2"/>
-  </w:num>
-  <w:num w:numId="20" w16cid:durableId="1445266576">
-    <w:abstractNumId w:val="7"/>
-  </w:num>
-  <w:num w:numId="21" w16cid:durableId="1476218469">
-    <w:abstractNumId w:val="13"/>
-  </w:num>
-  <w:num w:numId="22" w16cid:durableId="1529291174">
-    <w:abstractNumId w:val="9"/>
+  <w:num w:numId="27" w16cid:durableId="389118683">
+    <w:abstractNumId w:val="12"/>
   </w:num>
 </w:numbering>
 </file>

</xml_diff>

<commit_message>
LogSmith - v1.9.2 - emit() performance - FileHandlerRegistry - register/unregister log file
</commit_message>
<xml_diff>
--- a/tests/testing_strategy.docx
+++ b/tests/testing_strategy.docx
@@ -3034,6 +3034,2062 @@
           <w:bCs/>
         </w:rPr>
         <w:t>Just tell me which cluster you want to tackle first, and I’ll produce the tests.</w:t>
+      </w:r>
+    </w:p>
+    <w:p>
+      <w:pPr>
+        <w:bidi w:val="0"/>
+      </w:pPr>
+      <w:r>
+        <w:br w:type="page"/>
+      </w:r>
+    </w:p>
+    <w:p>
+      <w:pPr>
+        <w:bidi w:val="0"/>
+      </w:pPr>
+      <w:r>
+        <w:lastRenderedPageBreak/>
+        <w:br w:type="page"/>
+      </w:r>
+    </w:p>
+    <w:p>
+      <w:pPr>
+        <w:bidi w:val="0"/>
+        <w:spacing w:after="0" w:line="240" w:lineRule="auto"/>
+      </w:pPr>
+    </w:p>
+    <w:p>
+      <w:pPr>
+        <w:bidi w:val="0"/>
+        <w:spacing w:after="0" w:line="240" w:lineRule="auto"/>
+        <w:rPr>
+          <w:b/>
+          <w:bCs/>
+        </w:rPr>
+      </w:pPr>
+      <w:r>
+        <w:rPr>
+          <w:b/>
+          <w:bCs/>
+        </w:rPr>
+        <w:t xml:space="preserve">Step 1: Move handler creation out of </w:t>
+      </w:r>
+      <w:proofErr w:type="spellStart"/>
+      <w:r>
+        <w:rPr>
+          <w:b/>
+          <w:bCs/>
+        </w:rPr>
+        <w:t>RotationLogic</w:t>
+      </w:r>
+      <w:proofErr w:type="spellEnd"/>
+      <w:r>
+        <w:rPr>
+          <w:b/>
+          <w:bCs/>
+        </w:rPr>
+        <w:t xml:space="preserve"> (no behavior change)</w:t>
+      </w:r>
+    </w:p>
+    <w:p>
+      <w:pPr>
+        <w:bidi w:val="0"/>
+        <w:spacing w:after="0" w:line="240" w:lineRule="auto"/>
+      </w:pPr>
+      <w:r>
+        <w:rPr>
+          <w:b/>
+          <w:bCs/>
+        </w:rPr>
+        <w:t>Goal:</w:t>
+      </w:r>
+      <w:r>
+        <w:t xml:space="preserve"> </w:t>
+      </w:r>
+      <w:proofErr w:type="spellStart"/>
+      <w:r>
+        <w:t>SmartLogger</w:t>
+      </w:r>
+      <w:proofErr w:type="spellEnd"/>
+      <w:r>
+        <w:t xml:space="preserve"> creates the sync handler directly; </w:t>
+      </w:r>
+      <w:proofErr w:type="spellStart"/>
+      <w:r>
+        <w:t>RotationLogic</w:t>
+      </w:r>
+      <w:proofErr w:type="spellEnd"/>
+      <w:r>
+        <w:t xml:space="preserve"> becomes pure config, but we don’t delete anything yet.</w:t>
+      </w:r>
+    </w:p>
+    <w:p>
+      <w:pPr>
+        <w:numPr>
+          <w:ilvl w:val="0"/>
+          <w:numId w:val="39"/>
+        </w:numPr>
+        <w:bidi w:val="0"/>
+        <w:spacing w:after="0" w:line="240" w:lineRule="auto"/>
+      </w:pPr>
+      <w:r>
+        <w:rPr>
+          <w:b/>
+          <w:bCs/>
+        </w:rPr>
+        <w:t xml:space="preserve">Add a new internal helper in </w:t>
+      </w:r>
+      <w:proofErr w:type="spellStart"/>
+      <w:r>
+        <w:rPr>
+          <w:b/>
+          <w:bCs/>
+        </w:rPr>
+        <w:t>SmartLogger</w:t>
+      </w:r>
+      <w:proofErr w:type="spellEnd"/>
+      <w:r>
+        <w:t xml:space="preserve"> (but keep using </w:t>
+      </w:r>
+      <w:proofErr w:type="spellStart"/>
+      <w:r>
+        <w:t>RotationLogic.create_handler</w:t>
+      </w:r>
+      <w:proofErr w:type="spellEnd"/>
+      <w:r>
+        <w:t xml:space="preserve"> for now):</w:t>
+      </w:r>
+    </w:p>
+    <w:p>
+      <w:pPr>
+        <w:bidi w:val="0"/>
+        <w:spacing w:after="0" w:line="240" w:lineRule="auto"/>
+      </w:pPr>
+      <w:r>
+        <w:t>python</w:t>
+      </w:r>
+    </w:p>
+    <w:p>
+      <w:pPr>
+        <w:bidi w:val="0"/>
+        <w:spacing w:after="0" w:line="240" w:lineRule="auto"/>
+      </w:pPr>
+      <w:r>
+        <w:t>def _</w:t>
+      </w:r>
+      <w:proofErr w:type="spellStart"/>
+      <w:r>
+        <w:t>create_sync_</w:t>
+      </w:r>
+      <w:proofErr w:type="gramStart"/>
+      <w:r>
+        <w:t>handler</w:t>
+      </w:r>
+      <w:proofErr w:type="spellEnd"/>
+      <w:r>
+        <w:t>(</w:t>
+      </w:r>
+      <w:proofErr w:type="gramEnd"/>
+      <w:r>
+        <w:t xml:space="preserve">self, </w:t>
+      </w:r>
+      <w:proofErr w:type="spellStart"/>
+      <w:r>
+        <w:t>rotation_logic</w:t>
+      </w:r>
+      <w:proofErr w:type="spellEnd"/>
+      <w:r>
+        <w:t>, **</w:t>
+      </w:r>
+      <w:proofErr w:type="spellStart"/>
+      <w:r>
+        <w:t>kwargs</w:t>
+      </w:r>
+      <w:proofErr w:type="spellEnd"/>
+      <w:r>
+        <w:t>):</w:t>
+      </w:r>
+    </w:p>
+    <w:p>
+      <w:pPr>
+        <w:bidi w:val="0"/>
+        <w:spacing w:after="0" w:line="240" w:lineRule="auto"/>
+      </w:pPr>
+      <w:r>
+        <w:t xml:space="preserve">    return </w:t>
+      </w:r>
+      <w:proofErr w:type="spellStart"/>
+      <w:proofErr w:type="gramStart"/>
+      <w:r>
+        <w:t>ConcurrentTimedSizedRotatingFileHandler</w:t>
+      </w:r>
+      <w:proofErr w:type="spellEnd"/>
+      <w:r>
+        <w:t>(</w:t>
+      </w:r>
+      <w:proofErr w:type="gramEnd"/>
+    </w:p>
+    <w:p>
+      <w:pPr>
+        <w:bidi w:val="0"/>
+        <w:spacing w:after="0" w:line="240" w:lineRule="auto"/>
+      </w:pPr>
+      <w:r>
+        <w:t xml:space="preserve">        filename=...,</w:t>
+      </w:r>
+    </w:p>
+    <w:p>
+      <w:pPr>
+        <w:bidi w:val="0"/>
+        <w:spacing w:after="0" w:line="240" w:lineRule="auto"/>
+      </w:pPr>
+      <w:r>
+        <w:t xml:space="preserve">        </w:t>
+      </w:r>
+      <w:proofErr w:type="spellStart"/>
+      <w:r>
+        <w:t>rotation_logic</w:t>
+      </w:r>
+      <w:proofErr w:type="spellEnd"/>
+      <w:r>
+        <w:t>=</w:t>
+      </w:r>
+      <w:proofErr w:type="spellStart"/>
+      <w:r>
+        <w:t>rotation_logic</w:t>
+      </w:r>
+      <w:proofErr w:type="spellEnd"/>
+      <w:r>
+        <w:t>,</w:t>
+      </w:r>
+    </w:p>
+    <w:p>
+      <w:pPr>
+        <w:bidi w:val="0"/>
+        <w:spacing w:after="0" w:line="240" w:lineRule="auto"/>
+      </w:pPr>
+      <w:r>
+        <w:t xml:space="preserve">        **</w:t>
+      </w:r>
+      <w:proofErr w:type="spellStart"/>
+      <w:r>
+        <w:t>kwargs</w:t>
+      </w:r>
+      <w:proofErr w:type="spellEnd"/>
+      <w:r>
+        <w:t>,</w:t>
+      </w:r>
+    </w:p>
+    <w:p>
+      <w:pPr>
+        <w:bidi w:val="0"/>
+        <w:spacing w:after="0" w:line="240" w:lineRule="auto"/>
+      </w:pPr>
+      <w:r>
+        <w:t xml:space="preserve">    )</w:t>
+      </w:r>
+    </w:p>
+    <w:p>
+      <w:pPr>
+        <w:numPr>
+          <w:ilvl w:val="0"/>
+          <w:numId w:val="39"/>
+        </w:numPr>
+        <w:bidi w:val="0"/>
+        <w:spacing w:after="0" w:line="240" w:lineRule="auto"/>
+      </w:pPr>
+      <w:r>
+        <w:rPr>
+          <w:b/>
+          <w:bCs/>
+        </w:rPr>
+        <w:t xml:space="preserve">Temporarily keep </w:t>
+      </w:r>
+      <w:proofErr w:type="spellStart"/>
+      <w:r>
+        <w:rPr>
+          <w:b/>
+          <w:bCs/>
+        </w:rPr>
+        <w:t>RotationLogic.create_handler</w:t>
+      </w:r>
+      <w:proofErr w:type="spellEnd"/>
+      <w:r>
+        <w:t xml:space="preserve"> as a thin wrapper that calls this helper (to avoid breaking anything):</w:t>
+      </w:r>
+    </w:p>
+    <w:p>
+      <w:pPr>
+        <w:bidi w:val="0"/>
+        <w:spacing w:after="0" w:line="240" w:lineRule="auto"/>
+      </w:pPr>
+      <w:r>
+        <w:t>python</w:t>
+      </w:r>
+    </w:p>
+    <w:p>
+      <w:pPr>
+        <w:bidi w:val="0"/>
+        <w:spacing w:after="0" w:line="240" w:lineRule="auto"/>
+      </w:pPr>
+      <w:r>
+        <w:t xml:space="preserve">def </w:t>
+      </w:r>
+      <w:proofErr w:type="spellStart"/>
+      <w:r>
+        <w:t>create_</w:t>
+      </w:r>
+      <w:proofErr w:type="gramStart"/>
+      <w:r>
+        <w:t>handler</w:t>
+      </w:r>
+      <w:proofErr w:type="spellEnd"/>
+      <w:r>
+        <w:t>(</w:t>
+      </w:r>
+      <w:proofErr w:type="gramEnd"/>
+      <w:r>
+        <w:t>self, **</w:t>
+      </w:r>
+      <w:proofErr w:type="spellStart"/>
+      <w:r>
+        <w:t>kwargs</w:t>
+      </w:r>
+      <w:proofErr w:type="spellEnd"/>
+      <w:r>
+        <w:t>):</w:t>
+      </w:r>
+    </w:p>
+    <w:p>
+      <w:pPr>
+        <w:bidi w:val="0"/>
+        <w:spacing w:after="0" w:line="240" w:lineRule="auto"/>
+      </w:pPr>
+      <w:r>
+        <w:t xml:space="preserve">    return </w:t>
+      </w:r>
+      <w:proofErr w:type="spellStart"/>
+      <w:proofErr w:type="gramStart"/>
+      <w:r>
+        <w:t>ConcurrentTimedSizedRotatingFileHandler</w:t>
+      </w:r>
+      <w:proofErr w:type="spellEnd"/>
+      <w:r>
+        <w:t>(</w:t>
+      </w:r>
+      <w:proofErr w:type="gramEnd"/>
+    </w:p>
+    <w:p>
+      <w:pPr>
+        <w:bidi w:val="0"/>
+        <w:spacing w:after="0" w:line="240" w:lineRule="auto"/>
+      </w:pPr>
+      <w:r>
+        <w:t xml:space="preserve">        filename=...,</w:t>
+      </w:r>
+    </w:p>
+    <w:p>
+      <w:pPr>
+        <w:bidi w:val="0"/>
+        <w:spacing w:after="0" w:line="240" w:lineRule="auto"/>
+      </w:pPr>
+      <w:r>
+        <w:t xml:space="preserve">        </w:t>
+      </w:r>
+      <w:proofErr w:type="spellStart"/>
+      <w:r>
+        <w:t>rotation_logic</w:t>
+      </w:r>
+      <w:proofErr w:type="spellEnd"/>
+      <w:r>
+        <w:t>=self,</w:t>
+      </w:r>
+    </w:p>
+    <w:p>
+      <w:pPr>
+        <w:bidi w:val="0"/>
+        <w:spacing w:after="0" w:line="240" w:lineRule="auto"/>
+      </w:pPr>
+      <w:r>
+        <w:t xml:space="preserve">        **</w:t>
+      </w:r>
+      <w:proofErr w:type="spellStart"/>
+      <w:r>
+        <w:t>kwargs</w:t>
+      </w:r>
+      <w:proofErr w:type="spellEnd"/>
+      <w:r>
+        <w:t>,</w:t>
+      </w:r>
+    </w:p>
+    <w:p>
+      <w:pPr>
+        <w:bidi w:val="0"/>
+        <w:spacing w:after="0" w:line="240" w:lineRule="auto"/>
+      </w:pPr>
+      <w:r>
+        <w:t xml:space="preserve">    )</w:t>
+      </w:r>
+    </w:p>
+    <w:p>
+      <w:pPr>
+        <w:numPr>
+          <w:ilvl w:val="0"/>
+          <w:numId w:val="39"/>
+        </w:numPr>
+        <w:bidi w:val="0"/>
+        <w:spacing w:after="0" w:line="240" w:lineRule="auto"/>
+      </w:pPr>
+      <w:r>
+        <w:t>Run tests — behavior should be unchanged.</w:t>
+      </w:r>
+    </w:p>
+    <w:p>
+      <w:pPr>
+        <w:bidi w:val="0"/>
+        <w:spacing w:after="0" w:line="240" w:lineRule="auto"/>
+      </w:pPr>
+      <w:r>
+        <w:t xml:space="preserve">This step is mostly about </w:t>
+      </w:r>
+      <w:r>
+        <w:rPr>
+          <w:b/>
+          <w:bCs/>
+        </w:rPr>
+        <w:t>preparing your mental model</w:t>
+      </w:r>
+      <w:r>
+        <w:t xml:space="preserve"> and isolating handler creation.</w:t>
+      </w:r>
+    </w:p>
+    <w:p>
+      <w:pPr>
+        <w:bidi w:val="0"/>
+        <w:spacing w:after="0" w:line="240" w:lineRule="auto"/>
+        <w:rPr>
+          <w:b/>
+          <w:bCs/>
+        </w:rPr>
+      </w:pPr>
+      <w:r>
+        <w:rPr>
+          <w:b/>
+          <w:bCs/>
+        </w:rPr>
+        <w:t xml:space="preserve">Step 2: Switch </w:t>
+      </w:r>
+      <w:proofErr w:type="spellStart"/>
+      <w:r>
+        <w:rPr>
+          <w:b/>
+          <w:bCs/>
+        </w:rPr>
+        <w:t>SmartLogger</w:t>
+      </w:r>
+      <w:proofErr w:type="spellEnd"/>
+      <w:r>
+        <w:rPr>
+          <w:b/>
+          <w:bCs/>
+        </w:rPr>
+        <w:t xml:space="preserve"> to construct the handler directly</w:t>
+      </w:r>
+    </w:p>
+    <w:p>
+      <w:pPr>
+        <w:bidi w:val="0"/>
+        <w:spacing w:after="0" w:line="240" w:lineRule="auto"/>
+      </w:pPr>
+      <w:r>
+        <w:rPr>
+          <w:b/>
+          <w:bCs/>
+        </w:rPr>
+        <w:t>Goal:</w:t>
+      </w:r>
+      <w:r>
+        <w:t xml:space="preserve"> </w:t>
+      </w:r>
+      <w:proofErr w:type="spellStart"/>
+      <w:r>
+        <w:t>SmartLogger</w:t>
+      </w:r>
+      <w:proofErr w:type="spellEnd"/>
+      <w:r>
+        <w:t xml:space="preserve"> stops calling </w:t>
+      </w:r>
+      <w:proofErr w:type="spellStart"/>
+      <w:r>
+        <w:t>RotationLogic.create_handler</w:t>
+      </w:r>
+      <w:proofErr w:type="spellEnd"/>
+      <w:r>
+        <w:t>.</w:t>
+      </w:r>
+    </w:p>
+    <w:p>
+      <w:pPr>
+        <w:numPr>
+          <w:ilvl w:val="0"/>
+          <w:numId w:val="40"/>
+        </w:numPr>
+        <w:bidi w:val="0"/>
+        <w:spacing w:after="0" w:line="240" w:lineRule="auto"/>
+      </w:pPr>
+      <w:r>
+        <w:t xml:space="preserve">In </w:t>
+      </w:r>
+      <w:proofErr w:type="spellStart"/>
+      <w:r>
+        <w:t>SmartLogger.add_file</w:t>
+      </w:r>
+      <w:proofErr w:type="spellEnd"/>
+      <w:r>
+        <w:t>, replace:</w:t>
+      </w:r>
+    </w:p>
+    <w:p>
+      <w:pPr>
+        <w:bidi w:val="0"/>
+        <w:spacing w:after="0" w:line="240" w:lineRule="auto"/>
+      </w:pPr>
+      <w:r>
+        <w:t>python</w:t>
+      </w:r>
+    </w:p>
+    <w:p>
+      <w:pPr>
+        <w:bidi w:val="0"/>
+        <w:spacing w:after="0" w:line="240" w:lineRule="auto"/>
+      </w:pPr>
+      <w:r>
+        <w:t xml:space="preserve">handler = </w:t>
+      </w:r>
+      <w:proofErr w:type="spellStart"/>
+      <w:r>
+        <w:t>rotation_</w:t>
+      </w:r>
+      <w:proofErr w:type="gramStart"/>
+      <w:r>
+        <w:t>logic.create</w:t>
+      </w:r>
+      <w:proofErr w:type="gramEnd"/>
+      <w:r>
+        <w:t>_handler</w:t>
+      </w:r>
+      <w:proofErr w:type="spellEnd"/>
+      <w:r>
+        <w:t>(...)</w:t>
+      </w:r>
+    </w:p>
+    <w:p>
+      <w:pPr>
+        <w:bidi w:val="0"/>
+        <w:spacing w:after="0" w:line="240" w:lineRule="auto"/>
+      </w:pPr>
+      <w:r>
+        <w:t>with:</w:t>
+      </w:r>
+    </w:p>
+    <w:p>
+      <w:pPr>
+        <w:bidi w:val="0"/>
+        <w:spacing w:after="0" w:line="240" w:lineRule="auto"/>
+      </w:pPr>
+      <w:r>
+        <w:t>python</w:t>
+      </w:r>
+    </w:p>
+    <w:p>
+      <w:pPr>
+        <w:bidi w:val="0"/>
+        <w:spacing w:after="0" w:line="240" w:lineRule="auto"/>
+      </w:pPr>
+      <w:r>
+        <w:t xml:space="preserve">handler = </w:t>
+      </w:r>
+      <w:proofErr w:type="spellStart"/>
+      <w:proofErr w:type="gramStart"/>
+      <w:r>
+        <w:t>ConcurrentTimedSizedRotatingFileHandler</w:t>
+      </w:r>
+      <w:proofErr w:type="spellEnd"/>
+      <w:r>
+        <w:t>(</w:t>
+      </w:r>
+      <w:proofErr w:type="gramEnd"/>
+    </w:p>
+    <w:p>
+      <w:pPr>
+        <w:bidi w:val="0"/>
+        <w:spacing w:after="0" w:line="240" w:lineRule="auto"/>
+      </w:pPr>
+      <w:r>
+        <w:t xml:space="preserve">    filename=...,</w:t>
+      </w:r>
+    </w:p>
+    <w:p>
+      <w:pPr>
+        <w:bidi w:val="0"/>
+        <w:spacing w:after="0" w:line="240" w:lineRule="auto"/>
+      </w:pPr>
+      <w:r>
+        <w:t xml:space="preserve">    </w:t>
+      </w:r>
+      <w:proofErr w:type="spellStart"/>
+      <w:r>
+        <w:t>rotation_logic</w:t>
+      </w:r>
+      <w:proofErr w:type="spellEnd"/>
+      <w:r>
+        <w:t>=</w:t>
+      </w:r>
+      <w:proofErr w:type="spellStart"/>
+      <w:r>
+        <w:t>rotation_logic</w:t>
+      </w:r>
+      <w:proofErr w:type="spellEnd"/>
+      <w:r>
+        <w:t>,</w:t>
+      </w:r>
+    </w:p>
+    <w:p>
+      <w:pPr>
+        <w:bidi w:val="0"/>
+        <w:spacing w:after="0" w:line="240" w:lineRule="auto"/>
+      </w:pPr>
+      <w:r>
+        <w:t xml:space="preserve">    ...</w:t>
+      </w:r>
+    </w:p>
+    <w:p>
+      <w:pPr>
+        <w:bidi w:val="0"/>
+        <w:spacing w:after="0" w:line="240" w:lineRule="auto"/>
+      </w:pPr>
+      <w:r>
+        <w:t>)</w:t>
+      </w:r>
+    </w:p>
+    <w:p>
+      <w:pPr>
+        <w:numPr>
+          <w:ilvl w:val="0"/>
+          <w:numId w:val="40"/>
+        </w:numPr>
+        <w:bidi w:val="0"/>
+        <w:spacing w:after="0" w:line="240" w:lineRule="auto"/>
+      </w:pPr>
+      <w:r>
+        <w:t xml:space="preserve">Keep </w:t>
+      </w:r>
+      <w:proofErr w:type="spellStart"/>
+      <w:r>
+        <w:t>RotationLogic.create_handler</w:t>
+      </w:r>
+      <w:proofErr w:type="spellEnd"/>
+      <w:r>
+        <w:t xml:space="preserve"> around for now (dead but harmless).</w:t>
+      </w:r>
+    </w:p>
+    <w:p>
+      <w:pPr>
+        <w:numPr>
+          <w:ilvl w:val="0"/>
+          <w:numId w:val="40"/>
+        </w:numPr>
+        <w:bidi w:val="0"/>
+        <w:spacing w:after="0" w:line="240" w:lineRule="auto"/>
+      </w:pPr>
+      <w:r>
+        <w:t>Run tests — still no behavior change.</w:t>
+      </w:r>
+    </w:p>
+    <w:p>
+      <w:pPr>
+        <w:bidi w:val="0"/>
+        <w:spacing w:after="0" w:line="240" w:lineRule="auto"/>
+      </w:pPr>
+      <w:r>
+        <w:t xml:space="preserve">Now the </w:t>
+      </w:r>
+      <w:r>
+        <w:rPr>
+          <w:b/>
+          <w:bCs/>
+        </w:rPr>
+        <w:t>truth</w:t>
+      </w:r>
+      <w:r>
+        <w:t xml:space="preserve"> is: handlers are created by loggers, not by </w:t>
+      </w:r>
+      <w:proofErr w:type="spellStart"/>
+      <w:r>
+        <w:t>RotationLogic</w:t>
+      </w:r>
+      <w:proofErr w:type="spellEnd"/>
+      <w:r>
+        <w:t>.</w:t>
+      </w:r>
+    </w:p>
+    <w:p>
+      <w:pPr>
+        <w:bidi w:val="0"/>
+        <w:spacing w:after="0" w:line="240" w:lineRule="auto"/>
+        <w:rPr>
+          <w:b/>
+          <w:bCs/>
+        </w:rPr>
+      </w:pPr>
+      <w:r>
+        <w:rPr>
+          <w:b/>
+          <w:bCs/>
+        </w:rPr>
+        <w:t xml:space="preserve">Step 3: Introduce </w:t>
+      </w:r>
+      <w:proofErr w:type="spellStart"/>
+      <w:r>
+        <w:rPr>
+          <w:b/>
+          <w:bCs/>
+        </w:rPr>
+        <w:t>BaseTimedSizedRotatingFileHandler</w:t>
+      </w:r>
+      <w:proofErr w:type="spellEnd"/>
+      <w:r>
+        <w:rPr>
+          <w:b/>
+          <w:bCs/>
+        </w:rPr>
+        <w:t xml:space="preserve"> (no behavior </w:t>
+      </w:r>
+      <w:proofErr w:type="gramStart"/>
+      <w:r>
+        <w:rPr>
+          <w:b/>
+          <w:bCs/>
+        </w:rPr>
+        <w:t>change</w:t>
+      </w:r>
+      <w:proofErr w:type="gramEnd"/>
+      <w:r>
+        <w:rPr>
+          <w:b/>
+          <w:bCs/>
+        </w:rPr>
+        <w:t xml:space="preserve"> yet)</w:t>
+      </w:r>
+    </w:p>
+    <w:p>
+      <w:pPr>
+        <w:bidi w:val="0"/>
+        <w:spacing w:after="0" w:line="240" w:lineRule="auto"/>
+      </w:pPr>
+      <w:r>
+        <w:rPr>
+          <w:b/>
+          <w:bCs/>
+        </w:rPr>
+        <w:t>Goal:</w:t>
+      </w:r>
+      <w:r>
+        <w:t xml:space="preserve"> Create the base class, but don’t change behavior.</w:t>
+      </w:r>
+    </w:p>
+    <w:p>
+      <w:pPr>
+        <w:numPr>
+          <w:ilvl w:val="0"/>
+          <w:numId w:val="41"/>
+        </w:numPr>
+        <w:bidi w:val="0"/>
+        <w:spacing w:after="0" w:line="240" w:lineRule="auto"/>
+      </w:pPr>
+      <w:r>
+        <w:t xml:space="preserve">Create </w:t>
+      </w:r>
+      <w:proofErr w:type="spellStart"/>
+      <w:r>
+        <w:t>BaseTimedSizedRotatingFileHandler</w:t>
+      </w:r>
+      <w:proofErr w:type="spellEnd"/>
+      <w:r>
+        <w:t xml:space="preserve"> with:</w:t>
+      </w:r>
+    </w:p>
+    <w:p>
+      <w:pPr>
+        <w:numPr>
+          <w:ilvl w:val="1"/>
+          <w:numId w:val="41"/>
+        </w:numPr>
+        <w:bidi w:val="0"/>
+        <w:spacing w:after="0" w:line="240" w:lineRule="auto"/>
+      </w:pPr>
+      <w:r>
+        <w:t xml:space="preserve">constructor signature matching </w:t>
+      </w:r>
+      <w:proofErr w:type="spellStart"/>
+      <w:r>
+        <w:t>ConcurrentTimedSizedRotatingFileHandler</w:t>
+      </w:r>
+      <w:proofErr w:type="spellEnd"/>
+    </w:p>
+    <w:p>
+      <w:pPr>
+        <w:numPr>
+          <w:ilvl w:val="1"/>
+          <w:numId w:val="41"/>
+        </w:numPr>
+        <w:bidi w:val="0"/>
+        <w:spacing w:after="0" w:line="240" w:lineRule="auto"/>
+      </w:pPr>
+      <w:r>
+        <w:t xml:space="preserve">shared fields: </w:t>
+      </w:r>
+      <w:proofErr w:type="spellStart"/>
+      <w:r>
+        <w:t>max_bytes</w:t>
+      </w:r>
+      <w:proofErr w:type="spellEnd"/>
+      <w:r>
+        <w:t xml:space="preserve">, </w:t>
+      </w:r>
+      <w:proofErr w:type="spellStart"/>
+      <w:r>
+        <w:t>backup_count</w:t>
+      </w:r>
+      <w:proofErr w:type="spellEnd"/>
+      <w:r>
+        <w:t xml:space="preserve">, </w:t>
+      </w:r>
+      <w:proofErr w:type="spellStart"/>
+      <w:r>
+        <w:t>large_entry_behavior</w:t>
+      </w:r>
+      <w:proofErr w:type="spellEnd"/>
+      <w:r>
+        <w:t>, etc.</w:t>
+      </w:r>
+    </w:p>
+    <w:p>
+      <w:pPr>
+        <w:numPr>
+          <w:ilvl w:val="1"/>
+          <w:numId w:val="41"/>
+        </w:numPr>
+        <w:bidi w:val="0"/>
+        <w:spacing w:after="0" w:line="240" w:lineRule="auto"/>
+      </w:pPr>
+      <w:r>
+        <w:t>_</w:t>
+      </w:r>
+      <w:proofErr w:type="spellStart"/>
+      <w:r>
+        <w:t>handle_large_entry</w:t>
+      </w:r>
+      <w:proofErr w:type="spellEnd"/>
+      <w:r>
+        <w:t xml:space="preserve"> moved here (but you can keep the old one temporarily and delegate).</w:t>
+      </w:r>
+    </w:p>
+    <w:p>
+      <w:pPr>
+        <w:numPr>
+          <w:ilvl w:val="0"/>
+          <w:numId w:val="41"/>
+        </w:numPr>
+        <w:bidi w:val="0"/>
+        <w:spacing w:after="0" w:line="240" w:lineRule="auto"/>
+      </w:pPr>
+      <w:r>
+        <w:t xml:space="preserve">Make </w:t>
+      </w:r>
+      <w:proofErr w:type="spellStart"/>
+      <w:r>
+        <w:t>ConcurrentTimedSizedRotatingFileHandler</w:t>
+      </w:r>
+      <w:proofErr w:type="spellEnd"/>
+      <w:r>
+        <w:t xml:space="preserve"> extend the base class and call </w:t>
+      </w:r>
+      <w:proofErr w:type="gramStart"/>
+      <w:r>
+        <w:t>super()._</w:t>
+      </w:r>
+      <w:proofErr w:type="gramEnd"/>
+      <w:r>
+        <w:t>_</w:t>
+      </w:r>
+      <w:proofErr w:type="spellStart"/>
+      <w:r>
+        <w:t>init</w:t>
+      </w:r>
+      <w:proofErr w:type="spellEnd"/>
+      <w:r>
+        <w:t>__.</w:t>
+      </w:r>
+    </w:p>
+    <w:p>
+      <w:pPr>
+        <w:numPr>
+          <w:ilvl w:val="0"/>
+          <w:numId w:val="41"/>
+        </w:numPr>
+        <w:bidi w:val="0"/>
+        <w:spacing w:after="0" w:line="240" w:lineRule="auto"/>
+      </w:pPr>
+      <w:r>
+        <w:t xml:space="preserve">Keep </w:t>
+      </w:r>
+      <w:proofErr w:type="gramStart"/>
+      <w:r>
+        <w:t>its</w:t>
+      </w:r>
+      <w:proofErr w:type="gramEnd"/>
+      <w:r>
+        <w:t xml:space="preserve"> emit logic as</w:t>
+      </w:r>
+      <w:r>
+        <w:noBreakHyphen/>
+        <w:t>is, just calling _</w:t>
+      </w:r>
+      <w:proofErr w:type="spellStart"/>
+      <w:r>
+        <w:t>handle_large_entry</w:t>
+      </w:r>
+      <w:proofErr w:type="spellEnd"/>
+      <w:r>
+        <w:t xml:space="preserve"> from the base.</w:t>
+      </w:r>
+    </w:p>
+    <w:p>
+      <w:pPr>
+        <w:numPr>
+          <w:ilvl w:val="0"/>
+          <w:numId w:val="41"/>
+        </w:numPr>
+        <w:bidi w:val="0"/>
+        <w:spacing w:after="0" w:line="240" w:lineRule="auto"/>
+      </w:pPr>
+      <w:r>
+        <w:t>Run tests — behavior should be identical.</w:t>
+      </w:r>
+    </w:p>
+    <w:p>
+      <w:pPr>
+        <w:bidi w:val="0"/>
+        <w:spacing w:after="0" w:line="240" w:lineRule="auto"/>
+      </w:pPr>
+      <w:r>
+        <w:t xml:space="preserve">At this point, you’ve </w:t>
+      </w:r>
+      <w:r>
+        <w:rPr>
+          <w:b/>
+          <w:bCs/>
+        </w:rPr>
+        <w:t>centralized the logic</w:t>
+      </w:r>
+      <w:r>
+        <w:t xml:space="preserve"> without touching async yet.</w:t>
+      </w:r>
+    </w:p>
+    <w:p>
+      <w:pPr>
+        <w:bidi w:val="0"/>
+        <w:spacing w:after="0" w:line="240" w:lineRule="auto"/>
+        <w:rPr>
+          <w:b/>
+          <w:bCs/>
+        </w:rPr>
+      </w:pPr>
+      <w:r>
+        <w:rPr>
+          <w:b/>
+          <w:bCs/>
+        </w:rPr>
+        <w:t xml:space="preserve">Step 4: Align </w:t>
+      </w:r>
+      <w:proofErr w:type="spellStart"/>
+      <w:r>
+        <w:rPr>
+          <w:b/>
+          <w:bCs/>
+        </w:rPr>
+        <w:t>Async_TimedSizedRotatingFileHandler’s</w:t>
+      </w:r>
+      <w:proofErr w:type="spellEnd"/>
+      <w:r>
+        <w:rPr>
+          <w:b/>
+          <w:bCs/>
+        </w:rPr>
+        <w:t xml:space="preserve"> constructor (still no behavior change)</w:t>
+      </w:r>
+    </w:p>
+    <w:p>
+      <w:pPr>
+        <w:bidi w:val="0"/>
+        <w:spacing w:after="0" w:line="240" w:lineRule="auto"/>
+      </w:pPr>
+      <w:r>
+        <w:rPr>
+          <w:b/>
+          <w:bCs/>
+        </w:rPr>
+        <w:t>Goal:</w:t>
+      </w:r>
+      <w:r>
+        <w:t xml:space="preserve"> Make async handler’s constructor match the base class, but don’t change its behavior yet.</w:t>
+      </w:r>
+    </w:p>
+    <w:p>
+      <w:pPr>
+        <w:numPr>
+          <w:ilvl w:val="0"/>
+          <w:numId w:val="42"/>
+        </w:numPr>
+        <w:bidi w:val="0"/>
+        <w:spacing w:after="0" w:line="240" w:lineRule="auto"/>
+      </w:pPr>
+      <w:r>
+        <w:t>Change Async_</w:t>
+      </w:r>
+      <w:proofErr w:type="spellStart"/>
+      <w:proofErr w:type="gramStart"/>
+      <w:r>
+        <w:t>TimedSizedRotatingFileHandler</w:t>
+      </w:r>
+      <w:proofErr w:type="spellEnd"/>
+      <w:r>
+        <w:t>._</w:t>
+      </w:r>
+      <w:proofErr w:type="gramEnd"/>
+      <w:r>
+        <w:t>_</w:t>
+      </w:r>
+      <w:proofErr w:type="spellStart"/>
+      <w:r>
+        <w:t>init</w:t>
+      </w:r>
+      <w:proofErr w:type="spellEnd"/>
+      <w:r>
+        <w:t xml:space="preserve">__ signature to match the base class (accept </w:t>
+      </w:r>
+      <w:proofErr w:type="spellStart"/>
+      <w:r>
+        <w:t>rotation_logic</w:t>
+      </w:r>
+      <w:proofErr w:type="spellEnd"/>
+      <w:r>
+        <w:t xml:space="preserve"> or the same decomposed </w:t>
+      </w:r>
+      <w:proofErr w:type="spellStart"/>
+      <w:r>
+        <w:t>args</w:t>
+      </w:r>
+      <w:proofErr w:type="spellEnd"/>
+      <w:r>
+        <w:t>).</w:t>
+      </w:r>
+    </w:p>
+    <w:p>
+      <w:pPr>
+        <w:numPr>
+          <w:ilvl w:val="0"/>
+          <w:numId w:val="42"/>
+        </w:numPr>
+        <w:bidi w:val="0"/>
+        <w:spacing w:after="0" w:line="240" w:lineRule="auto"/>
+      </w:pPr>
+      <w:r>
+        <w:t xml:space="preserve">Make it call </w:t>
+      </w:r>
+      <w:proofErr w:type="gramStart"/>
+      <w:r>
+        <w:t>super()._</w:t>
+      </w:r>
+      <w:proofErr w:type="gramEnd"/>
+      <w:r>
+        <w:t>_</w:t>
+      </w:r>
+      <w:proofErr w:type="spellStart"/>
+      <w:r>
+        <w:t>init</w:t>
+      </w:r>
+      <w:proofErr w:type="spellEnd"/>
+      <w:r>
+        <w:t>__(...).</w:t>
+      </w:r>
+    </w:p>
+    <w:p>
+      <w:pPr>
+        <w:numPr>
+          <w:ilvl w:val="0"/>
+          <w:numId w:val="42"/>
+        </w:numPr>
+        <w:bidi w:val="0"/>
+        <w:spacing w:after="0" w:line="240" w:lineRule="auto"/>
+      </w:pPr>
+      <w:r>
+        <w:t>Keep its current emit/async behavior unchanged for now.</w:t>
+      </w:r>
+    </w:p>
+    <w:p>
+      <w:pPr>
+        <w:numPr>
+          <w:ilvl w:val="0"/>
+          <w:numId w:val="42"/>
+        </w:numPr>
+        <w:bidi w:val="0"/>
+        <w:spacing w:after="0" w:line="240" w:lineRule="auto"/>
+      </w:pPr>
+      <w:r>
+        <w:t>Run tests — async behavior should still be whatever it was before.</w:t>
+      </w:r>
+    </w:p>
+    <w:p>
+      <w:pPr>
+        <w:bidi w:val="0"/>
+        <w:spacing w:after="0" w:line="240" w:lineRule="auto"/>
+      </w:pPr>
+      <w:r>
+        <w:t xml:space="preserve">Now both handlers </w:t>
+      </w:r>
+      <w:r>
+        <w:rPr>
+          <w:b/>
+          <w:bCs/>
+        </w:rPr>
+        <w:t>share a shape</w:t>
+      </w:r>
+      <w:r>
+        <w:t>, but not yet the same behavior.</w:t>
+      </w:r>
+    </w:p>
+    <w:p>
+      <w:pPr>
+        <w:bidi w:val="0"/>
+        <w:spacing w:after="0" w:line="240" w:lineRule="auto"/>
+        <w:rPr>
+          <w:b/>
+          <w:bCs/>
+        </w:rPr>
+      </w:pPr>
+      <w:r>
+        <w:rPr>
+          <w:b/>
+          <w:bCs/>
+        </w:rPr>
+        <w:t xml:space="preserve">Step 5: Wire </w:t>
+      </w:r>
+      <w:proofErr w:type="spellStart"/>
+      <w:r>
+        <w:rPr>
+          <w:b/>
+          <w:bCs/>
+        </w:rPr>
+        <w:t>AsyncSmartLogger</w:t>
+      </w:r>
+      <w:proofErr w:type="spellEnd"/>
+      <w:r>
+        <w:rPr>
+          <w:b/>
+          <w:bCs/>
+        </w:rPr>
+        <w:t xml:space="preserve"> to use the new constructor</w:t>
+      </w:r>
+    </w:p>
+    <w:p>
+      <w:pPr>
+        <w:bidi w:val="0"/>
+        <w:spacing w:after="0" w:line="240" w:lineRule="auto"/>
+      </w:pPr>
+      <w:r>
+        <w:rPr>
+          <w:b/>
+          <w:bCs/>
+        </w:rPr>
+        <w:t>Goal:</w:t>
+      </w:r>
+      <w:r>
+        <w:t xml:space="preserve"> </w:t>
+      </w:r>
+      <w:proofErr w:type="spellStart"/>
+      <w:r>
+        <w:t>AsyncSmartLogger</w:t>
+      </w:r>
+      <w:proofErr w:type="spellEnd"/>
+      <w:r>
+        <w:t xml:space="preserve"> now constructs the async handler in the same way </w:t>
+      </w:r>
+      <w:proofErr w:type="spellStart"/>
+      <w:r>
+        <w:t>SmartLogger</w:t>
+      </w:r>
+      <w:proofErr w:type="spellEnd"/>
+      <w:r>
+        <w:t xml:space="preserve"> constructs the sync handler.</w:t>
+      </w:r>
+    </w:p>
+    <w:p>
+      <w:pPr>
+        <w:numPr>
+          <w:ilvl w:val="0"/>
+          <w:numId w:val="43"/>
+        </w:numPr>
+        <w:bidi w:val="0"/>
+        <w:spacing w:after="0" w:line="240" w:lineRule="auto"/>
+      </w:pPr>
+      <w:r>
+        <w:lastRenderedPageBreak/>
+        <w:t xml:space="preserve">In </w:t>
+      </w:r>
+      <w:proofErr w:type="spellStart"/>
+      <w:r>
+        <w:t>AsyncSmartLogger.add_file</w:t>
+      </w:r>
+      <w:proofErr w:type="spellEnd"/>
+      <w:r>
+        <w:t>, replace any ad</w:t>
+      </w:r>
+      <w:r>
+        <w:noBreakHyphen/>
+        <w:t>hoc construction with:</w:t>
+      </w:r>
+    </w:p>
+    <w:p>
+      <w:pPr>
+        <w:bidi w:val="0"/>
+        <w:spacing w:after="0" w:line="240" w:lineRule="auto"/>
+      </w:pPr>
+      <w:r>
+        <w:t>python</w:t>
+      </w:r>
+    </w:p>
+    <w:p>
+      <w:pPr>
+        <w:bidi w:val="0"/>
+        <w:spacing w:after="0" w:line="240" w:lineRule="auto"/>
+      </w:pPr>
+      <w:r>
+        <w:t xml:space="preserve">handler = </w:t>
+      </w:r>
+      <w:proofErr w:type="spellStart"/>
+      <w:r>
+        <w:t>Async_</w:t>
+      </w:r>
+      <w:proofErr w:type="gramStart"/>
+      <w:r>
+        <w:t>TimedSizedRotatingFileHandler</w:t>
+      </w:r>
+      <w:proofErr w:type="spellEnd"/>
+      <w:r>
+        <w:t>(</w:t>
+      </w:r>
+      <w:proofErr w:type="gramEnd"/>
+    </w:p>
+    <w:p>
+      <w:pPr>
+        <w:bidi w:val="0"/>
+        <w:spacing w:after="0" w:line="240" w:lineRule="auto"/>
+      </w:pPr>
+      <w:r>
+        <w:t xml:space="preserve">    filename=...,</w:t>
+      </w:r>
+    </w:p>
+    <w:p>
+      <w:pPr>
+        <w:bidi w:val="0"/>
+        <w:spacing w:after="0" w:line="240" w:lineRule="auto"/>
+      </w:pPr>
+      <w:r>
+        <w:t xml:space="preserve">    </w:t>
+      </w:r>
+      <w:proofErr w:type="spellStart"/>
+      <w:r>
+        <w:t>rotation_logic</w:t>
+      </w:r>
+      <w:proofErr w:type="spellEnd"/>
+      <w:r>
+        <w:t>=</w:t>
+      </w:r>
+      <w:proofErr w:type="spellStart"/>
+      <w:r>
+        <w:t>rotation_logic</w:t>
+      </w:r>
+      <w:proofErr w:type="spellEnd"/>
+      <w:r>
+        <w:t>,</w:t>
+      </w:r>
+    </w:p>
+    <w:p>
+      <w:pPr>
+        <w:bidi w:val="0"/>
+        <w:spacing w:after="0" w:line="240" w:lineRule="auto"/>
+      </w:pPr>
+      <w:r>
+        <w:t xml:space="preserve">    ...</w:t>
+      </w:r>
+    </w:p>
+    <w:p>
+      <w:pPr>
+        <w:bidi w:val="0"/>
+        <w:spacing w:after="0" w:line="240" w:lineRule="auto"/>
+      </w:pPr>
+      <w:r>
+        <w:t>)</w:t>
+      </w:r>
+    </w:p>
+    <w:p>
+      <w:pPr>
+        <w:numPr>
+          <w:ilvl w:val="0"/>
+          <w:numId w:val="43"/>
+        </w:numPr>
+        <w:bidi w:val="0"/>
+        <w:spacing w:after="0" w:line="240" w:lineRule="auto"/>
+      </w:pPr>
+      <w:r>
+        <w:t>Run tests — behavior should still be the same, just more consistent.</w:t>
+      </w:r>
+    </w:p>
+    <w:p>
+      <w:pPr>
+        <w:bidi w:val="0"/>
+        <w:spacing w:after="0" w:line="240" w:lineRule="auto"/>
+      </w:pPr>
+      <w:r>
+        <w:t xml:space="preserve">Now both </w:t>
+      </w:r>
+      <w:proofErr w:type="gramStart"/>
+      <w:r>
+        <w:t>loggers</w:t>
+      </w:r>
+      <w:proofErr w:type="gramEnd"/>
+      <w:r>
+        <w:t xml:space="preserve"> </w:t>
+      </w:r>
+      <w:r>
+        <w:rPr>
+          <w:b/>
+          <w:bCs/>
+        </w:rPr>
+        <w:t>own</w:t>
+      </w:r>
+      <w:r>
+        <w:t xml:space="preserve"> handler creation and both pass </w:t>
+      </w:r>
+      <w:proofErr w:type="spellStart"/>
+      <w:r>
+        <w:t>RotationLogic</w:t>
+      </w:r>
+      <w:proofErr w:type="spellEnd"/>
+      <w:r>
+        <w:t xml:space="preserve"> into the handler.</w:t>
+      </w:r>
+    </w:p>
+    <w:p>
+      <w:pPr>
+        <w:bidi w:val="0"/>
+        <w:spacing w:after="0" w:line="240" w:lineRule="auto"/>
+        <w:rPr>
+          <w:b/>
+          <w:bCs/>
+        </w:rPr>
+      </w:pPr>
+      <w:r>
+        <w:rPr>
+          <w:b/>
+          <w:bCs/>
+        </w:rPr>
+        <w:t xml:space="preserve">Step 6: Move </w:t>
+      </w:r>
+      <w:proofErr w:type="spellStart"/>
+      <w:r>
+        <w:rPr>
+          <w:b/>
+          <w:bCs/>
+        </w:rPr>
+        <w:t>LargeLogEntryBehavior</w:t>
+      </w:r>
+      <w:proofErr w:type="spellEnd"/>
+      <w:r>
+        <w:rPr>
+          <w:b/>
+          <w:bCs/>
+        </w:rPr>
+        <w:t xml:space="preserve"> into the base class and reuse it in async</w:t>
+      </w:r>
+    </w:p>
+    <w:p>
+      <w:pPr>
+        <w:bidi w:val="0"/>
+        <w:spacing w:after="0" w:line="240" w:lineRule="auto"/>
+      </w:pPr>
+      <w:r>
+        <w:rPr>
+          <w:b/>
+          <w:bCs/>
+        </w:rPr>
+        <w:t>Goal:</w:t>
+      </w:r>
+      <w:r>
+        <w:t xml:space="preserve"> Async handler gets the same large</w:t>
+      </w:r>
+      <w:r>
+        <w:noBreakHyphen/>
+        <w:t>entry behavior as sync, via the base class.</w:t>
+      </w:r>
+    </w:p>
+    <w:p>
+      <w:pPr>
+        <w:numPr>
+          <w:ilvl w:val="0"/>
+          <w:numId w:val="44"/>
+        </w:numPr>
+        <w:bidi w:val="0"/>
+        <w:spacing w:after="0" w:line="240" w:lineRule="auto"/>
+      </w:pPr>
+      <w:r>
+        <w:t>Ensure _</w:t>
+      </w:r>
+      <w:proofErr w:type="spellStart"/>
+      <w:r>
+        <w:t>handle_large_entry</w:t>
+      </w:r>
+      <w:proofErr w:type="spellEnd"/>
+      <w:r>
+        <w:t xml:space="preserve"> lives only in </w:t>
+      </w:r>
+      <w:proofErr w:type="spellStart"/>
+      <w:r>
+        <w:t>BaseTimedSizedRotatingFileHandler</w:t>
+      </w:r>
+      <w:proofErr w:type="spellEnd"/>
+      <w:r>
+        <w:t>.</w:t>
+      </w:r>
+    </w:p>
+    <w:p>
+      <w:pPr>
+        <w:numPr>
+          <w:ilvl w:val="0"/>
+          <w:numId w:val="44"/>
+        </w:numPr>
+        <w:bidi w:val="0"/>
+        <w:spacing w:after="0" w:line="240" w:lineRule="auto"/>
+      </w:pPr>
+      <w:r>
+        <w:t xml:space="preserve">In </w:t>
+      </w:r>
+      <w:proofErr w:type="spellStart"/>
+      <w:r>
+        <w:t>ConcurrentTimedSizedRotatingFileHandler.emit</w:t>
+      </w:r>
+      <w:proofErr w:type="spellEnd"/>
+      <w:r>
+        <w:t>, keep:</w:t>
+      </w:r>
+    </w:p>
+    <w:p>
+      <w:pPr>
+        <w:bidi w:val="0"/>
+        <w:spacing w:after="0" w:line="240" w:lineRule="auto"/>
+      </w:pPr>
+      <w:r>
+        <w:t>python</w:t>
+      </w:r>
+    </w:p>
+    <w:p>
+      <w:pPr>
+        <w:bidi w:val="0"/>
+        <w:spacing w:after="0" w:line="240" w:lineRule="auto"/>
+      </w:pPr>
+      <w:r>
+        <w:t xml:space="preserve">formatted = </w:t>
+      </w:r>
+      <w:proofErr w:type="spellStart"/>
+      <w:proofErr w:type="gramStart"/>
+      <w:r>
+        <w:t>self.format</w:t>
+      </w:r>
+      <w:proofErr w:type="spellEnd"/>
+      <w:proofErr w:type="gramEnd"/>
+      <w:r>
+        <w:t>(record)</w:t>
+      </w:r>
+    </w:p>
+    <w:p>
+      <w:pPr>
+        <w:bidi w:val="0"/>
+        <w:spacing w:after="0" w:line="240" w:lineRule="auto"/>
+      </w:pPr>
+      <w:r>
+        <w:t xml:space="preserve">if </w:t>
+      </w:r>
+      <w:proofErr w:type="gramStart"/>
+      <w:r>
+        <w:t>self._</w:t>
+      </w:r>
+      <w:proofErr w:type="spellStart"/>
+      <w:proofErr w:type="gramEnd"/>
+      <w:r>
+        <w:t>handle_large_entry</w:t>
+      </w:r>
+      <w:proofErr w:type="spellEnd"/>
+      <w:r>
+        <w:t>(formatted):</w:t>
+      </w:r>
+    </w:p>
+    <w:p>
+      <w:pPr>
+        <w:bidi w:val="0"/>
+        <w:spacing w:after="0" w:line="240" w:lineRule="auto"/>
+      </w:pPr>
+      <w:r>
+        <w:t xml:space="preserve">    return</w:t>
+      </w:r>
+    </w:p>
+    <w:p>
+      <w:pPr>
+        <w:bidi w:val="0"/>
+        <w:spacing w:after="0" w:line="240" w:lineRule="auto"/>
+      </w:pPr>
+      <w:r>
+        <w:t># normal rollover + write</w:t>
+      </w:r>
+    </w:p>
+    <w:p>
+      <w:pPr>
+        <w:numPr>
+          <w:ilvl w:val="0"/>
+          <w:numId w:val="44"/>
+        </w:numPr>
+        <w:bidi w:val="0"/>
+        <w:spacing w:after="0" w:line="240" w:lineRule="auto"/>
+      </w:pPr>
+      <w:r>
+        <w:t xml:space="preserve">In </w:t>
+      </w:r>
+      <w:proofErr w:type="spellStart"/>
+      <w:r>
+        <w:t>Async_TimedSizedRotatingFileHandler.emit</w:t>
+      </w:r>
+      <w:proofErr w:type="spellEnd"/>
+      <w:r>
+        <w:t xml:space="preserve"> (or </w:t>
+      </w:r>
+      <w:proofErr w:type="spellStart"/>
+      <w:r>
+        <w:t>emit_async</w:t>
+      </w:r>
+      <w:proofErr w:type="spellEnd"/>
+      <w:r>
+        <w:t>), mirror the same pattern:</w:t>
+      </w:r>
+    </w:p>
+    <w:p>
+      <w:pPr>
+        <w:bidi w:val="0"/>
+        <w:spacing w:after="0" w:line="240" w:lineRule="auto"/>
+      </w:pPr>
+      <w:r>
+        <w:t>python</w:t>
+      </w:r>
+    </w:p>
+    <w:p>
+      <w:pPr>
+        <w:bidi w:val="0"/>
+        <w:spacing w:after="0" w:line="240" w:lineRule="auto"/>
+      </w:pPr>
+      <w:r>
+        <w:t xml:space="preserve">formatted = </w:t>
+      </w:r>
+      <w:proofErr w:type="spellStart"/>
+      <w:proofErr w:type="gramStart"/>
+      <w:r>
+        <w:t>self.format</w:t>
+      </w:r>
+      <w:proofErr w:type="spellEnd"/>
+      <w:proofErr w:type="gramEnd"/>
+      <w:r>
+        <w:t>(record)</w:t>
+      </w:r>
+    </w:p>
+    <w:p>
+      <w:pPr>
+        <w:bidi w:val="0"/>
+        <w:spacing w:after="0" w:line="240" w:lineRule="auto"/>
+      </w:pPr>
+      <w:r>
+        <w:t xml:space="preserve">if </w:t>
+      </w:r>
+      <w:proofErr w:type="gramStart"/>
+      <w:r>
+        <w:t>self._</w:t>
+      </w:r>
+      <w:proofErr w:type="spellStart"/>
+      <w:proofErr w:type="gramEnd"/>
+      <w:r>
+        <w:t>handle_large_entry</w:t>
+      </w:r>
+      <w:proofErr w:type="spellEnd"/>
+      <w:r>
+        <w:t>(formatted):</w:t>
+      </w:r>
+    </w:p>
+    <w:p>
+      <w:pPr>
+        <w:bidi w:val="0"/>
+        <w:spacing w:after="0" w:line="240" w:lineRule="auto"/>
+      </w:pPr>
+      <w:r>
+        <w:t xml:space="preserve">    return</w:t>
+      </w:r>
+    </w:p>
+    <w:p>
+      <w:pPr>
+        <w:bidi w:val="0"/>
+        <w:spacing w:after="0" w:line="240" w:lineRule="auto"/>
+      </w:pPr>
+      <w:r>
+        <w:t># async write path</w:t>
+      </w:r>
+    </w:p>
+    <w:p>
+      <w:pPr>
+        <w:numPr>
+          <w:ilvl w:val="0"/>
+          <w:numId w:val="44"/>
+        </w:numPr>
+        <w:bidi w:val="0"/>
+        <w:spacing w:after="0" w:line="240" w:lineRule="auto"/>
+      </w:pPr>
+      <w:r>
+        <w:t xml:space="preserve">Run tests — now async and sync share the same </w:t>
+      </w:r>
+      <w:proofErr w:type="spellStart"/>
+      <w:r>
+        <w:t>LargeLogEntryBehavior</w:t>
+      </w:r>
+      <w:proofErr w:type="spellEnd"/>
+      <w:r>
+        <w:t>.</w:t>
+      </w:r>
+    </w:p>
+    <w:p>
+      <w:pPr>
+        <w:bidi w:val="0"/>
+        <w:spacing w:after="0" w:line="240" w:lineRule="auto"/>
+      </w:pPr>
+      <w:r>
+        <w:t xml:space="preserve">This is the first </w:t>
+      </w:r>
+      <w:r>
+        <w:rPr>
+          <w:b/>
+          <w:bCs/>
+        </w:rPr>
+        <w:t>intentional behavior change</w:t>
+      </w:r>
+      <w:r>
+        <w:t xml:space="preserve"> for async, but it’s controlled and tested.</w:t>
+      </w:r>
+    </w:p>
+    <w:p>
+      <w:pPr>
+        <w:bidi w:val="0"/>
+        <w:spacing w:after="0" w:line="240" w:lineRule="auto"/>
+        <w:rPr>
+          <w:b/>
+          <w:bCs/>
+        </w:rPr>
+      </w:pPr>
+      <w:r>
+        <w:rPr>
+          <w:b/>
+          <w:bCs/>
+        </w:rPr>
+        <w:t xml:space="preserve">Step 7: Remove </w:t>
+      </w:r>
+      <w:proofErr w:type="spellStart"/>
+      <w:r>
+        <w:rPr>
+          <w:b/>
+          <w:bCs/>
+        </w:rPr>
+        <w:t>RotationLogic.create_handler</w:t>
+      </w:r>
+      <w:proofErr w:type="spellEnd"/>
+    </w:p>
+    <w:p>
+      <w:pPr>
+        <w:bidi w:val="0"/>
+        <w:spacing w:after="0" w:line="240" w:lineRule="auto"/>
+      </w:pPr>
+      <w:r>
+        <w:rPr>
+          <w:b/>
+          <w:bCs/>
+        </w:rPr>
+        <w:t>Goal:</w:t>
+      </w:r>
+      <w:r>
+        <w:t xml:space="preserve"> Clean up the old API now that nothing uses it.</w:t>
+      </w:r>
+    </w:p>
+    <w:p>
+      <w:pPr>
+        <w:numPr>
+          <w:ilvl w:val="0"/>
+          <w:numId w:val="45"/>
+        </w:numPr>
+        <w:bidi w:val="0"/>
+        <w:spacing w:after="0" w:line="240" w:lineRule="auto"/>
+      </w:pPr>
+      <w:r>
+        <w:t xml:space="preserve">Delete </w:t>
+      </w:r>
+      <w:proofErr w:type="spellStart"/>
+      <w:r>
+        <w:t>RotationLogic.create_handler</w:t>
+      </w:r>
+      <w:proofErr w:type="spellEnd"/>
+      <w:r>
+        <w:t>.</w:t>
+      </w:r>
+    </w:p>
+    <w:p>
+      <w:pPr>
+        <w:numPr>
+          <w:ilvl w:val="0"/>
+          <w:numId w:val="45"/>
+        </w:numPr>
+        <w:bidi w:val="0"/>
+        <w:spacing w:after="0" w:line="240" w:lineRule="auto"/>
+      </w:pPr>
+      <w:r>
+        <w:t>Search for any remaining references — there should be none.</w:t>
+      </w:r>
+    </w:p>
+    <w:p>
+      <w:pPr>
+        <w:numPr>
+          <w:ilvl w:val="0"/>
+          <w:numId w:val="45"/>
+        </w:numPr>
+        <w:bidi w:val="0"/>
+        <w:spacing w:after="0" w:line="240" w:lineRule="auto"/>
+      </w:pPr>
+      <w:r>
+        <w:t>Run tests — nothing should break.</w:t>
+      </w:r>
+    </w:p>
+    <w:p>
+      <w:pPr>
+        <w:bidi w:val="0"/>
+        <w:spacing w:after="0" w:line="240" w:lineRule="auto"/>
+      </w:pPr>
+      <w:r>
+        <w:t xml:space="preserve">Now </w:t>
+      </w:r>
+      <w:proofErr w:type="spellStart"/>
+      <w:r>
+        <w:t>RotationLogic</w:t>
+      </w:r>
+      <w:proofErr w:type="spellEnd"/>
+      <w:r>
+        <w:t xml:space="preserve"> is </w:t>
+      </w:r>
+      <w:r>
+        <w:rPr>
+          <w:b/>
+          <w:bCs/>
+        </w:rPr>
+        <w:t>pure configuration</w:t>
+      </w:r>
+      <w:r>
+        <w:t>, exactly like you wanted.</w:t>
+      </w:r>
+    </w:p>
+    <w:p>
+      <w:pPr>
+        <w:bidi w:val="0"/>
+        <w:spacing w:after="0" w:line="240" w:lineRule="auto"/>
+        <w:rPr>
+          <w:b/>
+          <w:bCs/>
+        </w:rPr>
+      </w:pPr>
+      <w:r>
+        <w:rPr>
+          <w:b/>
+          <w:bCs/>
+        </w:rPr>
+        <w:t xml:space="preserve">Step 8: Add focused tests for async </w:t>
+      </w:r>
+      <w:proofErr w:type="spellStart"/>
+      <w:r>
+        <w:rPr>
+          <w:b/>
+          <w:bCs/>
+        </w:rPr>
+        <w:t>LargeLogEntryBehavior</w:t>
+      </w:r>
+      <w:proofErr w:type="spellEnd"/>
+    </w:p>
+    <w:p>
+      <w:pPr>
+        <w:bidi w:val="0"/>
+        <w:spacing w:after="0" w:line="240" w:lineRule="auto"/>
+      </w:pPr>
+      <w:r>
+        <w:rPr>
+          <w:b/>
+          <w:bCs/>
+        </w:rPr>
+        <w:t>Goal:</w:t>
+      </w:r>
+      <w:r>
+        <w:t xml:space="preserve"> Prove parity between sync and async.</w:t>
+      </w:r>
+    </w:p>
+    <w:p>
+      <w:pPr>
+        <w:numPr>
+          <w:ilvl w:val="0"/>
+          <w:numId w:val="46"/>
+        </w:numPr>
+        <w:bidi w:val="0"/>
+        <w:spacing w:after="0" w:line="240" w:lineRule="auto"/>
+      </w:pPr>
+      <w:r>
+        <w:t>Mirror the sync tests you already wrote:</w:t>
+      </w:r>
+    </w:p>
+    <w:p>
+      <w:pPr>
+        <w:numPr>
+          <w:ilvl w:val="1"/>
+          <w:numId w:val="46"/>
+        </w:numPr>
+        <w:bidi w:val="0"/>
+        <w:spacing w:after="0" w:line="240" w:lineRule="auto"/>
+      </w:pPr>
+      <w:r>
+        <w:t>default behavior, empty file</w:t>
+      </w:r>
+    </w:p>
+    <w:p>
+      <w:pPr>
+        <w:numPr>
+          <w:ilvl w:val="1"/>
+          <w:numId w:val="46"/>
+        </w:numPr>
+        <w:bidi w:val="0"/>
+        <w:spacing w:after="0" w:line="240" w:lineRule="auto"/>
+      </w:pPr>
+      <w:r>
+        <w:t>default behavior, non</w:t>
+      </w:r>
+      <w:r>
+        <w:noBreakHyphen/>
+        <w:t>empty file</w:t>
+      </w:r>
+    </w:p>
+    <w:p>
+      <w:pPr>
+        <w:numPr>
+          <w:ilvl w:val="1"/>
+          <w:numId w:val="46"/>
+        </w:numPr>
+        <w:bidi w:val="0"/>
+        <w:spacing w:after="0" w:line="240" w:lineRule="auto"/>
+      </w:pPr>
+      <w:proofErr w:type="spellStart"/>
+      <w:r>
+        <w:t>RotateFirst</w:t>
+      </w:r>
+      <w:proofErr w:type="spellEnd"/>
+    </w:p>
+    <w:p>
+      <w:pPr>
+        <w:numPr>
+          <w:ilvl w:val="1"/>
+          <w:numId w:val="46"/>
+        </w:numPr>
+        <w:bidi w:val="0"/>
+        <w:spacing w:after="0" w:line="240" w:lineRule="auto"/>
+      </w:pPr>
+      <w:proofErr w:type="spellStart"/>
+      <w:r>
+        <w:t>DumpSilently</w:t>
+      </w:r>
+      <w:proofErr w:type="spellEnd"/>
+    </w:p>
+    <w:p>
+      <w:pPr>
+        <w:numPr>
+          <w:ilvl w:val="1"/>
+          <w:numId w:val="46"/>
+        </w:numPr>
+        <w:bidi w:val="0"/>
+        <w:spacing w:after="0" w:line="240" w:lineRule="auto"/>
+      </w:pPr>
+      <w:r>
+        <w:t>Crash</w:t>
+      </w:r>
+    </w:p>
+    <w:p>
+      <w:pPr>
+        <w:numPr>
+          <w:ilvl w:val="1"/>
+          <w:numId w:val="46"/>
+        </w:numPr>
+        <w:bidi w:val="0"/>
+        <w:spacing w:after="0" w:line="240" w:lineRule="auto"/>
+      </w:pPr>
+      <w:proofErr w:type="spellStart"/>
+      <w:r>
+        <w:t>backupCount</w:t>
+      </w:r>
+      <w:proofErr w:type="spellEnd"/>
+      <w:r>
+        <w:t xml:space="preserve"> enforcement</w:t>
+      </w:r>
+    </w:p>
+    <w:p>
+      <w:pPr>
+        <w:numPr>
+          <w:ilvl w:val="0"/>
+          <w:numId w:val="46"/>
+        </w:numPr>
+        <w:bidi w:val="0"/>
+        <w:spacing w:after="0" w:line="240" w:lineRule="auto"/>
+      </w:pPr>
+      <w:r>
+        <w:t xml:space="preserve">Run them against </w:t>
+      </w:r>
+      <w:proofErr w:type="spellStart"/>
+      <w:r>
+        <w:t>AsyncSmartLogger</w:t>
+      </w:r>
+      <w:proofErr w:type="spellEnd"/>
+      <w:r>
+        <w:t xml:space="preserve"> + </w:t>
+      </w:r>
+      <w:proofErr w:type="spellStart"/>
+      <w:r>
+        <w:t>Async_TimedSizedRotatingFileHandler</w:t>
+      </w:r>
+      <w:proofErr w:type="spellEnd"/>
+      <w:r>
+        <w:t>.</w:t>
+      </w:r>
+    </w:p>
+    <w:p>
+      <w:pPr>
+        <w:numPr>
+          <w:ilvl w:val="0"/>
+          <w:numId w:val="46"/>
+        </w:numPr>
+        <w:bidi w:val="0"/>
+        <w:spacing w:after="0" w:line="240" w:lineRule="auto"/>
+      </w:pPr>
+      <w:r>
+        <w:t>Fix any small differences that show up.</w:t>
+      </w:r>
+    </w:p>
+    <w:p>
+      <w:pPr>
+        <w:bidi w:val="0"/>
+        <w:spacing w:after="0" w:line="240" w:lineRule="auto"/>
+      </w:pPr>
+      <w:r>
+        <w:t>If you follow this sequence, each step:</w:t>
+      </w:r>
+    </w:p>
+    <w:p>
+      <w:pPr>
+        <w:numPr>
+          <w:ilvl w:val="0"/>
+          <w:numId w:val="47"/>
+        </w:numPr>
+        <w:bidi w:val="0"/>
+        <w:spacing w:after="0" w:line="240" w:lineRule="auto"/>
+      </w:pPr>
+      <w:r>
+        <w:t>compiles</w:t>
+      </w:r>
+    </w:p>
+    <w:p>
+      <w:pPr>
+        <w:numPr>
+          <w:ilvl w:val="0"/>
+          <w:numId w:val="47"/>
+        </w:numPr>
+        <w:bidi w:val="0"/>
+        <w:spacing w:after="0" w:line="240" w:lineRule="auto"/>
+      </w:pPr>
+      <w:r>
+        <w:t xml:space="preserve">keeps </w:t>
+      </w:r>
+      <w:proofErr w:type="spellStart"/>
+      <w:r>
+        <w:t>LogSmith</w:t>
+      </w:r>
+      <w:proofErr w:type="spellEnd"/>
+      <w:r>
+        <w:t xml:space="preserve"> usable</w:t>
+      </w:r>
+    </w:p>
+    <w:p>
+      <w:pPr>
+        <w:numPr>
+          <w:ilvl w:val="0"/>
+          <w:numId w:val="47"/>
+        </w:numPr>
+        <w:bidi w:val="0"/>
+        <w:spacing w:after="0" w:line="240" w:lineRule="auto"/>
+      </w:pPr>
+      <w:r>
+        <w:t>isolates risk</w:t>
+      </w:r>
+    </w:p>
+    <w:p>
+      <w:pPr>
+        <w:numPr>
+          <w:ilvl w:val="0"/>
+          <w:numId w:val="47"/>
+        </w:numPr>
+        <w:bidi w:val="0"/>
+        <w:spacing w:after="0" w:line="240" w:lineRule="auto"/>
+      </w:pPr>
+      <w:r>
+        <w:t>gives you a clean rollback point</w:t>
+      </w:r>
+    </w:p>
+    <w:p>
+      <w:pPr>
+        <w:bidi w:val="0"/>
+        <w:spacing w:after="0" w:line="240" w:lineRule="auto"/>
+      </w:pPr>
+      <w:r>
+        <w:t>Nothing “mysteriously” breaks, and you don’t have to hold the whole refactor in your head at once.</w:t>
+      </w:r>
+    </w:p>
+    <w:p>
+      <w:pPr>
+        <w:bidi w:val="0"/>
+        <w:spacing w:after="0" w:line="240" w:lineRule="auto"/>
+      </w:pPr>
+      <w:r>
+        <w:t>If you want, we can zoom into any one of these steps and sketch the exact code changes before you touch the files.</w:t>
       </w:r>
     </w:p>
     <w:p>
@@ -3355,6 +5411,119 @@
     </w:lvl>
   </w:abstractNum>
   <w:abstractNum w:abstractNumId="2" w15:restartNumberingAfterBreak="0">
+    <w:nsid w:val="08BF40EC"/>
+    <w:multiLevelType w:val="multilevel"/>
+    <w:tmpl w:val="DF18437A"/>
+    <w:lvl w:ilvl="0">
+      <w:start w:val="1"/>
+      <w:numFmt w:val="decimal"/>
+      <w:lvlText w:val="%1."/>
+      <w:lvlJc w:val="left"/>
+      <w:pPr>
+        <w:tabs>
+          <w:tab w:val="num" w:pos="720"/>
+        </w:tabs>
+        <w:ind w:left="720" w:hanging="360"/>
+      </w:pPr>
+    </w:lvl>
+    <w:lvl w:ilvl="1" w:tentative="1">
+      <w:start w:val="1"/>
+      <w:numFmt w:val="decimal"/>
+      <w:lvlText w:val="%2."/>
+      <w:lvlJc w:val="left"/>
+      <w:pPr>
+        <w:tabs>
+          <w:tab w:val="num" w:pos="1440"/>
+        </w:tabs>
+        <w:ind w:left="1440" w:hanging="360"/>
+      </w:pPr>
+    </w:lvl>
+    <w:lvl w:ilvl="2" w:tentative="1">
+      <w:start w:val="1"/>
+      <w:numFmt w:val="decimal"/>
+      <w:lvlText w:val="%3."/>
+      <w:lvlJc w:val="left"/>
+      <w:pPr>
+        <w:tabs>
+          <w:tab w:val="num" w:pos="2160"/>
+        </w:tabs>
+        <w:ind w:left="2160" w:hanging="360"/>
+      </w:pPr>
+    </w:lvl>
+    <w:lvl w:ilvl="3" w:tentative="1">
+      <w:start w:val="1"/>
+      <w:numFmt w:val="decimal"/>
+      <w:lvlText w:val="%4."/>
+      <w:lvlJc w:val="left"/>
+      <w:pPr>
+        <w:tabs>
+          <w:tab w:val="num" w:pos="2880"/>
+        </w:tabs>
+        <w:ind w:left="2880" w:hanging="360"/>
+      </w:pPr>
+    </w:lvl>
+    <w:lvl w:ilvl="4" w:tentative="1">
+      <w:start w:val="1"/>
+      <w:numFmt w:val="decimal"/>
+      <w:lvlText w:val="%5."/>
+      <w:lvlJc w:val="left"/>
+      <w:pPr>
+        <w:tabs>
+          <w:tab w:val="num" w:pos="3600"/>
+        </w:tabs>
+        <w:ind w:left="3600" w:hanging="360"/>
+      </w:pPr>
+    </w:lvl>
+    <w:lvl w:ilvl="5" w:tentative="1">
+      <w:start w:val="1"/>
+      <w:numFmt w:val="decimal"/>
+      <w:lvlText w:val="%6."/>
+      <w:lvlJc w:val="left"/>
+      <w:pPr>
+        <w:tabs>
+          <w:tab w:val="num" w:pos="4320"/>
+        </w:tabs>
+        <w:ind w:left="4320" w:hanging="360"/>
+      </w:pPr>
+    </w:lvl>
+    <w:lvl w:ilvl="6" w:tentative="1">
+      <w:start w:val="1"/>
+      <w:numFmt w:val="decimal"/>
+      <w:lvlText w:val="%7."/>
+      <w:lvlJc w:val="left"/>
+      <w:pPr>
+        <w:tabs>
+          <w:tab w:val="num" w:pos="5040"/>
+        </w:tabs>
+        <w:ind w:left="5040" w:hanging="360"/>
+      </w:pPr>
+    </w:lvl>
+    <w:lvl w:ilvl="7" w:tentative="1">
+      <w:start w:val="1"/>
+      <w:numFmt w:val="decimal"/>
+      <w:lvlText w:val="%8."/>
+      <w:lvlJc w:val="left"/>
+      <w:pPr>
+        <w:tabs>
+          <w:tab w:val="num" w:pos="5760"/>
+        </w:tabs>
+        <w:ind w:left="5760" w:hanging="360"/>
+      </w:pPr>
+    </w:lvl>
+    <w:lvl w:ilvl="8" w:tentative="1">
+      <w:start w:val="1"/>
+      <w:numFmt w:val="decimal"/>
+      <w:lvlText w:val="%9."/>
+      <w:lvlJc w:val="left"/>
+      <w:pPr>
+        <w:tabs>
+          <w:tab w:val="num" w:pos="6480"/>
+        </w:tabs>
+        <w:ind w:left="6480" w:hanging="360"/>
+      </w:pPr>
+    </w:lvl>
+  </w:abstractNum>
+  <w:abstractNum w:abstractNumId="3" w15:restartNumberingAfterBreak="0">
     <w:nsid w:val="0E7F4982"/>
     <w:multiLevelType w:val="multilevel"/>
     <w:tmpl w:val="9E76B996"/>
@@ -3503,7 +5672,7 @@
       </w:rPr>
     </w:lvl>
   </w:abstractNum>
-  <w:abstractNum w:abstractNumId="3" w15:restartNumberingAfterBreak="0">
+  <w:abstractNum w:abstractNumId="4" w15:restartNumberingAfterBreak="0">
     <w:nsid w:val="113F3FE5"/>
     <w:multiLevelType w:val="multilevel"/>
     <w:tmpl w:val="07689A62"/>
@@ -3616,7 +5785,7 @@
       </w:pPr>
     </w:lvl>
   </w:abstractNum>
-  <w:abstractNum w:abstractNumId="4" w15:restartNumberingAfterBreak="0">
+  <w:abstractNum w:abstractNumId="5" w15:restartNumberingAfterBreak="0">
     <w:nsid w:val="1F565EC4"/>
     <w:multiLevelType w:val="multilevel"/>
     <w:tmpl w:val="86749ED2"/>
@@ -3765,7 +5934,7 @@
       </w:rPr>
     </w:lvl>
   </w:abstractNum>
-  <w:abstractNum w:abstractNumId="5" w15:restartNumberingAfterBreak="0">
+  <w:abstractNum w:abstractNumId="6" w15:restartNumberingAfterBreak="0">
     <w:nsid w:val="20631D27"/>
     <w:multiLevelType w:val="multilevel"/>
     <w:tmpl w:val="4722307A"/>
@@ -3914,7 +6083,7 @@
       </w:rPr>
     </w:lvl>
   </w:abstractNum>
-  <w:abstractNum w:abstractNumId="6" w15:restartNumberingAfterBreak="0">
+  <w:abstractNum w:abstractNumId="7" w15:restartNumberingAfterBreak="0">
     <w:nsid w:val="21306E54"/>
     <w:multiLevelType w:val="multilevel"/>
     <w:tmpl w:val="96EA1C46"/>
@@ -4063,7 +6232,7 @@
       </w:rPr>
     </w:lvl>
   </w:abstractNum>
-  <w:abstractNum w:abstractNumId="7" w15:restartNumberingAfterBreak="0">
+  <w:abstractNum w:abstractNumId="8" w15:restartNumberingAfterBreak="0">
     <w:nsid w:val="21641FF0"/>
     <w:multiLevelType w:val="multilevel"/>
     <w:tmpl w:val="002C04EE"/>
@@ -4212,7 +6381,7 @@
       </w:rPr>
     </w:lvl>
   </w:abstractNum>
-  <w:abstractNum w:abstractNumId="8" w15:restartNumberingAfterBreak="0">
+  <w:abstractNum w:abstractNumId="9" w15:restartNumberingAfterBreak="0">
     <w:nsid w:val="26166456"/>
     <w:multiLevelType w:val="multilevel"/>
     <w:tmpl w:val="1272104C"/>
@@ -4361,7 +6530,7 @@
       </w:rPr>
     </w:lvl>
   </w:abstractNum>
-  <w:abstractNum w:abstractNumId="9" w15:restartNumberingAfterBreak="0">
+  <w:abstractNum w:abstractNumId="10" w15:restartNumberingAfterBreak="0">
     <w:nsid w:val="26C21FB4"/>
     <w:multiLevelType w:val="multilevel"/>
     <w:tmpl w:val="C9705616"/>
@@ -4510,7 +6679,7 @@
       </w:rPr>
     </w:lvl>
   </w:abstractNum>
-  <w:abstractNum w:abstractNumId="10" w15:restartNumberingAfterBreak="0">
+  <w:abstractNum w:abstractNumId="11" w15:restartNumberingAfterBreak="0">
     <w:nsid w:val="281B53A3"/>
     <w:multiLevelType w:val="multilevel"/>
     <w:tmpl w:val="B6F8C182"/>
@@ -4659,7 +6828,7 @@
       </w:rPr>
     </w:lvl>
   </w:abstractNum>
-  <w:abstractNum w:abstractNumId="11" w15:restartNumberingAfterBreak="0">
+  <w:abstractNum w:abstractNumId="12" w15:restartNumberingAfterBreak="0">
     <w:nsid w:val="2AB04E40"/>
     <w:multiLevelType w:val="multilevel"/>
     <w:tmpl w:val="65CA7AFA"/>
@@ -4808,7 +6977,7 @@
       </w:rPr>
     </w:lvl>
   </w:abstractNum>
-  <w:abstractNum w:abstractNumId="12" w15:restartNumberingAfterBreak="0">
+  <w:abstractNum w:abstractNumId="13" w15:restartNumberingAfterBreak="0">
     <w:nsid w:val="2EF63F41"/>
     <w:multiLevelType w:val="multilevel"/>
     <w:tmpl w:val="AEAED1FE"/>
@@ -4957,7 +7126,7 @@
       </w:rPr>
     </w:lvl>
   </w:abstractNum>
-  <w:abstractNum w:abstractNumId="13" w15:restartNumberingAfterBreak="0">
+  <w:abstractNum w:abstractNumId="14" w15:restartNumberingAfterBreak="0">
     <w:nsid w:val="30306D0A"/>
     <w:multiLevelType w:val="multilevel"/>
     <w:tmpl w:val="B17C8F08"/>
@@ -5106,7 +7275,7 @@
       </w:rPr>
     </w:lvl>
   </w:abstractNum>
-  <w:abstractNum w:abstractNumId="14" w15:restartNumberingAfterBreak="0">
+  <w:abstractNum w:abstractNumId="15" w15:restartNumberingAfterBreak="0">
     <w:nsid w:val="3237375A"/>
     <w:multiLevelType w:val="multilevel"/>
     <w:tmpl w:val="7624CB0E"/>
@@ -5255,7 +7424,7 @@
       </w:rPr>
     </w:lvl>
   </w:abstractNum>
-  <w:abstractNum w:abstractNumId="15" w15:restartNumberingAfterBreak="0">
+  <w:abstractNum w:abstractNumId="16" w15:restartNumberingAfterBreak="0">
     <w:nsid w:val="337C617F"/>
     <w:multiLevelType w:val="multilevel"/>
     <w:tmpl w:val="FFE8055E"/>
@@ -5404,7 +7573,7 @@
       </w:rPr>
     </w:lvl>
   </w:abstractNum>
-  <w:abstractNum w:abstractNumId="16" w15:restartNumberingAfterBreak="0">
+  <w:abstractNum w:abstractNumId="17" w15:restartNumberingAfterBreak="0">
     <w:nsid w:val="357F7E92"/>
     <w:multiLevelType w:val="multilevel"/>
     <w:tmpl w:val="E22C51A6"/>
@@ -5553,7 +7722,7 @@
       </w:rPr>
     </w:lvl>
   </w:abstractNum>
-  <w:abstractNum w:abstractNumId="17" w15:restartNumberingAfterBreak="0">
+  <w:abstractNum w:abstractNumId="18" w15:restartNumberingAfterBreak="0">
     <w:nsid w:val="368A7933"/>
     <w:multiLevelType w:val="multilevel"/>
     <w:tmpl w:val="CE728E5C"/>
@@ -5702,7 +7871,7 @@
       </w:rPr>
     </w:lvl>
   </w:abstractNum>
-  <w:abstractNum w:abstractNumId="18" w15:restartNumberingAfterBreak="0">
+  <w:abstractNum w:abstractNumId="19" w15:restartNumberingAfterBreak="0">
     <w:nsid w:val="374C2F42"/>
     <w:multiLevelType w:val="multilevel"/>
     <w:tmpl w:val="6E46FAF4"/>
@@ -5851,7 +8020,120 @@
       </w:rPr>
     </w:lvl>
   </w:abstractNum>
-  <w:abstractNum w:abstractNumId="19" w15:restartNumberingAfterBreak="0">
+  <w:abstractNum w:abstractNumId="20" w15:restartNumberingAfterBreak="0">
+    <w:nsid w:val="3CED2099"/>
+    <w:multiLevelType w:val="multilevel"/>
+    <w:tmpl w:val="A7AC1114"/>
+    <w:lvl w:ilvl="0">
+      <w:start w:val="1"/>
+      <w:numFmt w:val="decimal"/>
+      <w:lvlText w:val="%1."/>
+      <w:lvlJc w:val="left"/>
+      <w:pPr>
+        <w:tabs>
+          <w:tab w:val="num" w:pos="720"/>
+        </w:tabs>
+        <w:ind w:left="720" w:hanging="360"/>
+      </w:pPr>
+    </w:lvl>
+    <w:lvl w:ilvl="1" w:tentative="1">
+      <w:start w:val="1"/>
+      <w:numFmt w:val="decimal"/>
+      <w:lvlText w:val="%2."/>
+      <w:lvlJc w:val="left"/>
+      <w:pPr>
+        <w:tabs>
+          <w:tab w:val="num" w:pos="1440"/>
+        </w:tabs>
+        <w:ind w:left="1440" w:hanging="360"/>
+      </w:pPr>
+    </w:lvl>
+    <w:lvl w:ilvl="2" w:tentative="1">
+      <w:start w:val="1"/>
+      <w:numFmt w:val="decimal"/>
+      <w:lvlText w:val="%3."/>
+      <w:lvlJc w:val="left"/>
+      <w:pPr>
+        <w:tabs>
+          <w:tab w:val="num" w:pos="2160"/>
+        </w:tabs>
+        <w:ind w:left="2160" w:hanging="360"/>
+      </w:pPr>
+    </w:lvl>
+    <w:lvl w:ilvl="3" w:tentative="1">
+      <w:start w:val="1"/>
+      <w:numFmt w:val="decimal"/>
+      <w:lvlText w:val="%4."/>
+      <w:lvlJc w:val="left"/>
+      <w:pPr>
+        <w:tabs>
+          <w:tab w:val="num" w:pos="2880"/>
+        </w:tabs>
+        <w:ind w:left="2880" w:hanging="360"/>
+      </w:pPr>
+    </w:lvl>
+    <w:lvl w:ilvl="4" w:tentative="1">
+      <w:start w:val="1"/>
+      <w:numFmt w:val="decimal"/>
+      <w:lvlText w:val="%5."/>
+      <w:lvlJc w:val="left"/>
+      <w:pPr>
+        <w:tabs>
+          <w:tab w:val="num" w:pos="3600"/>
+        </w:tabs>
+        <w:ind w:left="3600" w:hanging="360"/>
+      </w:pPr>
+    </w:lvl>
+    <w:lvl w:ilvl="5" w:tentative="1">
+      <w:start w:val="1"/>
+      <w:numFmt w:val="decimal"/>
+      <w:lvlText w:val="%6."/>
+      <w:lvlJc w:val="left"/>
+      <w:pPr>
+        <w:tabs>
+          <w:tab w:val="num" w:pos="4320"/>
+        </w:tabs>
+        <w:ind w:left="4320" w:hanging="360"/>
+      </w:pPr>
+    </w:lvl>
+    <w:lvl w:ilvl="6" w:tentative="1">
+      <w:start w:val="1"/>
+      <w:numFmt w:val="decimal"/>
+      <w:lvlText w:val="%7."/>
+      <w:lvlJc w:val="left"/>
+      <w:pPr>
+        <w:tabs>
+          <w:tab w:val="num" w:pos="5040"/>
+        </w:tabs>
+        <w:ind w:left="5040" w:hanging="360"/>
+      </w:pPr>
+    </w:lvl>
+    <w:lvl w:ilvl="7" w:tentative="1">
+      <w:start w:val="1"/>
+      <w:numFmt w:val="decimal"/>
+      <w:lvlText w:val="%8."/>
+      <w:lvlJc w:val="left"/>
+      <w:pPr>
+        <w:tabs>
+          <w:tab w:val="num" w:pos="5760"/>
+        </w:tabs>
+        <w:ind w:left="5760" w:hanging="360"/>
+      </w:pPr>
+    </w:lvl>
+    <w:lvl w:ilvl="8" w:tentative="1">
+      <w:start w:val="1"/>
+      <w:numFmt w:val="decimal"/>
+      <w:lvlText w:val="%9."/>
+      <w:lvlJc w:val="left"/>
+      <w:pPr>
+        <w:tabs>
+          <w:tab w:val="num" w:pos="6480"/>
+        </w:tabs>
+        <w:ind w:left="6480" w:hanging="360"/>
+      </w:pPr>
+    </w:lvl>
+  </w:abstractNum>
+  <w:abstractNum w:abstractNumId="21" w15:restartNumberingAfterBreak="0">
     <w:nsid w:val="40EC4D46"/>
     <w:multiLevelType w:val="multilevel"/>
     <w:tmpl w:val="6BC83472"/>
@@ -6000,7 +8282,7 @@
       </w:rPr>
     </w:lvl>
   </w:abstractNum>
-  <w:abstractNum w:abstractNumId="20" w15:restartNumberingAfterBreak="0">
+  <w:abstractNum w:abstractNumId="22" w15:restartNumberingAfterBreak="0">
     <w:nsid w:val="421C5BCB"/>
     <w:multiLevelType w:val="multilevel"/>
     <w:tmpl w:val="A8B25A8E"/>
@@ -6149,7 +8431,120 @@
       </w:rPr>
     </w:lvl>
   </w:abstractNum>
-  <w:abstractNum w:abstractNumId="21" w15:restartNumberingAfterBreak="0">
+  <w:abstractNum w:abstractNumId="23" w15:restartNumberingAfterBreak="0">
+    <w:nsid w:val="43FB3C09"/>
+    <w:multiLevelType w:val="multilevel"/>
+    <w:tmpl w:val="D04A5A16"/>
+    <w:lvl w:ilvl="0">
+      <w:start w:val="1"/>
+      <w:numFmt w:val="decimal"/>
+      <w:lvlText w:val="%1."/>
+      <w:lvlJc w:val="left"/>
+      <w:pPr>
+        <w:tabs>
+          <w:tab w:val="num" w:pos="720"/>
+        </w:tabs>
+        <w:ind w:left="720" w:hanging="360"/>
+      </w:pPr>
+    </w:lvl>
+    <w:lvl w:ilvl="1" w:tentative="1">
+      <w:start w:val="1"/>
+      <w:numFmt w:val="decimal"/>
+      <w:lvlText w:val="%2."/>
+      <w:lvlJc w:val="left"/>
+      <w:pPr>
+        <w:tabs>
+          <w:tab w:val="num" w:pos="1440"/>
+        </w:tabs>
+        <w:ind w:left="1440" w:hanging="360"/>
+      </w:pPr>
+    </w:lvl>
+    <w:lvl w:ilvl="2" w:tentative="1">
+      <w:start w:val="1"/>
+      <w:numFmt w:val="decimal"/>
+      <w:lvlText w:val="%3."/>
+      <w:lvlJc w:val="left"/>
+      <w:pPr>
+        <w:tabs>
+          <w:tab w:val="num" w:pos="2160"/>
+        </w:tabs>
+        <w:ind w:left="2160" w:hanging="360"/>
+      </w:pPr>
+    </w:lvl>
+    <w:lvl w:ilvl="3" w:tentative="1">
+      <w:start w:val="1"/>
+      <w:numFmt w:val="decimal"/>
+      <w:lvlText w:val="%4."/>
+      <w:lvlJc w:val="left"/>
+      <w:pPr>
+        <w:tabs>
+          <w:tab w:val="num" w:pos="2880"/>
+        </w:tabs>
+        <w:ind w:left="2880" w:hanging="360"/>
+      </w:pPr>
+    </w:lvl>
+    <w:lvl w:ilvl="4" w:tentative="1">
+      <w:start w:val="1"/>
+      <w:numFmt w:val="decimal"/>
+      <w:lvlText w:val="%5."/>
+      <w:lvlJc w:val="left"/>
+      <w:pPr>
+        <w:tabs>
+          <w:tab w:val="num" w:pos="3600"/>
+        </w:tabs>
+        <w:ind w:left="3600" w:hanging="360"/>
+      </w:pPr>
+    </w:lvl>
+    <w:lvl w:ilvl="5" w:tentative="1">
+      <w:start w:val="1"/>
+      <w:numFmt w:val="decimal"/>
+      <w:lvlText w:val="%6."/>
+      <w:lvlJc w:val="left"/>
+      <w:pPr>
+        <w:tabs>
+          <w:tab w:val="num" w:pos="4320"/>
+        </w:tabs>
+        <w:ind w:left="4320" w:hanging="360"/>
+      </w:pPr>
+    </w:lvl>
+    <w:lvl w:ilvl="6" w:tentative="1">
+      <w:start w:val="1"/>
+      <w:numFmt w:val="decimal"/>
+      <w:lvlText w:val="%7."/>
+      <w:lvlJc w:val="left"/>
+      <w:pPr>
+        <w:tabs>
+          <w:tab w:val="num" w:pos="5040"/>
+        </w:tabs>
+        <w:ind w:left="5040" w:hanging="360"/>
+      </w:pPr>
+    </w:lvl>
+    <w:lvl w:ilvl="7" w:tentative="1">
+      <w:start w:val="1"/>
+      <w:numFmt w:val="decimal"/>
+      <w:lvlText w:val="%8."/>
+      <w:lvlJc w:val="left"/>
+      <w:pPr>
+        <w:tabs>
+          <w:tab w:val="num" w:pos="5760"/>
+        </w:tabs>
+        <w:ind w:left="5760" w:hanging="360"/>
+      </w:pPr>
+    </w:lvl>
+    <w:lvl w:ilvl="8" w:tentative="1">
+      <w:start w:val="1"/>
+      <w:numFmt w:val="decimal"/>
+      <w:lvlText w:val="%9."/>
+      <w:lvlJc w:val="left"/>
+      <w:pPr>
+        <w:tabs>
+          <w:tab w:val="num" w:pos="6480"/>
+        </w:tabs>
+        <w:ind w:left="6480" w:hanging="360"/>
+      </w:pPr>
+    </w:lvl>
+  </w:abstractNum>
+  <w:abstractNum w:abstractNumId="24" w15:restartNumberingAfterBreak="0">
     <w:nsid w:val="45201269"/>
     <w:multiLevelType w:val="multilevel"/>
     <w:tmpl w:val="D5AC9E30"/>
@@ -6298,7 +8693,7 @@
       </w:rPr>
     </w:lvl>
   </w:abstractNum>
-  <w:abstractNum w:abstractNumId="22" w15:restartNumberingAfterBreak="0">
+  <w:abstractNum w:abstractNumId="25" w15:restartNumberingAfterBreak="0">
     <w:nsid w:val="4875692E"/>
     <w:multiLevelType w:val="multilevel"/>
     <w:tmpl w:val="9E2C6E66"/>
@@ -6447,7 +8842,7 @@
       </w:rPr>
     </w:lvl>
   </w:abstractNum>
-  <w:abstractNum w:abstractNumId="23" w15:restartNumberingAfterBreak="0">
+  <w:abstractNum w:abstractNumId="26" w15:restartNumberingAfterBreak="0">
     <w:nsid w:val="4B787C15"/>
     <w:multiLevelType w:val="multilevel"/>
     <w:tmpl w:val="E9866DA2"/>
@@ -6596,7 +8991,7 @@
       </w:rPr>
     </w:lvl>
   </w:abstractNum>
-  <w:abstractNum w:abstractNumId="24" w15:restartNumberingAfterBreak="0">
+  <w:abstractNum w:abstractNumId="27" w15:restartNumberingAfterBreak="0">
     <w:nsid w:val="4D8708EE"/>
     <w:multiLevelType w:val="multilevel"/>
     <w:tmpl w:val="74E87062"/>
@@ -6745,7 +9140,7 @@
       </w:rPr>
     </w:lvl>
   </w:abstractNum>
-  <w:abstractNum w:abstractNumId="25" w15:restartNumberingAfterBreak="0">
+  <w:abstractNum w:abstractNumId="28" w15:restartNumberingAfterBreak="0">
     <w:nsid w:val="4E02631C"/>
     <w:multiLevelType w:val="multilevel"/>
     <w:tmpl w:val="EF7E5AAE"/>
@@ -6894,7 +9289,7 @@
       </w:rPr>
     </w:lvl>
   </w:abstractNum>
-  <w:abstractNum w:abstractNumId="26" w15:restartNumberingAfterBreak="0">
+  <w:abstractNum w:abstractNumId="29" w15:restartNumberingAfterBreak="0">
     <w:nsid w:val="4FCB59DD"/>
     <w:multiLevelType w:val="multilevel"/>
     <w:tmpl w:val="7A129606"/>
@@ -7043,7 +9438,7 @@
       </w:rPr>
     </w:lvl>
   </w:abstractNum>
-  <w:abstractNum w:abstractNumId="27" w15:restartNumberingAfterBreak="0">
+  <w:abstractNum w:abstractNumId="30" w15:restartNumberingAfterBreak="0">
     <w:nsid w:val="4FDA2355"/>
     <w:multiLevelType w:val="multilevel"/>
     <w:tmpl w:val="5AE2EBE8"/>
@@ -7192,7 +9587,120 @@
       </w:rPr>
     </w:lvl>
   </w:abstractNum>
-  <w:abstractNum w:abstractNumId="28" w15:restartNumberingAfterBreak="0">
+  <w:abstractNum w:abstractNumId="31" w15:restartNumberingAfterBreak="0">
+    <w:nsid w:val="508A766E"/>
+    <w:multiLevelType w:val="multilevel"/>
+    <w:tmpl w:val="7C64681C"/>
+    <w:lvl w:ilvl="0">
+      <w:start w:val="1"/>
+      <w:numFmt w:val="decimal"/>
+      <w:lvlText w:val="%1."/>
+      <w:lvlJc w:val="left"/>
+      <w:pPr>
+        <w:tabs>
+          <w:tab w:val="num" w:pos="720"/>
+        </w:tabs>
+        <w:ind w:left="720" w:hanging="360"/>
+      </w:pPr>
+    </w:lvl>
+    <w:lvl w:ilvl="1" w:tentative="1">
+      <w:start w:val="1"/>
+      <w:numFmt w:val="decimal"/>
+      <w:lvlText w:val="%2."/>
+      <w:lvlJc w:val="left"/>
+      <w:pPr>
+        <w:tabs>
+          <w:tab w:val="num" w:pos="1440"/>
+        </w:tabs>
+        <w:ind w:left="1440" w:hanging="360"/>
+      </w:pPr>
+    </w:lvl>
+    <w:lvl w:ilvl="2" w:tentative="1">
+      <w:start w:val="1"/>
+      <w:numFmt w:val="decimal"/>
+      <w:lvlText w:val="%3."/>
+      <w:lvlJc w:val="left"/>
+      <w:pPr>
+        <w:tabs>
+          <w:tab w:val="num" w:pos="2160"/>
+        </w:tabs>
+        <w:ind w:left="2160" w:hanging="360"/>
+      </w:pPr>
+    </w:lvl>
+    <w:lvl w:ilvl="3" w:tentative="1">
+      <w:start w:val="1"/>
+      <w:numFmt w:val="decimal"/>
+      <w:lvlText w:val="%4."/>
+      <w:lvlJc w:val="left"/>
+      <w:pPr>
+        <w:tabs>
+          <w:tab w:val="num" w:pos="2880"/>
+        </w:tabs>
+        <w:ind w:left="2880" w:hanging="360"/>
+      </w:pPr>
+    </w:lvl>
+    <w:lvl w:ilvl="4" w:tentative="1">
+      <w:start w:val="1"/>
+      <w:numFmt w:val="decimal"/>
+      <w:lvlText w:val="%5."/>
+      <w:lvlJc w:val="left"/>
+      <w:pPr>
+        <w:tabs>
+          <w:tab w:val="num" w:pos="3600"/>
+        </w:tabs>
+        <w:ind w:left="3600" w:hanging="360"/>
+      </w:pPr>
+    </w:lvl>
+    <w:lvl w:ilvl="5" w:tentative="1">
+      <w:start w:val="1"/>
+      <w:numFmt w:val="decimal"/>
+      <w:lvlText w:val="%6."/>
+      <w:lvlJc w:val="left"/>
+      <w:pPr>
+        <w:tabs>
+          <w:tab w:val="num" w:pos="4320"/>
+        </w:tabs>
+        <w:ind w:left="4320" w:hanging="360"/>
+      </w:pPr>
+    </w:lvl>
+    <w:lvl w:ilvl="6" w:tentative="1">
+      <w:start w:val="1"/>
+      <w:numFmt w:val="decimal"/>
+      <w:lvlText w:val="%7."/>
+      <w:lvlJc w:val="left"/>
+      <w:pPr>
+        <w:tabs>
+          <w:tab w:val="num" w:pos="5040"/>
+        </w:tabs>
+        <w:ind w:left="5040" w:hanging="360"/>
+      </w:pPr>
+    </w:lvl>
+    <w:lvl w:ilvl="7" w:tentative="1">
+      <w:start w:val="1"/>
+      <w:numFmt w:val="decimal"/>
+      <w:lvlText w:val="%8."/>
+      <w:lvlJc w:val="left"/>
+      <w:pPr>
+        <w:tabs>
+          <w:tab w:val="num" w:pos="5760"/>
+        </w:tabs>
+        <w:ind w:left="5760" w:hanging="360"/>
+      </w:pPr>
+    </w:lvl>
+    <w:lvl w:ilvl="8" w:tentative="1">
+      <w:start w:val="1"/>
+      <w:numFmt w:val="decimal"/>
+      <w:lvlText w:val="%9."/>
+      <w:lvlJc w:val="left"/>
+      <w:pPr>
+        <w:tabs>
+          <w:tab w:val="num" w:pos="6480"/>
+        </w:tabs>
+        <w:ind w:left="6480" w:hanging="360"/>
+      </w:pPr>
+    </w:lvl>
+  </w:abstractNum>
+  <w:abstractNum w:abstractNumId="32" w15:restartNumberingAfterBreak="0">
     <w:nsid w:val="5230386D"/>
     <w:multiLevelType w:val="multilevel"/>
     <w:tmpl w:val="BE2C5320"/>
@@ -7341,7 +9849,233 @@
       </w:rPr>
     </w:lvl>
   </w:abstractNum>
-  <w:abstractNum w:abstractNumId="29" w15:restartNumberingAfterBreak="0">
+  <w:abstractNum w:abstractNumId="33" w15:restartNumberingAfterBreak="0">
+    <w:nsid w:val="586F7154"/>
+    <w:multiLevelType w:val="multilevel"/>
+    <w:tmpl w:val="FFE0F80E"/>
+    <w:lvl w:ilvl="0">
+      <w:start w:val="1"/>
+      <w:numFmt w:val="decimal"/>
+      <w:lvlText w:val="%1."/>
+      <w:lvlJc w:val="left"/>
+      <w:pPr>
+        <w:tabs>
+          <w:tab w:val="num" w:pos="720"/>
+        </w:tabs>
+        <w:ind w:left="720" w:hanging="360"/>
+      </w:pPr>
+    </w:lvl>
+    <w:lvl w:ilvl="1" w:tentative="1">
+      <w:start w:val="1"/>
+      <w:numFmt w:val="decimal"/>
+      <w:lvlText w:val="%2."/>
+      <w:lvlJc w:val="left"/>
+      <w:pPr>
+        <w:tabs>
+          <w:tab w:val="num" w:pos="1440"/>
+        </w:tabs>
+        <w:ind w:left="1440" w:hanging="360"/>
+      </w:pPr>
+    </w:lvl>
+    <w:lvl w:ilvl="2" w:tentative="1">
+      <w:start w:val="1"/>
+      <w:numFmt w:val="decimal"/>
+      <w:lvlText w:val="%3."/>
+      <w:lvlJc w:val="left"/>
+      <w:pPr>
+        <w:tabs>
+          <w:tab w:val="num" w:pos="2160"/>
+        </w:tabs>
+        <w:ind w:left="2160" w:hanging="360"/>
+      </w:pPr>
+    </w:lvl>
+    <w:lvl w:ilvl="3" w:tentative="1">
+      <w:start w:val="1"/>
+      <w:numFmt w:val="decimal"/>
+      <w:lvlText w:val="%4."/>
+      <w:lvlJc w:val="left"/>
+      <w:pPr>
+        <w:tabs>
+          <w:tab w:val="num" w:pos="2880"/>
+        </w:tabs>
+        <w:ind w:left="2880" w:hanging="360"/>
+      </w:pPr>
+    </w:lvl>
+    <w:lvl w:ilvl="4" w:tentative="1">
+      <w:start w:val="1"/>
+      <w:numFmt w:val="decimal"/>
+      <w:lvlText w:val="%5."/>
+      <w:lvlJc w:val="left"/>
+      <w:pPr>
+        <w:tabs>
+          <w:tab w:val="num" w:pos="3600"/>
+        </w:tabs>
+        <w:ind w:left="3600" w:hanging="360"/>
+      </w:pPr>
+    </w:lvl>
+    <w:lvl w:ilvl="5" w:tentative="1">
+      <w:start w:val="1"/>
+      <w:numFmt w:val="decimal"/>
+      <w:lvlText w:val="%6."/>
+      <w:lvlJc w:val="left"/>
+      <w:pPr>
+        <w:tabs>
+          <w:tab w:val="num" w:pos="4320"/>
+        </w:tabs>
+        <w:ind w:left="4320" w:hanging="360"/>
+      </w:pPr>
+    </w:lvl>
+    <w:lvl w:ilvl="6" w:tentative="1">
+      <w:start w:val="1"/>
+      <w:numFmt w:val="decimal"/>
+      <w:lvlText w:val="%7."/>
+      <w:lvlJc w:val="left"/>
+      <w:pPr>
+        <w:tabs>
+          <w:tab w:val="num" w:pos="5040"/>
+        </w:tabs>
+        <w:ind w:left="5040" w:hanging="360"/>
+      </w:pPr>
+    </w:lvl>
+    <w:lvl w:ilvl="7" w:tentative="1">
+      <w:start w:val="1"/>
+      <w:numFmt w:val="decimal"/>
+      <w:lvlText w:val="%8."/>
+      <w:lvlJc w:val="left"/>
+      <w:pPr>
+        <w:tabs>
+          <w:tab w:val="num" w:pos="5760"/>
+        </w:tabs>
+        <w:ind w:left="5760" w:hanging="360"/>
+      </w:pPr>
+    </w:lvl>
+    <w:lvl w:ilvl="8" w:tentative="1">
+      <w:start w:val="1"/>
+      <w:numFmt w:val="decimal"/>
+      <w:lvlText w:val="%9."/>
+      <w:lvlJc w:val="left"/>
+      <w:pPr>
+        <w:tabs>
+          <w:tab w:val="num" w:pos="6480"/>
+        </w:tabs>
+        <w:ind w:left="6480" w:hanging="360"/>
+      </w:pPr>
+    </w:lvl>
+  </w:abstractNum>
+  <w:abstractNum w:abstractNumId="34" w15:restartNumberingAfterBreak="0">
+    <w:nsid w:val="5AD61889"/>
+    <w:multiLevelType w:val="multilevel"/>
+    <w:tmpl w:val="D3C6FDCC"/>
+    <w:lvl w:ilvl="0">
+      <w:start w:val="1"/>
+      <w:numFmt w:val="decimal"/>
+      <w:lvlText w:val="%1."/>
+      <w:lvlJc w:val="left"/>
+      <w:pPr>
+        <w:tabs>
+          <w:tab w:val="num" w:pos="720"/>
+        </w:tabs>
+        <w:ind w:left="720" w:hanging="360"/>
+      </w:pPr>
+    </w:lvl>
+    <w:lvl w:ilvl="1" w:tentative="1">
+      <w:start w:val="1"/>
+      <w:numFmt w:val="decimal"/>
+      <w:lvlText w:val="%2."/>
+      <w:lvlJc w:val="left"/>
+      <w:pPr>
+        <w:tabs>
+          <w:tab w:val="num" w:pos="1440"/>
+        </w:tabs>
+        <w:ind w:left="1440" w:hanging="360"/>
+      </w:pPr>
+    </w:lvl>
+    <w:lvl w:ilvl="2" w:tentative="1">
+      <w:start w:val="1"/>
+      <w:numFmt w:val="decimal"/>
+      <w:lvlText w:val="%3."/>
+      <w:lvlJc w:val="left"/>
+      <w:pPr>
+        <w:tabs>
+          <w:tab w:val="num" w:pos="2160"/>
+        </w:tabs>
+        <w:ind w:left="2160" w:hanging="360"/>
+      </w:pPr>
+    </w:lvl>
+    <w:lvl w:ilvl="3" w:tentative="1">
+      <w:start w:val="1"/>
+      <w:numFmt w:val="decimal"/>
+      <w:lvlText w:val="%4."/>
+      <w:lvlJc w:val="left"/>
+      <w:pPr>
+        <w:tabs>
+          <w:tab w:val="num" w:pos="2880"/>
+        </w:tabs>
+        <w:ind w:left="2880" w:hanging="360"/>
+      </w:pPr>
+    </w:lvl>
+    <w:lvl w:ilvl="4" w:tentative="1">
+      <w:start w:val="1"/>
+      <w:numFmt w:val="decimal"/>
+      <w:lvlText w:val="%5."/>
+      <w:lvlJc w:val="left"/>
+      <w:pPr>
+        <w:tabs>
+          <w:tab w:val="num" w:pos="3600"/>
+        </w:tabs>
+        <w:ind w:left="3600" w:hanging="360"/>
+      </w:pPr>
+    </w:lvl>
+    <w:lvl w:ilvl="5" w:tentative="1">
+      <w:start w:val="1"/>
+      <w:numFmt w:val="decimal"/>
+      <w:lvlText w:val="%6."/>
+      <w:lvlJc w:val="left"/>
+      <w:pPr>
+        <w:tabs>
+          <w:tab w:val="num" w:pos="4320"/>
+        </w:tabs>
+        <w:ind w:left="4320" w:hanging="360"/>
+      </w:pPr>
+    </w:lvl>
+    <w:lvl w:ilvl="6" w:tentative="1">
+      <w:start w:val="1"/>
+      <w:numFmt w:val="decimal"/>
+      <w:lvlText w:val="%7."/>
+      <w:lvlJc w:val="left"/>
+      <w:pPr>
+        <w:tabs>
+          <w:tab w:val="num" w:pos="5040"/>
+        </w:tabs>
+        <w:ind w:left="5040" w:hanging="360"/>
+      </w:pPr>
+    </w:lvl>
+    <w:lvl w:ilvl="7" w:tentative="1">
+      <w:start w:val="1"/>
+      <w:numFmt w:val="decimal"/>
+      <w:lvlText w:val="%8."/>
+      <w:lvlJc w:val="left"/>
+      <w:pPr>
+        <w:tabs>
+          <w:tab w:val="num" w:pos="5760"/>
+        </w:tabs>
+        <w:ind w:left="5760" w:hanging="360"/>
+      </w:pPr>
+    </w:lvl>
+    <w:lvl w:ilvl="8" w:tentative="1">
+      <w:start w:val="1"/>
+      <w:numFmt w:val="decimal"/>
+      <w:lvlText w:val="%9."/>
+      <w:lvlJc w:val="left"/>
+      <w:pPr>
+        <w:tabs>
+          <w:tab w:val="num" w:pos="6480"/>
+        </w:tabs>
+        <w:ind w:left="6480" w:hanging="360"/>
+      </w:pPr>
+    </w:lvl>
+  </w:abstractNum>
+  <w:abstractNum w:abstractNumId="35" w15:restartNumberingAfterBreak="0">
     <w:nsid w:val="5D48619D"/>
     <w:multiLevelType w:val="multilevel"/>
     <w:tmpl w:val="06649184"/>
@@ -7490,7 +10224,7 @@
       </w:rPr>
     </w:lvl>
   </w:abstractNum>
-  <w:abstractNum w:abstractNumId="30" w15:restartNumberingAfterBreak="0">
+  <w:abstractNum w:abstractNumId="36" w15:restartNumberingAfterBreak="0">
     <w:nsid w:val="6012618C"/>
     <w:multiLevelType w:val="multilevel"/>
     <w:tmpl w:val="FFD4FDF4"/>
@@ -7639,7 +10373,241 @@
       </w:rPr>
     </w:lvl>
   </w:abstractNum>
-  <w:abstractNum w:abstractNumId="31" w15:restartNumberingAfterBreak="0">
+  <w:abstractNum w:abstractNumId="37" w15:restartNumberingAfterBreak="0">
+    <w:nsid w:val="613A44F2"/>
+    <w:multiLevelType w:val="multilevel"/>
+    <w:tmpl w:val="5F26C786"/>
+    <w:lvl w:ilvl="0">
+      <w:start w:val="1"/>
+      <w:numFmt w:val="decimal"/>
+      <w:lvlText w:val="%1."/>
+      <w:lvlJc w:val="left"/>
+      <w:pPr>
+        <w:tabs>
+          <w:tab w:val="num" w:pos="720"/>
+        </w:tabs>
+        <w:ind w:left="720" w:hanging="360"/>
+      </w:pPr>
+    </w:lvl>
+    <w:lvl w:ilvl="1">
+      <w:start w:val="1"/>
+      <w:numFmt w:val="bullet"/>
+      <w:lvlText w:val="o"/>
+      <w:lvlJc w:val="left"/>
+      <w:pPr>
+        <w:tabs>
+          <w:tab w:val="num" w:pos="1440"/>
+        </w:tabs>
+        <w:ind w:left="1440" w:hanging="360"/>
+      </w:pPr>
+      <w:rPr>
+        <w:rFonts w:ascii="Courier New" w:hAnsi="Courier New" w:hint="default"/>
+        <w:sz w:val="20"/>
+      </w:rPr>
+    </w:lvl>
+    <w:lvl w:ilvl="2" w:tentative="1">
+      <w:start w:val="1"/>
+      <w:numFmt w:val="decimal"/>
+      <w:lvlText w:val="%3."/>
+      <w:lvlJc w:val="left"/>
+      <w:pPr>
+        <w:tabs>
+          <w:tab w:val="num" w:pos="2160"/>
+        </w:tabs>
+        <w:ind w:left="2160" w:hanging="360"/>
+      </w:pPr>
+    </w:lvl>
+    <w:lvl w:ilvl="3" w:tentative="1">
+      <w:start w:val="1"/>
+      <w:numFmt w:val="decimal"/>
+      <w:lvlText w:val="%4."/>
+      <w:lvlJc w:val="left"/>
+      <w:pPr>
+        <w:tabs>
+          <w:tab w:val="num" w:pos="2880"/>
+        </w:tabs>
+        <w:ind w:left="2880" w:hanging="360"/>
+      </w:pPr>
+    </w:lvl>
+    <w:lvl w:ilvl="4" w:tentative="1">
+      <w:start w:val="1"/>
+      <w:numFmt w:val="decimal"/>
+      <w:lvlText w:val="%5."/>
+      <w:lvlJc w:val="left"/>
+      <w:pPr>
+        <w:tabs>
+          <w:tab w:val="num" w:pos="3600"/>
+        </w:tabs>
+        <w:ind w:left="3600" w:hanging="360"/>
+      </w:pPr>
+    </w:lvl>
+    <w:lvl w:ilvl="5" w:tentative="1">
+      <w:start w:val="1"/>
+      <w:numFmt w:val="decimal"/>
+      <w:lvlText w:val="%6."/>
+      <w:lvlJc w:val="left"/>
+      <w:pPr>
+        <w:tabs>
+          <w:tab w:val="num" w:pos="4320"/>
+        </w:tabs>
+        <w:ind w:left="4320" w:hanging="360"/>
+      </w:pPr>
+    </w:lvl>
+    <w:lvl w:ilvl="6" w:tentative="1">
+      <w:start w:val="1"/>
+      <w:numFmt w:val="decimal"/>
+      <w:lvlText w:val="%7."/>
+      <w:lvlJc w:val="left"/>
+      <w:pPr>
+        <w:tabs>
+          <w:tab w:val="num" w:pos="5040"/>
+        </w:tabs>
+        <w:ind w:left="5040" w:hanging="360"/>
+      </w:pPr>
+    </w:lvl>
+    <w:lvl w:ilvl="7" w:tentative="1">
+      <w:start w:val="1"/>
+      <w:numFmt w:val="decimal"/>
+      <w:lvlText w:val="%8."/>
+      <w:lvlJc w:val="left"/>
+      <w:pPr>
+        <w:tabs>
+          <w:tab w:val="num" w:pos="5760"/>
+        </w:tabs>
+        <w:ind w:left="5760" w:hanging="360"/>
+      </w:pPr>
+    </w:lvl>
+    <w:lvl w:ilvl="8" w:tentative="1">
+      <w:start w:val="1"/>
+      <w:numFmt w:val="decimal"/>
+      <w:lvlText w:val="%9."/>
+      <w:lvlJc w:val="left"/>
+      <w:pPr>
+        <w:tabs>
+          <w:tab w:val="num" w:pos="6480"/>
+        </w:tabs>
+        <w:ind w:left="6480" w:hanging="360"/>
+      </w:pPr>
+    </w:lvl>
+  </w:abstractNum>
+  <w:abstractNum w:abstractNumId="38" w15:restartNumberingAfterBreak="0">
+    <w:nsid w:val="634F1E71"/>
+    <w:multiLevelType w:val="multilevel"/>
+    <w:tmpl w:val="170EFC84"/>
+    <w:lvl w:ilvl="0">
+      <w:start w:val="1"/>
+      <w:numFmt w:val="decimal"/>
+      <w:lvlText w:val="%1."/>
+      <w:lvlJc w:val="left"/>
+      <w:pPr>
+        <w:tabs>
+          <w:tab w:val="num" w:pos="720"/>
+        </w:tabs>
+        <w:ind w:left="720" w:hanging="360"/>
+      </w:pPr>
+    </w:lvl>
+    <w:lvl w:ilvl="1">
+      <w:start w:val="1"/>
+      <w:numFmt w:val="bullet"/>
+      <w:lvlText w:val="o"/>
+      <w:lvlJc w:val="left"/>
+      <w:pPr>
+        <w:tabs>
+          <w:tab w:val="num" w:pos="1440"/>
+        </w:tabs>
+        <w:ind w:left="1440" w:hanging="360"/>
+      </w:pPr>
+      <w:rPr>
+        <w:rFonts w:ascii="Courier New" w:hAnsi="Courier New" w:hint="default"/>
+        <w:sz w:val="20"/>
+      </w:rPr>
+    </w:lvl>
+    <w:lvl w:ilvl="2" w:tentative="1">
+      <w:start w:val="1"/>
+      <w:numFmt w:val="decimal"/>
+      <w:lvlText w:val="%3."/>
+      <w:lvlJc w:val="left"/>
+      <w:pPr>
+        <w:tabs>
+          <w:tab w:val="num" w:pos="2160"/>
+        </w:tabs>
+        <w:ind w:left="2160" w:hanging="360"/>
+      </w:pPr>
+    </w:lvl>
+    <w:lvl w:ilvl="3" w:tentative="1">
+      <w:start w:val="1"/>
+      <w:numFmt w:val="decimal"/>
+      <w:lvlText w:val="%4."/>
+      <w:lvlJc w:val="left"/>
+      <w:pPr>
+        <w:tabs>
+          <w:tab w:val="num" w:pos="2880"/>
+        </w:tabs>
+        <w:ind w:left="2880" w:hanging="360"/>
+      </w:pPr>
+    </w:lvl>
+    <w:lvl w:ilvl="4" w:tentative="1">
+      <w:start w:val="1"/>
+      <w:numFmt w:val="decimal"/>
+      <w:lvlText w:val="%5."/>
+      <w:lvlJc w:val="left"/>
+      <w:pPr>
+        <w:tabs>
+          <w:tab w:val="num" w:pos="3600"/>
+        </w:tabs>
+        <w:ind w:left="3600" w:hanging="360"/>
+      </w:pPr>
+    </w:lvl>
+    <w:lvl w:ilvl="5" w:tentative="1">
+      <w:start w:val="1"/>
+      <w:numFmt w:val="decimal"/>
+      <w:lvlText w:val="%6."/>
+      <w:lvlJc w:val="left"/>
+      <w:pPr>
+        <w:tabs>
+          <w:tab w:val="num" w:pos="4320"/>
+        </w:tabs>
+        <w:ind w:left="4320" w:hanging="360"/>
+      </w:pPr>
+    </w:lvl>
+    <w:lvl w:ilvl="6" w:tentative="1">
+      <w:start w:val="1"/>
+      <w:numFmt w:val="decimal"/>
+      <w:lvlText w:val="%7."/>
+      <w:lvlJc w:val="left"/>
+      <w:pPr>
+        <w:tabs>
+          <w:tab w:val="num" w:pos="5040"/>
+        </w:tabs>
+        <w:ind w:left="5040" w:hanging="360"/>
+      </w:pPr>
+    </w:lvl>
+    <w:lvl w:ilvl="7" w:tentative="1">
+      <w:start w:val="1"/>
+      <w:numFmt w:val="decimal"/>
+      <w:lvlText w:val="%8."/>
+      <w:lvlJc w:val="left"/>
+      <w:pPr>
+        <w:tabs>
+          <w:tab w:val="num" w:pos="5760"/>
+        </w:tabs>
+        <w:ind w:left="5760" w:hanging="360"/>
+      </w:pPr>
+    </w:lvl>
+    <w:lvl w:ilvl="8" w:tentative="1">
+      <w:start w:val="1"/>
+      <w:numFmt w:val="decimal"/>
+      <w:lvlText w:val="%9."/>
+      <w:lvlJc w:val="left"/>
+      <w:pPr>
+        <w:tabs>
+          <w:tab w:val="num" w:pos="6480"/>
+        </w:tabs>
+        <w:ind w:left="6480" w:hanging="360"/>
+      </w:pPr>
+    </w:lvl>
+  </w:abstractNum>
+  <w:abstractNum w:abstractNumId="39" w15:restartNumberingAfterBreak="0">
     <w:nsid w:val="6A213618"/>
     <w:multiLevelType w:val="multilevel"/>
     <w:tmpl w:val="F8047E02"/>
@@ -7788,7 +10756,7 @@
       </w:rPr>
     </w:lvl>
   </w:abstractNum>
-  <w:abstractNum w:abstractNumId="32" w15:restartNumberingAfterBreak="0">
+  <w:abstractNum w:abstractNumId="40" w15:restartNumberingAfterBreak="0">
     <w:nsid w:val="739C7802"/>
     <w:multiLevelType w:val="multilevel"/>
     <w:tmpl w:val="6BC03AE2"/>
@@ -7937,7 +10905,7 @@
       </w:rPr>
     </w:lvl>
   </w:abstractNum>
-  <w:abstractNum w:abstractNumId="33" w15:restartNumberingAfterBreak="0">
+  <w:abstractNum w:abstractNumId="41" w15:restartNumberingAfterBreak="0">
     <w:nsid w:val="780F2740"/>
     <w:multiLevelType w:val="multilevel"/>
     <w:tmpl w:val="F33E1DD0"/>
@@ -8086,7 +11054,7 @@
       </w:rPr>
     </w:lvl>
   </w:abstractNum>
-  <w:abstractNum w:abstractNumId="34" w15:restartNumberingAfterBreak="0">
+  <w:abstractNum w:abstractNumId="42" w15:restartNumberingAfterBreak="0">
     <w:nsid w:val="7B0C5BD3"/>
     <w:multiLevelType w:val="multilevel"/>
     <w:tmpl w:val="DF88241A"/>
@@ -8235,7 +11203,7 @@
       </w:rPr>
     </w:lvl>
   </w:abstractNum>
-  <w:abstractNum w:abstractNumId="35" w15:restartNumberingAfterBreak="0">
+  <w:abstractNum w:abstractNumId="43" w15:restartNumberingAfterBreak="0">
     <w:nsid w:val="7DCE2ABF"/>
     <w:multiLevelType w:val="multilevel"/>
     <w:tmpl w:val="2B8C0E5C"/>
@@ -8384,7 +11352,7 @@
       </w:rPr>
     </w:lvl>
   </w:abstractNum>
-  <w:abstractNum w:abstractNumId="36" w15:restartNumberingAfterBreak="0">
+  <w:abstractNum w:abstractNumId="44" w15:restartNumberingAfterBreak="0">
     <w:nsid w:val="7E332F1E"/>
     <w:multiLevelType w:val="multilevel"/>
     <w:tmpl w:val="78B2A5CA"/>
@@ -8533,7 +11501,156 @@
       </w:rPr>
     </w:lvl>
   </w:abstractNum>
-  <w:abstractNum w:abstractNumId="37" w15:restartNumberingAfterBreak="0">
+  <w:abstractNum w:abstractNumId="45" w15:restartNumberingAfterBreak="0">
+    <w:nsid w:val="7E695636"/>
+    <w:multiLevelType w:val="multilevel"/>
+    <w:tmpl w:val="419452FC"/>
+    <w:lvl w:ilvl="0">
+      <w:start w:val="1"/>
+      <w:numFmt w:val="bullet"/>
+      <w:lvlText w:val=""/>
+      <w:lvlJc w:val="left"/>
+      <w:pPr>
+        <w:tabs>
+          <w:tab w:val="num" w:pos="720"/>
+        </w:tabs>
+        <w:ind w:left="720" w:hanging="360"/>
+      </w:pPr>
+      <w:rPr>
+        <w:rFonts w:ascii="Symbol" w:hAnsi="Symbol" w:hint="default"/>
+        <w:sz w:val="20"/>
+      </w:rPr>
+    </w:lvl>
+    <w:lvl w:ilvl="1" w:tentative="1">
+      <w:start w:val="1"/>
+      <w:numFmt w:val="bullet"/>
+      <w:lvlText w:val="o"/>
+      <w:lvlJc w:val="left"/>
+      <w:pPr>
+        <w:tabs>
+          <w:tab w:val="num" w:pos="1440"/>
+        </w:tabs>
+        <w:ind w:left="1440" w:hanging="360"/>
+      </w:pPr>
+      <w:rPr>
+        <w:rFonts w:ascii="Courier New" w:hAnsi="Courier New" w:hint="default"/>
+        <w:sz w:val="20"/>
+      </w:rPr>
+    </w:lvl>
+    <w:lvl w:ilvl="2" w:tentative="1">
+      <w:start w:val="1"/>
+      <w:numFmt w:val="bullet"/>
+      <w:lvlText w:val=""/>
+      <w:lvlJc w:val="left"/>
+      <w:pPr>
+        <w:tabs>
+          <w:tab w:val="num" w:pos="2160"/>
+        </w:tabs>
+        <w:ind w:left="2160" w:hanging="360"/>
+      </w:pPr>
+      <w:rPr>
+        <w:rFonts w:ascii="Wingdings" w:hAnsi="Wingdings" w:hint="default"/>
+        <w:sz w:val="20"/>
+      </w:rPr>
+    </w:lvl>
+    <w:lvl w:ilvl="3" w:tentative="1">
+      <w:start w:val="1"/>
+      <w:numFmt w:val="bullet"/>
+      <w:lvlText w:val=""/>
+      <w:lvlJc w:val="left"/>
+      <w:pPr>
+        <w:tabs>
+          <w:tab w:val="num" w:pos="2880"/>
+        </w:tabs>
+        <w:ind w:left="2880" w:hanging="360"/>
+      </w:pPr>
+      <w:rPr>
+        <w:rFonts w:ascii="Wingdings" w:hAnsi="Wingdings" w:hint="default"/>
+        <w:sz w:val="20"/>
+      </w:rPr>
+    </w:lvl>
+    <w:lvl w:ilvl="4" w:tentative="1">
+      <w:start w:val="1"/>
+      <w:numFmt w:val="bullet"/>
+      <w:lvlText w:val=""/>
+      <w:lvlJc w:val="left"/>
+      <w:pPr>
+        <w:tabs>
+          <w:tab w:val="num" w:pos="3600"/>
+        </w:tabs>
+        <w:ind w:left="3600" w:hanging="360"/>
+      </w:pPr>
+      <w:rPr>
+        <w:rFonts w:ascii="Wingdings" w:hAnsi="Wingdings" w:hint="default"/>
+        <w:sz w:val="20"/>
+      </w:rPr>
+    </w:lvl>
+    <w:lvl w:ilvl="5" w:tentative="1">
+      <w:start w:val="1"/>
+      <w:numFmt w:val="bullet"/>
+      <w:lvlText w:val=""/>
+      <w:lvlJc w:val="left"/>
+      <w:pPr>
+        <w:tabs>
+          <w:tab w:val="num" w:pos="4320"/>
+        </w:tabs>
+        <w:ind w:left="4320" w:hanging="360"/>
+      </w:pPr>
+      <w:rPr>
+        <w:rFonts w:ascii="Wingdings" w:hAnsi="Wingdings" w:hint="default"/>
+        <w:sz w:val="20"/>
+      </w:rPr>
+    </w:lvl>
+    <w:lvl w:ilvl="6" w:tentative="1">
+      <w:start w:val="1"/>
+      <w:numFmt w:val="bullet"/>
+      <w:lvlText w:val=""/>
+      <w:lvlJc w:val="left"/>
+      <w:pPr>
+        <w:tabs>
+          <w:tab w:val="num" w:pos="5040"/>
+        </w:tabs>
+        <w:ind w:left="5040" w:hanging="360"/>
+      </w:pPr>
+      <w:rPr>
+        <w:rFonts w:ascii="Wingdings" w:hAnsi="Wingdings" w:hint="default"/>
+        <w:sz w:val="20"/>
+      </w:rPr>
+    </w:lvl>
+    <w:lvl w:ilvl="7" w:tentative="1">
+      <w:start w:val="1"/>
+      <w:numFmt w:val="bullet"/>
+      <w:lvlText w:val=""/>
+      <w:lvlJc w:val="left"/>
+      <w:pPr>
+        <w:tabs>
+          <w:tab w:val="num" w:pos="5760"/>
+        </w:tabs>
+        <w:ind w:left="5760" w:hanging="360"/>
+      </w:pPr>
+      <w:rPr>
+        <w:rFonts w:ascii="Wingdings" w:hAnsi="Wingdings" w:hint="default"/>
+        <w:sz w:val="20"/>
+      </w:rPr>
+    </w:lvl>
+    <w:lvl w:ilvl="8" w:tentative="1">
+      <w:start w:val="1"/>
+      <w:numFmt w:val="bullet"/>
+      <w:lvlText w:val=""/>
+      <w:lvlJc w:val="left"/>
+      <w:pPr>
+        <w:tabs>
+          <w:tab w:val="num" w:pos="6480"/>
+        </w:tabs>
+        <w:ind w:left="6480" w:hanging="360"/>
+      </w:pPr>
+      <w:rPr>
+        <w:rFonts w:ascii="Wingdings" w:hAnsi="Wingdings" w:hint="default"/>
+        <w:sz w:val="20"/>
+      </w:rPr>
+    </w:lvl>
+  </w:abstractNum>
+  <w:abstractNum w:abstractNumId="46" w15:restartNumberingAfterBreak="0">
     <w:nsid w:val="7E83499D"/>
     <w:multiLevelType w:val="multilevel"/>
     <w:tmpl w:val="7AACA526"/>
@@ -8683,118 +11800,145 @@
     </w:lvl>
   </w:abstractNum>
   <w:num w:numId="1" w16cid:durableId="1522089459">
-    <w:abstractNumId w:val="31"/>
+    <w:abstractNumId w:val="39"/>
   </w:num>
   <w:num w:numId="2" w16cid:durableId="157892521">
+    <w:abstractNumId w:val="24"/>
+  </w:num>
+  <w:num w:numId="3" w16cid:durableId="734739344">
+    <w:abstractNumId w:val="40"/>
+  </w:num>
+  <w:num w:numId="4" w16cid:durableId="825899193">
+    <w:abstractNumId w:val="28"/>
+  </w:num>
+  <w:num w:numId="5" w16cid:durableId="301623460">
+    <w:abstractNumId w:val="36"/>
+  </w:num>
+  <w:num w:numId="6" w16cid:durableId="888882968">
+    <w:abstractNumId w:val="15"/>
+  </w:num>
+  <w:num w:numId="7" w16cid:durableId="254411730">
+    <w:abstractNumId w:val="10"/>
+  </w:num>
+  <w:num w:numId="8" w16cid:durableId="1114400758">
+    <w:abstractNumId w:val="22"/>
+  </w:num>
+  <w:num w:numId="9" w16cid:durableId="762071803">
+    <w:abstractNumId w:val="42"/>
+  </w:num>
+  <w:num w:numId="10" w16cid:durableId="1406488075">
+    <w:abstractNumId w:val="44"/>
+  </w:num>
+  <w:num w:numId="11" w16cid:durableId="1563953082">
+    <w:abstractNumId w:val="30"/>
+  </w:num>
+  <w:num w:numId="12" w16cid:durableId="1231573415">
+    <w:abstractNumId w:val="8"/>
+  </w:num>
+  <w:num w:numId="13" w16cid:durableId="553128695">
     <w:abstractNumId w:val="21"/>
   </w:num>
-  <w:num w:numId="3" w16cid:durableId="734739344">
-    <w:abstractNumId w:val="32"/>
+  <w:num w:numId="14" w16cid:durableId="888225729">
+    <w:abstractNumId w:val="26"/>
   </w:num>
-  <w:num w:numId="4" w16cid:durableId="825899193">
+  <w:num w:numId="15" w16cid:durableId="106195725">
+    <w:abstractNumId w:val="6"/>
+  </w:num>
+  <w:num w:numId="16" w16cid:durableId="1027947404">
+    <w:abstractNumId w:val="9"/>
+  </w:num>
+  <w:num w:numId="17" w16cid:durableId="453790561">
+    <w:abstractNumId w:val="12"/>
+  </w:num>
+  <w:num w:numId="18" w16cid:durableId="916980713">
+    <w:abstractNumId w:val="5"/>
+  </w:num>
+  <w:num w:numId="19" w16cid:durableId="263463952">
+    <w:abstractNumId w:val="7"/>
+  </w:num>
+  <w:num w:numId="20" w16cid:durableId="1445266576">
+    <w:abstractNumId w:val="14"/>
+  </w:num>
+  <w:num w:numId="21" w16cid:durableId="1476218469">
     <w:abstractNumId w:val="25"/>
   </w:num>
-  <w:num w:numId="5" w16cid:durableId="301623460">
-    <w:abstractNumId w:val="30"/>
+  <w:num w:numId="22" w16cid:durableId="1529291174">
+    <w:abstractNumId w:val="17"/>
   </w:num>
-  <w:num w:numId="6" w16cid:durableId="888882968">
-    <w:abstractNumId w:val="14"/>
-  </w:num>
-  <w:num w:numId="7" w16cid:durableId="254411730">
-    <w:abstractNumId w:val="9"/>
-  </w:num>
-  <w:num w:numId="8" w16cid:durableId="1114400758">
-    <w:abstractNumId w:val="20"/>
-  </w:num>
-  <w:num w:numId="9" w16cid:durableId="762071803">
-    <w:abstractNumId w:val="34"/>
-  </w:num>
-  <w:num w:numId="10" w16cid:durableId="1406488075">
-    <w:abstractNumId w:val="36"/>
-  </w:num>
-  <w:num w:numId="11" w16cid:durableId="1563953082">
+  <w:num w:numId="23" w16cid:durableId="1767843206">
     <w:abstractNumId w:val="27"/>
   </w:num>
-  <w:num w:numId="12" w16cid:durableId="1231573415">
-    <w:abstractNumId w:val="7"/>
-  </w:num>
-  <w:num w:numId="13" w16cid:durableId="553128695">
-    <w:abstractNumId w:val="19"/>
-  </w:num>
-  <w:num w:numId="14" w16cid:durableId="888225729">
-    <w:abstractNumId w:val="23"/>
-  </w:num>
-  <w:num w:numId="15" w16cid:durableId="106195725">
-    <w:abstractNumId w:val="5"/>
-  </w:num>
-  <w:num w:numId="16" w16cid:durableId="1027947404">
-    <w:abstractNumId w:val="8"/>
-  </w:num>
-  <w:num w:numId="17" w16cid:durableId="453790561">
-    <w:abstractNumId w:val="11"/>
-  </w:num>
-  <w:num w:numId="18" w16cid:durableId="916980713">
-    <w:abstractNumId w:val="4"/>
-  </w:num>
-  <w:num w:numId="19" w16cid:durableId="263463952">
-    <w:abstractNumId w:val="6"/>
-  </w:num>
-  <w:num w:numId="20" w16cid:durableId="1445266576">
-    <w:abstractNumId w:val="13"/>
-  </w:num>
-  <w:num w:numId="21" w16cid:durableId="1476218469">
-    <w:abstractNumId w:val="22"/>
-  </w:num>
-  <w:num w:numId="22" w16cid:durableId="1529291174">
-    <w:abstractNumId w:val="16"/>
-  </w:num>
-  <w:num w:numId="23" w16cid:durableId="1767843206">
-    <w:abstractNumId w:val="24"/>
-  </w:num>
   <w:num w:numId="24" w16cid:durableId="1984919920">
-    <w:abstractNumId w:val="17"/>
+    <w:abstractNumId w:val="18"/>
   </w:num>
   <w:num w:numId="25" w16cid:durableId="601110301">
-    <w:abstractNumId w:val="35"/>
+    <w:abstractNumId w:val="43"/>
   </w:num>
   <w:num w:numId="26" w16cid:durableId="1447501890">
     <w:abstractNumId w:val="0"/>
   </w:num>
   <w:num w:numId="27" w16cid:durableId="389118683">
-    <w:abstractNumId w:val="18"/>
+    <w:abstractNumId w:val="19"/>
   </w:num>
   <w:num w:numId="28" w16cid:durableId="570581112">
-    <w:abstractNumId w:val="37"/>
+    <w:abstractNumId w:val="46"/>
   </w:num>
   <w:num w:numId="29" w16cid:durableId="714937165">
-    <w:abstractNumId w:val="15"/>
+    <w:abstractNumId w:val="16"/>
   </w:num>
   <w:num w:numId="30" w16cid:durableId="198906717">
-    <w:abstractNumId w:val="10"/>
+    <w:abstractNumId w:val="11"/>
   </w:num>
   <w:num w:numId="31" w16cid:durableId="1682586319">
     <w:abstractNumId w:val="1"/>
   </w:num>
   <w:num w:numId="32" w16cid:durableId="1798139606">
-    <w:abstractNumId w:val="26"/>
+    <w:abstractNumId w:val="29"/>
   </w:num>
   <w:num w:numId="33" w16cid:durableId="832572868">
-    <w:abstractNumId w:val="28"/>
+    <w:abstractNumId w:val="32"/>
   </w:num>
   <w:num w:numId="34" w16cid:durableId="1938709703">
-    <w:abstractNumId w:val="29"/>
+    <w:abstractNumId w:val="35"/>
   </w:num>
   <w:num w:numId="35" w16cid:durableId="276640604">
+    <w:abstractNumId w:val="41"/>
+  </w:num>
+  <w:num w:numId="36" w16cid:durableId="349111416">
+    <w:abstractNumId w:val="3"/>
+  </w:num>
+  <w:num w:numId="37" w16cid:durableId="130052327">
+    <w:abstractNumId w:val="4"/>
+  </w:num>
+  <w:num w:numId="38" w16cid:durableId="1364749755">
+    <w:abstractNumId w:val="13"/>
+  </w:num>
+  <w:num w:numId="39" w16cid:durableId="744690692">
+    <w:abstractNumId w:val="31"/>
+  </w:num>
+  <w:num w:numId="40" w16cid:durableId="255946671">
+    <w:abstractNumId w:val="2"/>
+  </w:num>
+  <w:num w:numId="41" w16cid:durableId="87043653">
+    <w:abstractNumId w:val="38"/>
+  </w:num>
+  <w:num w:numId="42" w16cid:durableId="1683704074">
     <w:abstractNumId w:val="33"/>
   </w:num>
-  <w:num w:numId="36" w16cid:durableId="349111416">
-    <w:abstractNumId w:val="2"/>
+  <w:num w:numId="43" w16cid:durableId="431246896">
+    <w:abstractNumId w:val="34"/>
   </w:num>
-  <w:num w:numId="37" w16cid:durableId="130052327">
-    <w:abstractNumId w:val="3"/>
+  <w:num w:numId="44" w16cid:durableId="1177889472">
+    <w:abstractNumId w:val="23"/>
   </w:num>
-  <w:num w:numId="38" w16cid:durableId="1364749755">
-    <w:abstractNumId w:val="12"/>
+  <w:num w:numId="45" w16cid:durableId="1376349960">
+    <w:abstractNumId w:val="20"/>
+  </w:num>
+  <w:num w:numId="46" w16cid:durableId="51543535">
+    <w:abstractNumId w:val="37"/>
+  </w:num>
+  <w:num w:numId="47" w16cid:durableId="123931102">
+    <w:abstractNumId w:val="45"/>
   </w:num>
 </w:numbering>
 </file>
@@ -10014,4 +13158,16 @@
     </a:ext>
   </a:extLst>
 </a:theme>
+</file>
+
+<file path=customXml/item1.xml><?xml version="1.0" encoding="utf-8"?>
+<b:Sources xmlns:b="http://schemas.openxmlformats.org/officeDocument/2006/bibliography" xmlns="http://schemas.openxmlformats.org/officeDocument/2006/bibliography" SelectedStyle="\APASixthEditionOfficeOnline.xsl" StyleName="APA" Version="6"/>
+</file>
+
+<file path=customXml/itemProps1.xml><?xml version="1.0" encoding="utf-8"?>
+<ds:datastoreItem xmlns:ds="http://schemas.openxmlformats.org/officeDocument/2006/customXml" ds:itemID="{0FD2495F-F4B0-4F27-9088-C2873982BA9C}">
+  <ds:schemaRefs>
+    <ds:schemaRef ds:uri="http://schemas.openxmlformats.org/officeDocument/2006/bibliography"/>
+  </ds:schemaRefs>
+</ds:datastoreItem>
 </file>
</xml_diff>